<commit_message>
corregí saltos de linea en template mandato docx
</commit_message>
<xml_diff>
--- a/mandato_template.docx
+++ b/mandato_template.docx
@@ -6,29 +6,21 @@
       <w:pPr>
         <w:pStyle w:val="Ttulo1"/>
         <w:spacing w:before="480" w:after="0"/>
-        <w:rPr>
-          <w:color w:val="000000"/>
-        </w:rPr>
+        <w:jc w:val="center"/>
+        <w:rPr/>
       </w:pPr>
       <w:r>
         <w:rPr>
           <w:color w:val="000000"/>
         </w:rPr>
-        <w:t xml:space="preserve">MANDATO PARA </w:t>
-      </w:r>
-      <w:r>
-        <w:rPr>
-          <w:color w:val="000000"/>
-        </w:rPr>
-        <w:t>{{mandante_tipoPension}}</w:t>
+        <w:t>MANDATO PARA {{mandante_tipoPension}}</w:t>
       </w:r>
     </w:p>
     <w:p>
       <w:pPr>
         <w:pStyle w:val="Normal"/>
-        <w:rPr>
-          <w:rFonts w:ascii="Calibri" w:hAnsi="Calibri"/>
-        </w:rPr>
+        <w:jc w:val="center"/>
+        <w:rPr/>
       </w:pPr>
       <w:r>
         <w:rPr>
@@ -40,39 +32,14 @@
     <w:p>
       <w:pPr>
         <w:pStyle w:val="Normal"/>
-        <w:rPr>
-          <w:rFonts w:ascii="Calibri" w:hAnsi="Calibri"/>
-        </w:rPr>
+        <w:jc w:val="both"/>
+        <w:rPr/>
       </w:pPr>
       <w:r>
         <w:rPr>
           <w:rFonts w:ascii="Calibri" w:hAnsi="Calibri"/>
         </w:rPr>
-        <w:t>Con fecha {{fecha_actual}} y por medio del siguiente instrumento, yo {{mandante_nombre_completo}}, RUT {{mandante_rut}}, de nacionalidad {{nacionalidad}}, de sexo {{sexo}}, nacido el {{fecha_nacimiento}}, estado civil {{estado_civil}}, de profesión u oficio {{profesion}}, domiciliado en {{direccion}}, comuna de {{comuna}}, ciudad de {{ciudad}}, teléfono {{telefono}}, correo electrónico {{email}}, e incorporado a la Institución de Salud {{salud}}, confiero poder a Don/Doña {{mandatario_nombre}}, RUT {{mandatario_rut}}, domiciliado en {{mandatario_direccion}}, comuna de {{mandatario_comuna}}, ciudad de {{mandatario_ciudad}}, teléfono {{mandatario_telefono}}, correo electrónico {{mandatario_email}}, para que en mi nombre suscriba en</w:t>
-      </w:r>
-      <w:r>
-        <w:rPr>
-          <w:rFonts w:ascii="Calibri" w:hAnsi="Calibri"/>
-        </w:rPr>
-        <w:t xml:space="preserve"> {{mandante_afp}}</w:t>
-      </w:r>
-      <w:r>
-        <w:rPr>
-          <w:rFonts w:ascii="Calibri" w:hAnsi="Calibri"/>
-        </w:rPr>
-        <w:t xml:space="preserve">, una solicitud de </w:t>
-      </w:r>
-      <w:r>
-        <w:rPr>
-          <w:rFonts w:ascii="Calibri" w:hAnsi="Calibri"/>
-        </w:rPr>
-        <w:t>{{mandante_tipoPension}}</w:t>
-      </w:r>
-      <w:r>
-        <w:rPr>
-          <w:rFonts w:ascii="Calibri" w:hAnsi="Calibri"/>
-        </w:rPr>
-        <w:t>.</w:t>
+        <w:t>Con fecha {{fecha_actual}} y por medio del siguiente instrumento, yo {{mandante_nombre_completo}}, RUT {{mandante_rut}}, de nacionalidad {{nacionalidad}}, de sexo {{sexo}}, nacido el {{fecha_nacimiento}}, estado civil {{estado_civil}}, de profesión u oficio {{profesion}}, domiciliado en {{direccion}}, comuna de {{comuna}}, ciudad de {{ciudad}}, teléfono {{telefono}}, correo electrónico {{email}}, e incorporado a la Institución de Salud {{salud}}, confiero poder a Don/Doña {{mandatario_nombre}}, RUT {{mandatario_rut}}, domiciliado en {{mandatario_direccion}}, comuna de {{mandatario_comuna}}, ciudad de {{mandatario_ciudad}}, teléfono {{mandatario_telefono}}, correo electrónico {{mandatario_email}}, para que en mi nombre suscriba en {{mandante_afp}}, una solicitud de {{mandante_tipoPension}}.</w:t>
       </w:r>
     </w:p>
     <w:p>
@@ -149,6 +116,7 @@
     <w:p>
       <w:pPr>
         <w:pStyle w:val="Normal"/>
+        <w:jc w:val="both"/>
         <w:rPr>
           <w:rFonts w:ascii="Calibri" w:hAnsi="Calibri"/>
         </w:rPr>
@@ -175,25 +143,26 @@
         </w:tblCellMar>
       </w:tblPr>
       <w:tblGrid>
+        <w:gridCol w:w="1138"/>
+        <w:gridCol w:w="1021"/>
         <w:gridCol w:w="1080"/>
-        <w:gridCol w:w="1080"/>
-        <w:gridCol w:w="1080"/>
-        <w:gridCol w:w="1080"/>
-        <w:gridCol w:w="1080"/>
-        <w:gridCol w:w="1080"/>
-        <w:gridCol w:w="1080"/>
+        <w:gridCol w:w="724"/>
+        <w:gridCol w:w="512"/>
+        <w:gridCol w:w="1813"/>
+        <w:gridCol w:w="1271"/>
         <w:gridCol w:w="1080"/>
       </w:tblGrid>
       <w:tr>
         <w:trPr/>
         <w:tc>
           <w:tcPr>
-            <w:tcW w:w="1080" w:type="dxa"/>
+            <w:tcW w:w="1138" w:type="dxa"/>
             <w:tcBorders/>
           </w:tcPr>
           <w:p>
             <w:pPr>
               <w:pStyle w:val="Contenidodelatabla"/>
+              <w:widowControl w:val="false"/>
               <w:spacing w:before="0" w:after="200"/>
               <w:rPr>
                 <w:rFonts w:ascii="Calibri" w:hAnsi="Calibri"/>
@@ -213,12 +182,13 @@
         </w:tc>
         <w:tc>
           <w:tcPr>
-            <w:tcW w:w="1080" w:type="dxa"/>
+            <w:tcW w:w="1021" w:type="dxa"/>
             <w:tcBorders/>
           </w:tcPr>
           <w:p>
             <w:pPr>
               <w:pStyle w:val="Contenidodelatabla"/>
+              <w:widowControl w:val="false"/>
               <w:spacing w:before="0" w:after="200"/>
               <w:rPr>
                 <w:rFonts w:ascii="Calibri" w:hAnsi="Calibri"/>
@@ -244,6 +214,7 @@
           <w:p>
             <w:pPr>
               <w:pStyle w:val="Contenidodelatabla"/>
+              <w:widowControl w:val="false"/>
               <w:spacing w:before="0" w:after="200"/>
               <w:rPr>
                 <w:rFonts w:ascii="Calibri" w:hAnsi="Calibri"/>
@@ -263,12 +234,13 @@
         </w:tc>
         <w:tc>
           <w:tcPr>
-            <w:tcW w:w="1080" w:type="dxa"/>
+            <w:tcW w:w="724" w:type="dxa"/>
             <w:tcBorders/>
           </w:tcPr>
           <w:p>
             <w:pPr>
               <w:pStyle w:val="Contenidodelatabla"/>
+              <w:widowControl w:val="false"/>
               <w:spacing w:before="0" w:after="200"/>
               <w:rPr>
                 <w:rFonts w:ascii="Calibri" w:hAnsi="Calibri"/>
@@ -288,12 +260,13 @@
         </w:tc>
         <w:tc>
           <w:tcPr>
-            <w:tcW w:w="1080" w:type="dxa"/>
+            <w:tcW w:w="512" w:type="dxa"/>
             <w:tcBorders/>
           </w:tcPr>
           <w:p>
             <w:pPr>
               <w:pStyle w:val="Contenidodelatabla"/>
+              <w:widowControl w:val="false"/>
               <w:spacing w:before="0" w:after="200"/>
               <w:rPr>
                 <w:rFonts w:ascii="Calibri" w:hAnsi="Calibri"/>
@@ -313,12 +286,13 @@
         </w:tc>
         <w:tc>
           <w:tcPr>
-            <w:tcW w:w="1080" w:type="dxa"/>
+            <w:tcW w:w="1813" w:type="dxa"/>
             <w:tcBorders/>
           </w:tcPr>
           <w:p>
             <w:pPr>
               <w:pStyle w:val="Contenidodelatabla"/>
+              <w:widowControl w:val="false"/>
               <w:spacing w:before="0" w:after="200"/>
               <w:rPr>
                 <w:rFonts w:ascii="Calibri" w:hAnsi="Calibri"/>
@@ -338,12 +312,13 @@
         </w:tc>
         <w:tc>
           <w:tcPr>
-            <w:tcW w:w="1080" w:type="dxa"/>
+            <w:tcW w:w="1271" w:type="dxa"/>
             <w:tcBorders/>
           </w:tcPr>
           <w:p>
             <w:pPr>
               <w:pStyle w:val="Contenidodelatabla"/>
+              <w:widowControl w:val="false"/>
               <w:spacing w:before="0" w:after="200"/>
               <w:rPr>
                 <w:rFonts w:ascii="Calibri" w:hAnsi="Calibri"/>
@@ -369,6 +344,7 @@
           <w:p>
             <w:pPr>
               <w:pStyle w:val="Contenidodelatabla"/>
+              <w:widowControl w:val="false"/>
               <w:spacing w:before="0" w:after="200"/>
               <w:rPr>
                 <w:rFonts w:ascii="Calibri" w:hAnsi="Calibri"/>
@@ -391,24 +367,24 @@
         <w:trPr/>
         <w:tc>
           <w:tcPr>
-            <w:tcW w:w="1080" w:type="dxa"/>
+            <w:tcW w:w="1138" w:type="dxa"/>
             <w:tcBorders/>
           </w:tcPr>
           <w:p>
             <w:pPr>
               <w:pStyle w:val="Contenidodelatabla"/>
+              <w:widowControl w:val="false"/>
               <w:spacing w:before="0" w:after="200"/>
               <w:rPr>
-                <w:rFonts w:ascii="Calibri" w:hAnsi="Calibri"/>
-                <w:sz w:val="18"/>
-                <w:szCs w:val="18"/>
+                <w:sz w:val="12"/>
+                <w:szCs w:val="12"/>
               </w:rPr>
             </w:pPr>
             <w:r>
               <w:rPr>
                 <w:rFonts w:ascii="Calibri" w:hAnsi="Calibri"/>
-                <w:sz w:val="18"/>
-                <w:szCs w:val="18"/>
+                <w:sz w:val="12"/>
+                <w:szCs w:val="12"/>
               </w:rPr>
               <w:t>{#beneficiarios}{apellidoPaterno}</w:t>
             </w:r>
@@ -416,24 +392,24 @@
         </w:tc>
         <w:tc>
           <w:tcPr>
-            <w:tcW w:w="1080" w:type="dxa"/>
+            <w:tcW w:w="1021" w:type="dxa"/>
             <w:tcBorders/>
           </w:tcPr>
           <w:p>
             <w:pPr>
               <w:pStyle w:val="Contenidodelatabla"/>
+              <w:widowControl w:val="false"/>
               <w:spacing w:before="0" w:after="200"/>
               <w:rPr>
-                <w:rFonts w:ascii="Calibri" w:hAnsi="Calibri"/>
-                <w:sz w:val="18"/>
-                <w:szCs w:val="18"/>
+                <w:sz w:val="12"/>
+                <w:szCs w:val="12"/>
               </w:rPr>
             </w:pPr>
             <w:r>
               <w:rPr>
                 <w:rFonts w:ascii="Calibri" w:hAnsi="Calibri"/>
-                <w:sz w:val="18"/>
-                <w:szCs w:val="18"/>
+                <w:sz w:val="12"/>
+                <w:szCs w:val="12"/>
               </w:rPr>
               <w:t>{apellidoMaterno}</w:t>
             </w:r>
@@ -447,18 +423,18 @@
           <w:p>
             <w:pPr>
               <w:pStyle w:val="Contenidodelatabla"/>
+              <w:widowControl w:val="false"/>
               <w:spacing w:before="0" w:after="200"/>
               <w:rPr>
-                <w:rFonts w:ascii="Calibri" w:hAnsi="Calibri"/>
-                <w:sz w:val="18"/>
-                <w:szCs w:val="18"/>
+                <w:sz w:val="12"/>
+                <w:szCs w:val="12"/>
               </w:rPr>
             </w:pPr>
             <w:r>
               <w:rPr>
                 <w:rFonts w:ascii="Calibri" w:hAnsi="Calibri"/>
-                <w:sz w:val="18"/>
-                <w:szCs w:val="18"/>
+                <w:sz w:val="12"/>
+                <w:szCs w:val="12"/>
               </w:rPr>
               <w:t>{nombres}</w:t>
             </w:r>
@@ -466,24 +442,24 @@
         </w:tc>
         <w:tc>
           <w:tcPr>
-            <w:tcW w:w="1080" w:type="dxa"/>
+            <w:tcW w:w="724" w:type="dxa"/>
             <w:tcBorders/>
           </w:tcPr>
           <w:p>
             <w:pPr>
               <w:pStyle w:val="Contenidodelatabla"/>
+              <w:widowControl w:val="false"/>
               <w:spacing w:before="0" w:after="200"/>
               <w:rPr>
-                <w:rFonts w:ascii="Calibri" w:hAnsi="Calibri"/>
-                <w:sz w:val="18"/>
-                <w:szCs w:val="18"/>
+                <w:sz w:val="12"/>
+                <w:szCs w:val="12"/>
               </w:rPr>
             </w:pPr>
             <w:r>
               <w:rPr>
                 <w:rFonts w:ascii="Calibri" w:hAnsi="Calibri"/>
-                <w:sz w:val="18"/>
-                <w:szCs w:val="18"/>
+                <w:sz w:val="12"/>
+                <w:szCs w:val="12"/>
               </w:rPr>
               <w:t>{sexo}</w:t>
             </w:r>
@@ -491,24 +467,24 @@
         </w:tc>
         <w:tc>
           <w:tcPr>
-            <w:tcW w:w="1080" w:type="dxa"/>
+            <w:tcW w:w="512" w:type="dxa"/>
             <w:tcBorders/>
           </w:tcPr>
           <w:p>
             <w:pPr>
               <w:pStyle w:val="Contenidodelatabla"/>
+              <w:widowControl w:val="false"/>
               <w:spacing w:before="0" w:after="200"/>
               <w:rPr>
-                <w:rFonts w:ascii="Calibri" w:hAnsi="Calibri"/>
-                <w:sz w:val="18"/>
-                <w:szCs w:val="18"/>
+                <w:sz w:val="12"/>
+                <w:szCs w:val="12"/>
               </w:rPr>
             </w:pPr>
             <w:r>
               <w:rPr>
                 <w:rFonts w:ascii="Calibri" w:hAnsi="Calibri"/>
-                <w:sz w:val="18"/>
-                <w:szCs w:val="18"/>
+                <w:sz w:val="12"/>
+                <w:szCs w:val="12"/>
               </w:rPr>
               <w:t>{rut}</w:t>
             </w:r>
@@ -516,24 +492,24 @@
         </w:tc>
         <w:tc>
           <w:tcPr>
-            <w:tcW w:w="1080" w:type="dxa"/>
+            <w:tcW w:w="1813" w:type="dxa"/>
             <w:tcBorders/>
           </w:tcPr>
           <w:p>
             <w:pPr>
               <w:pStyle w:val="Contenidodelatabla"/>
+              <w:widowControl w:val="false"/>
               <w:spacing w:before="0" w:after="200"/>
               <w:rPr>
-                <w:rFonts w:ascii="Calibri" w:hAnsi="Calibri"/>
-                <w:sz w:val="18"/>
-                <w:szCs w:val="18"/>
+                <w:sz w:val="12"/>
+                <w:szCs w:val="12"/>
               </w:rPr>
             </w:pPr>
             <w:r>
               <w:rPr>
                 <w:rFonts w:ascii="Calibri" w:hAnsi="Calibri"/>
-                <w:sz w:val="18"/>
-                <w:szCs w:val="18"/>
+                <w:sz w:val="12"/>
+                <w:szCs w:val="12"/>
               </w:rPr>
               <w:t>{fechaNacimiento}</w:t>
             </w:r>
@@ -541,24 +517,24 @@
         </w:tc>
         <w:tc>
           <w:tcPr>
-            <w:tcW w:w="1080" w:type="dxa"/>
+            <w:tcW w:w="1271" w:type="dxa"/>
             <w:tcBorders/>
           </w:tcPr>
           <w:p>
             <w:pPr>
               <w:pStyle w:val="Contenidodelatabla"/>
+              <w:widowControl w:val="false"/>
               <w:spacing w:before="0" w:after="200"/>
               <w:rPr>
-                <w:rFonts w:ascii="Calibri" w:hAnsi="Calibri"/>
-                <w:sz w:val="18"/>
-                <w:szCs w:val="18"/>
+                <w:sz w:val="12"/>
+                <w:szCs w:val="12"/>
               </w:rPr>
             </w:pPr>
             <w:r>
               <w:rPr>
                 <w:rFonts w:ascii="Calibri" w:hAnsi="Calibri"/>
-                <w:sz w:val="18"/>
-                <w:szCs w:val="18"/>
+                <w:sz w:val="12"/>
+                <w:szCs w:val="12"/>
               </w:rPr>
               <w:t>{parentesco}</w:t>
             </w:r>
@@ -572,20 +548,36 @@
           <w:p>
             <w:pPr>
               <w:pStyle w:val="Contenidodelatabla"/>
+              <w:widowControl w:val="false"/>
               <w:spacing w:before="0" w:after="200"/>
               <w:rPr>
-                <w:rFonts w:ascii="Calibri" w:hAnsi="Calibri"/>
-                <w:sz w:val="18"/>
-                <w:szCs w:val="18"/>
+                <w:sz w:val="12"/>
+                <w:szCs w:val="12"/>
               </w:rPr>
             </w:pPr>
             <w:r>
               <w:rPr>
                 <w:rFonts w:ascii="Calibri" w:hAnsi="Calibri"/>
-                <w:sz w:val="18"/>
-                <w:szCs w:val="18"/>
-              </w:rPr>
-              <w:t>{observaciones}{/beneficiarios}</w:t>
+                <w:sz w:val="12"/>
+                <w:szCs w:val="12"/>
+              </w:rPr>
+              <w:t>{observac</w:t>
+            </w:r>
+            <w:r>
+              <w:rPr>
+                <w:rFonts w:ascii="Calibri" w:hAnsi="Calibri"/>
+                <w:sz w:val="12"/>
+                <w:szCs w:val="12"/>
+              </w:rPr>
+              <w:t>i</w:t>
+            </w:r>
+            <w:r>
+              <w:rPr>
+                <w:rFonts w:ascii="Calibri" w:hAnsi="Calibri"/>
+                <w:sz w:val="12"/>
+                <w:szCs w:val="12"/>
+              </w:rPr>
+              <w:t>ones}{/beneficiarios}</w:t>
             </w:r>
           </w:p>
         </w:tc>
@@ -610,9 +602,8 @@
     <w:p>
       <w:pPr>
         <w:pStyle w:val="Normal"/>
-        <w:rPr>
-          <w:rFonts w:ascii="Calibri" w:hAnsi="Calibri"/>
-        </w:rPr>
+        <w:jc w:val="both"/>
+        <w:rPr/>
       </w:pPr>
       <w:r>
         <w:rPr>
@@ -623,7 +614,7 @@
     </w:p>
     <w:tbl>
       <w:tblPr>
-        <w:tblW w:w="5000" w:type="pct"/>
+        <w:tblW w:w="9925" w:type="dxa"/>
         <w:jc w:val="left"/>
         <w:tblInd w:w="0" w:type="dxa"/>
         <w:tblLayout w:type="fixed"/>
@@ -635,21 +626,22 @@
         </w:tblCellMar>
       </w:tblPr>
       <w:tblGrid>
-        <w:gridCol w:w="7375"/>
-        <w:gridCol w:w="613"/>
-        <w:gridCol w:w="652"/>
+        <w:gridCol w:w="5838"/>
+        <w:gridCol w:w="2037"/>
+        <w:gridCol w:w="2050"/>
       </w:tblGrid>
       <w:tr>
         <w:trPr/>
         <w:tc>
           <w:tcPr>
-            <w:tcW w:w="7375" w:type="dxa"/>
+            <w:tcW w:w="5838" w:type="dxa"/>
             <w:tcBorders/>
             <w:vAlign w:val="center"/>
           </w:tcPr>
           <w:p>
             <w:pPr>
               <w:pStyle w:val="Contenidodelatabla"/>
+              <w:widowControl w:val="false"/>
               <w:spacing w:before="0" w:after="200"/>
               <w:jc w:val="center"/>
               <w:rPr>
@@ -665,14 +657,15 @@
         </w:tc>
         <w:tc>
           <w:tcPr>
-            <w:tcW w:w="613" w:type="dxa"/>
+            <w:tcW w:w="2037" w:type="dxa"/>
             <w:tcBorders/>
             <w:vAlign w:val="center"/>
           </w:tcPr>
           <w:p>
             <w:pPr>
               <w:pStyle w:val="Contenidodelatabla"/>
-              <w:spacing w:before="0" w:after="200"/>
+              <w:widowControl w:val="false"/>
+              <w:spacing w:lineRule="auto" w:line="276" w:before="57" w:after="257"/>
               <w:jc w:val="center"/>
               <w:rPr>
                 <w:rFonts w:ascii="Calibri" w:hAnsi="Calibri"/>
@@ -688,13 +681,14 @@
         </w:tc>
         <w:tc>
           <w:tcPr>
-            <w:tcW w:w="652" w:type="dxa"/>
+            <w:tcW w:w="2050" w:type="dxa"/>
             <w:tcBorders/>
             <w:vAlign w:val="center"/>
           </w:tcPr>
           <w:p>
             <w:pPr>
               <w:pStyle w:val="Contenidodelatabla"/>
+              <w:widowControl w:val="false"/>
               <w:spacing w:before="0" w:after="200"/>
               <w:jc w:val="center"/>
               <w:rPr>
@@ -714,13 +708,14 @@
         <w:trPr/>
         <w:tc>
           <w:tcPr>
-            <w:tcW w:w="7375" w:type="dxa"/>
+            <w:tcW w:w="5838" w:type="dxa"/>
             <w:tcBorders/>
             <w:vAlign w:val="center"/>
           </w:tcPr>
           <w:p>
             <w:pPr>
               <w:pStyle w:val="Contenidodelatabla"/>
+              <w:widowControl w:val="false"/>
               <w:spacing w:before="0" w:after="200"/>
               <w:jc w:val="left"/>
               <w:rPr>
@@ -737,13 +732,14 @@
         </w:tc>
         <w:tc>
           <w:tcPr>
-            <w:tcW w:w="613" w:type="dxa"/>
+            <w:tcW w:w="2037" w:type="dxa"/>
             <w:tcBorders/>
             <w:vAlign w:val="center"/>
           </w:tcPr>
           <w:p>
             <w:pPr>
               <w:pStyle w:val="Contenidodelatabla"/>
+              <w:widowControl w:val="false"/>
               <w:spacing w:before="0" w:after="200"/>
               <w:jc w:val="center"/>
               <w:rPr>
@@ -752,7 +748,27 @@
             </w:pPr>
             <w:r>
               <w:rPr>
+                <w:sz w:val="12"/>
+                <w:szCs w:val="12"/>
+              </w:rPr>
+            </w:r>
+          </w:p>
+          <w:p>
+            <w:pPr>
+              <w:pStyle w:val="Contenidodelatabla"/>
+              <w:widowControl w:val="false"/>
+              <w:spacing w:before="0" w:after="200"/>
+              <w:jc w:val="center"/>
+              <w:rPr>
+                <w:sz w:val="12"/>
+                <w:szCs w:val="12"/>
+              </w:rPr>
+            </w:pPr>
+            <w:r>
+              <w:rPr>
                 <w:rFonts w:ascii="Calibri" w:hAnsi="Calibri"/>
+                <w:sz w:val="12"/>
+                <w:szCs w:val="12"/>
               </w:rPr>
               <w:t>{{ant_pension_preliminar_si}}</w:t>
             </w:r>
@@ -760,13 +776,14 @@
         </w:tc>
         <w:tc>
           <w:tcPr>
-            <w:tcW w:w="652" w:type="dxa"/>
+            <w:tcW w:w="2050" w:type="dxa"/>
             <w:tcBorders/>
             <w:vAlign w:val="center"/>
           </w:tcPr>
           <w:p>
             <w:pPr>
               <w:pStyle w:val="Contenidodelatabla"/>
+              <w:widowControl w:val="false"/>
               <w:spacing w:before="0" w:after="200"/>
               <w:jc w:val="center"/>
               <w:rPr>
@@ -775,7 +792,27 @@
             </w:pPr>
             <w:r>
               <w:rPr>
+                <w:sz w:val="12"/>
+                <w:szCs w:val="12"/>
+              </w:rPr>
+            </w:r>
+          </w:p>
+          <w:p>
+            <w:pPr>
+              <w:pStyle w:val="Contenidodelatabla"/>
+              <w:widowControl w:val="false"/>
+              <w:spacing w:before="0" w:after="200"/>
+              <w:jc w:val="center"/>
+              <w:rPr>
+                <w:sz w:val="12"/>
+                <w:szCs w:val="12"/>
+              </w:rPr>
+            </w:pPr>
+            <w:r>
+              <w:rPr>
                 <w:rFonts w:ascii="Calibri" w:hAnsi="Calibri"/>
+                <w:sz w:val="12"/>
+                <w:szCs w:val="12"/>
               </w:rPr>
               <w:t>{{ant_pension_preliminar_no}}</w:t>
             </w:r>
@@ -786,13 +823,14 @@
         <w:trPr/>
         <w:tc>
           <w:tcPr>
-            <w:tcW w:w="7375" w:type="dxa"/>
+            <w:tcW w:w="5838" w:type="dxa"/>
             <w:tcBorders/>
             <w:vAlign w:val="center"/>
           </w:tcPr>
           <w:p>
             <w:pPr>
               <w:pStyle w:val="Contenidodelatabla"/>
+              <w:widowControl w:val="false"/>
               <w:spacing w:before="0" w:after="200"/>
               <w:jc w:val="left"/>
               <w:rPr>
@@ -809,13 +847,14 @@
         </w:tc>
         <w:tc>
           <w:tcPr>
-            <w:tcW w:w="613" w:type="dxa"/>
+            <w:tcW w:w="2037" w:type="dxa"/>
             <w:tcBorders/>
             <w:vAlign w:val="center"/>
           </w:tcPr>
           <w:p>
             <w:pPr>
               <w:pStyle w:val="Contenidodelatabla"/>
+              <w:widowControl w:val="false"/>
               <w:spacing w:before="0" w:after="200"/>
               <w:jc w:val="center"/>
               <w:rPr>
@@ -824,7 +863,27 @@
             </w:pPr>
             <w:r>
               <w:rPr>
+                <w:sz w:val="12"/>
+                <w:szCs w:val="12"/>
+              </w:rPr>
+            </w:r>
+          </w:p>
+          <w:p>
+            <w:pPr>
+              <w:pStyle w:val="Contenidodelatabla"/>
+              <w:widowControl w:val="false"/>
+              <w:spacing w:before="0" w:after="200"/>
+              <w:jc w:val="center"/>
+              <w:rPr>
+                <w:sz w:val="12"/>
+                <w:szCs w:val="12"/>
+              </w:rPr>
+            </w:pPr>
+            <w:r>
+              <w:rPr>
                 <w:rFonts w:ascii="Calibri" w:hAnsi="Calibri"/>
+                <w:sz w:val="12"/>
+                <w:szCs w:val="12"/>
               </w:rPr>
               <w:t>{{ant_aps_si}}</w:t>
             </w:r>
@@ -832,13 +891,14 @@
         </w:tc>
         <w:tc>
           <w:tcPr>
-            <w:tcW w:w="652" w:type="dxa"/>
+            <w:tcW w:w="2050" w:type="dxa"/>
             <w:tcBorders/>
             <w:vAlign w:val="center"/>
           </w:tcPr>
           <w:p>
             <w:pPr>
               <w:pStyle w:val="Contenidodelatabla"/>
+              <w:widowControl w:val="false"/>
               <w:spacing w:before="0" w:after="200"/>
               <w:jc w:val="center"/>
               <w:rPr>
@@ -847,7 +907,27 @@
             </w:pPr>
             <w:r>
               <w:rPr>
+                <w:sz w:val="12"/>
+                <w:szCs w:val="12"/>
+              </w:rPr>
+            </w:r>
+          </w:p>
+          <w:p>
+            <w:pPr>
+              <w:pStyle w:val="Contenidodelatabla"/>
+              <w:widowControl w:val="false"/>
+              <w:spacing w:before="0" w:after="200"/>
+              <w:jc w:val="center"/>
+              <w:rPr>
+                <w:sz w:val="12"/>
+                <w:szCs w:val="12"/>
+              </w:rPr>
+            </w:pPr>
+            <w:r>
+              <w:rPr>
                 <w:rFonts w:ascii="Calibri" w:hAnsi="Calibri"/>
+                <w:sz w:val="12"/>
+                <w:szCs w:val="12"/>
               </w:rPr>
               <w:t>{{ant_aps_no}}</w:t>
             </w:r>
@@ -858,13 +938,14 @@
         <w:trPr/>
         <w:tc>
           <w:tcPr>
-            <w:tcW w:w="7375" w:type="dxa"/>
+            <w:tcW w:w="5838" w:type="dxa"/>
             <w:tcBorders/>
             <w:vAlign w:val="center"/>
           </w:tcPr>
           <w:p>
             <w:pPr>
               <w:pStyle w:val="Contenidodelatabla"/>
+              <w:widowControl w:val="false"/>
               <w:spacing w:before="0" w:after="200"/>
               <w:jc w:val="left"/>
               <w:rPr>
@@ -881,22 +962,26 @@
         </w:tc>
         <w:tc>
           <w:tcPr>
-            <w:tcW w:w="613" w:type="dxa"/>
+            <w:tcW w:w="2037" w:type="dxa"/>
             <w:tcBorders/>
             <w:vAlign w:val="center"/>
           </w:tcPr>
           <w:p>
             <w:pPr>
               <w:pStyle w:val="Contenidodelatabla"/>
+              <w:widowControl w:val="false"/>
               <w:spacing w:before="0" w:after="200"/>
               <w:jc w:val="center"/>
               <w:rPr>
-                <w:rFonts w:ascii="Calibri" w:hAnsi="Calibri"/>
+                <w:sz w:val="12"/>
+                <w:szCs w:val="12"/>
               </w:rPr>
             </w:pPr>
             <w:r>
               <w:rPr>
                 <w:rFonts w:ascii="Calibri" w:hAnsi="Calibri"/>
+                <w:sz w:val="12"/>
+                <w:szCs w:val="12"/>
               </w:rPr>
               <w:t>{{ant_antiguo_si}}</w:t>
             </w:r>
@@ -904,22 +989,26 @@
         </w:tc>
         <w:tc>
           <w:tcPr>
-            <w:tcW w:w="652" w:type="dxa"/>
+            <w:tcW w:w="2050" w:type="dxa"/>
             <w:tcBorders/>
             <w:vAlign w:val="center"/>
           </w:tcPr>
           <w:p>
             <w:pPr>
               <w:pStyle w:val="Contenidodelatabla"/>
+              <w:widowControl w:val="false"/>
               <w:spacing w:before="0" w:after="200"/>
               <w:jc w:val="center"/>
               <w:rPr>
-                <w:rFonts w:ascii="Calibri" w:hAnsi="Calibri"/>
+                <w:sz w:val="12"/>
+                <w:szCs w:val="12"/>
               </w:rPr>
             </w:pPr>
             <w:r>
               <w:rPr>
                 <w:rFonts w:ascii="Calibri" w:hAnsi="Calibri"/>
+                <w:sz w:val="12"/>
+                <w:szCs w:val="12"/>
               </w:rPr>
               <w:t>{{ant_antiguo_no}}</w:t>
             </w:r>
@@ -930,13 +1019,14 @@
         <w:trPr/>
         <w:tc>
           <w:tcPr>
-            <w:tcW w:w="7375" w:type="dxa"/>
+            <w:tcW w:w="5838" w:type="dxa"/>
             <w:tcBorders/>
             <w:vAlign w:val="center"/>
           </w:tcPr>
           <w:p>
             <w:pPr>
               <w:pStyle w:val="Contenidodelatabla"/>
+              <w:widowControl w:val="false"/>
               <w:spacing w:before="0" w:after="200"/>
               <w:jc w:val="left"/>
               <w:rPr>
@@ -953,13 +1043,14 @@
         </w:tc>
         <w:tc>
           <w:tcPr>
-            <w:tcW w:w="613" w:type="dxa"/>
+            <w:tcW w:w="2037" w:type="dxa"/>
             <w:tcBorders/>
             <w:vAlign w:val="center"/>
           </w:tcPr>
           <w:p>
             <w:pPr>
               <w:pStyle w:val="Contenidodelatabla"/>
+              <w:widowControl w:val="false"/>
               <w:spacing w:before="0" w:after="200"/>
               <w:jc w:val="center"/>
               <w:rPr>
@@ -968,7 +1059,27 @@
             </w:pPr>
             <w:r>
               <w:rPr>
+                <w:sz w:val="12"/>
+                <w:szCs w:val="12"/>
+              </w:rPr>
+            </w:r>
+          </w:p>
+          <w:p>
+            <w:pPr>
+              <w:pStyle w:val="Contenidodelatabla"/>
+              <w:widowControl w:val="false"/>
+              <w:spacing w:before="0" w:after="200"/>
+              <w:jc w:val="center"/>
+              <w:rPr>
+                <w:sz w:val="12"/>
+                <w:szCs w:val="12"/>
+              </w:rPr>
+            </w:pPr>
+            <w:r>
+              <w:rPr>
                 <w:rFonts w:ascii="Calibri" w:hAnsi="Calibri"/>
+                <w:sz w:val="12"/>
+                <w:szCs w:val="12"/>
               </w:rPr>
               <w:t>{{ant_invalidez_si}}</w:t>
             </w:r>
@@ -976,13 +1087,14 @@
         </w:tc>
         <w:tc>
           <w:tcPr>
-            <w:tcW w:w="652" w:type="dxa"/>
+            <w:tcW w:w="2050" w:type="dxa"/>
             <w:tcBorders/>
             <w:vAlign w:val="center"/>
           </w:tcPr>
           <w:p>
             <w:pPr>
               <w:pStyle w:val="Contenidodelatabla"/>
+              <w:widowControl w:val="false"/>
               <w:spacing w:before="0" w:after="200"/>
               <w:jc w:val="center"/>
               <w:rPr>
@@ -991,7 +1103,27 @@
             </w:pPr>
             <w:r>
               <w:rPr>
+                <w:sz w:val="12"/>
+                <w:szCs w:val="12"/>
+              </w:rPr>
+            </w:r>
+          </w:p>
+          <w:p>
+            <w:pPr>
+              <w:pStyle w:val="Contenidodelatabla"/>
+              <w:widowControl w:val="false"/>
+              <w:spacing w:before="0" w:after="200"/>
+              <w:jc w:val="center"/>
+              <w:rPr>
+                <w:sz w:val="12"/>
+                <w:szCs w:val="12"/>
+              </w:rPr>
+            </w:pPr>
+            <w:r>
+              <w:rPr>
                 <w:rFonts w:ascii="Calibri" w:hAnsi="Calibri"/>
+                <w:sz w:val="12"/>
+                <w:szCs w:val="12"/>
               </w:rPr>
               <w:t>{{ant_invalidez_no}}</w:t>
             </w:r>
@@ -1002,13 +1134,14 @@
         <w:trPr/>
         <w:tc>
           <w:tcPr>
-            <w:tcW w:w="7375" w:type="dxa"/>
+            <w:tcW w:w="5838" w:type="dxa"/>
             <w:tcBorders/>
             <w:vAlign w:val="center"/>
           </w:tcPr>
           <w:p>
             <w:pPr>
               <w:pStyle w:val="Contenidodelatabla"/>
+              <w:widowControl w:val="false"/>
               <w:spacing w:before="0" w:after="200"/>
               <w:jc w:val="left"/>
               <w:rPr>
@@ -1019,25 +1152,20 @@
               <w:rPr>
                 <w:rFonts w:ascii="Calibri" w:hAnsi="Calibri"/>
               </w:rPr>
-              <w:t xml:space="preserve">Deseo que mi pensión se ajuste a la pensión mínima, si resulta inferior a </w:t>
-            </w:r>
-            <w:r>
-              <w:rPr>
-                <w:rFonts w:ascii="Calibri" w:hAnsi="Calibri"/>
-              </w:rPr>
-              <w:t>ella.</w:t>
+              <w:t>Deseo que mi pensión se ajuste a la pensión mínima, si resulta inferior a ella.</w:t>
             </w:r>
           </w:p>
         </w:tc>
         <w:tc>
           <w:tcPr>
-            <w:tcW w:w="613" w:type="dxa"/>
+            <w:tcW w:w="2037" w:type="dxa"/>
             <w:tcBorders/>
             <w:vAlign w:val="center"/>
           </w:tcPr>
           <w:p>
             <w:pPr>
               <w:pStyle w:val="Contenidodelatabla"/>
+              <w:widowControl w:val="false"/>
               <w:spacing w:before="0" w:after="200"/>
               <w:jc w:val="center"/>
               <w:rPr>
@@ -1046,7 +1174,27 @@
             </w:pPr>
             <w:r>
               <w:rPr>
+                <w:sz w:val="12"/>
+                <w:szCs w:val="12"/>
+              </w:rPr>
+            </w:r>
+          </w:p>
+          <w:p>
+            <w:pPr>
+              <w:pStyle w:val="Contenidodelatabla"/>
+              <w:widowControl w:val="false"/>
+              <w:spacing w:before="0" w:after="200"/>
+              <w:jc w:val="center"/>
+              <w:rPr>
+                <w:sz w:val="12"/>
+                <w:szCs w:val="12"/>
+              </w:rPr>
+            </w:pPr>
+            <w:r>
+              <w:rPr>
                 <w:rFonts w:ascii="Calibri" w:hAnsi="Calibri"/>
+                <w:sz w:val="12"/>
+                <w:szCs w:val="12"/>
               </w:rPr>
               <w:t>{{ant_minima_si}}</w:t>
             </w:r>
@@ -1054,13 +1202,14 @@
         </w:tc>
         <w:tc>
           <w:tcPr>
-            <w:tcW w:w="652" w:type="dxa"/>
+            <w:tcW w:w="2050" w:type="dxa"/>
             <w:tcBorders/>
             <w:vAlign w:val="center"/>
           </w:tcPr>
           <w:p>
             <w:pPr>
               <w:pStyle w:val="Contenidodelatabla"/>
+              <w:widowControl w:val="false"/>
               <w:spacing w:before="0" w:after="200"/>
               <w:jc w:val="center"/>
               <w:rPr>
@@ -1069,7 +1218,27 @@
             </w:pPr>
             <w:r>
               <w:rPr>
+                <w:sz w:val="12"/>
+                <w:szCs w:val="12"/>
+              </w:rPr>
+            </w:r>
+          </w:p>
+          <w:p>
+            <w:pPr>
+              <w:pStyle w:val="Contenidodelatabla"/>
+              <w:widowControl w:val="false"/>
+              <w:spacing w:before="0" w:after="200"/>
+              <w:jc w:val="center"/>
+              <w:rPr>
+                <w:sz w:val="12"/>
+                <w:szCs w:val="12"/>
+              </w:rPr>
+            </w:pPr>
+            <w:r>
+              <w:rPr>
                 <w:rFonts w:ascii="Calibri" w:hAnsi="Calibri"/>
+                <w:sz w:val="12"/>
+                <w:szCs w:val="12"/>
               </w:rPr>
               <w:t>{{ant_minima_no}}</w:t>
             </w:r>
@@ -1080,13 +1249,14 @@
         <w:trPr/>
         <w:tc>
           <w:tcPr>
-            <w:tcW w:w="7375" w:type="dxa"/>
+            <w:tcW w:w="5838" w:type="dxa"/>
             <w:tcBorders/>
             <w:vAlign w:val="center"/>
           </w:tcPr>
           <w:p>
             <w:pPr>
               <w:pStyle w:val="Contenidodelatabla"/>
+              <w:widowControl w:val="false"/>
               <w:spacing w:before="0" w:after="200"/>
               <w:jc w:val="left"/>
               <w:rPr>
@@ -1103,13 +1273,14 @@
         </w:tc>
         <w:tc>
           <w:tcPr>
-            <w:tcW w:w="613" w:type="dxa"/>
+            <w:tcW w:w="2037" w:type="dxa"/>
             <w:tcBorders/>
             <w:vAlign w:val="center"/>
           </w:tcPr>
           <w:p>
             <w:pPr>
               <w:pStyle w:val="Contenidodelatabla"/>
+              <w:widowControl w:val="false"/>
               <w:spacing w:before="0" w:after="200"/>
               <w:jc w:val="center"/>
               <w:rPr>
@@ -1118,7 +1289,27 @@
             </w:pPr>
             <w:r>
               <w:rPr>
+                <w:sz w:val="12"/>
+                <w:szCs w:val="12"/>
+              </w:rPr>
+            </w:r>
+          </w:p>
+          <w:p>
+            <w:pPr>
+              <w:pStyle w:val="Contenidodelatabla"/>
+              <w:widowControl w:val="false"/>
+              <w:spacing w:before="0" w:after="200"/>
+              <w:jc w:val="center"/>
+              <w:rPr>
+                <w:sz w:val="12"/>
+                <w:szCs w:val="12"/>
+              </w:rPr>
+            </w:pPr>
+            <w:r>
+              <w:rPr>
                 <w:rFonts w:ascii="Calibri" w:hAnsi="Calibri"/>
+                <w:sz w:val="12"/>
+                <w:szCs w:val="12"/>
               </w:rPr>
               <w:t>{{ant_pbs_si}}</w:t>
             </w:r>
@@ -1126,13 +1317,14 @@
         </w:tc>
         <w:tc>
           <w:tcPr>
-            <w:tcW w:w="652" w:type="dxa"/>
+            <w:tcW w:w="2050" w:type="dxa"/>
             <w:tcBorders/>
             <w:vAlign w:val="center"/>
           </w:tcPr>
           <w:p>
             <w:pPr>
               <w:pStyle w:val="Contenidodelatabla"/>
+              <w:widowControl w:val="false"/>
               <w:spacing w:before="0" w:after="200"/>
               <w:jc w:val="center"/>
               <w:rPr>
@@ -1141,7 +1333,27 @@
             </w:pPr>
             <w:r>
               <w:rPr>
+                <w:sz w:val="12"/>
+                <w:szCs w:val="12"/>
+              </w:rPr>
+            </w:r>
+          </w:p>
+          <w:p>
+            <w:pPr>
+              <w:pStyle w:val="Contenidodelatabla"/>
+              <w:widowControl w:val="false"/>
+              <w:spacing w:before="0" w:after="200"/>
+              <w:jc w:val="center"/>
+              <w:rPr>
+                <w:sz w:val="12"/>
+                <w:szCs w:val="12"/>
+              </w:rPr>
+            </w:pPr>
+            <w:r>
+              <w:rPr>
                 <w:rFonts w:ascii="Calibri" w:hAnsi="Calibri"/>
+                <w:sz w:val="12"/>
+                <w:szCs w:val="12"/>
               </w:rPr>
               <w:t>{{ant_pbs_no}}</w:t>
             </w:r>
@@ -1152,13 +1364,14 @@
         <w:trPr/>
         <w:tc>
           <w:tcPr>
-            <w:tcW w:w="7375" w:type="dxa"/>
+            <w:tcW w:w="5838" w:type="dxa"/>
             <w:tcBorders/>
             <w:vAlign w:val="center"/>
           </w:tcPr>
           <w:p>
             <w:pPr>
               <w:pStyle w:val="Contenidodelatabla"/>
+              <w:widowControl w:val="false"/>
               <w:spacing w:before="0" w:after="200"/>
               <w:jc w:val="left"/>
               <w:rPr>
@@ -1175,22 +1388,26 @@
         </w:tc>
         <w:tc>
           <w:tcPr>
-            <w:tcW w:w="613" w:type="dxa"/>
+            <w:tcW w:w="2037" w:type="dxa"/>
             <w:tcBorders/>
             <w:vAlign w:val="center"/>
           </w:tcPr>
           <w:p>
             <w:pPr>
               <w:pStyle w:val="Contenidodelatabla"/>
+              <w:widowControl w:val="false"/>
               <w:spacing w:before="0" w:after="200"/>
               <w:jc w:val="center"/>
               <w:rPr>
-                <w:rFonts w:ascii="Calibri" w:hAnsi="Calibri"/>
+                <w:sz w:val="12"/>
+                <w:szCs w:val="12"/>
               </w:rPr>
             </w:pPr>
             <w:r>
               <w:rPr>
                 <w:rFonts w:ascii="Calibri" w:hAnsi="Calibri"/>
+                <w:sz w:val="12"/>
+                <w:szCs w:val="12"/>
               </w:rPr>
               <w:t>{{ant_estatuto_si}}</w:t>
             </w:r>
@@ -1198,22 +1415,26 @@
         </w:tc>
         <w:tc>
           <w:tcPr>
-            <w:tcW w:w="652" w:type="dxa"/>
+            <w:tcW w:w="2050" w:type="dxa"/>
             <w:tcBorders/>
             <w:vAlign w:val="center"/>
           </w:tcPr>
           <w:p>
             <w:pPr>
               <w:pStyle w:val="Contenidodelatabla"/>
+              <w:widowControl w:val="false"/>
               <w:spacing w:before="0" w:after="200"/>
               <w:jc w:val="center"/>
               <w:rPr>
-                <w:rFonts w:ascii="Calibri" w:hAnsi="Calibri"/>
+                <w:sz w:val="12"/>
+                <w:szCs w:val="12"/>
               </w:rPr>
             </w:pPr>
             <w:r>
               <w:rPr>
                 <w:rFonts w:ascii="Calibri" w:hAnsi="Calibri"/>
+                <w:sz w:val="12"/>
+                <w:szCs w:val="12"/>
               </w:rPr>
               <w:t>{{ant_estatuto_no}}</w:t>
             </w:r>
@@ -1224,13 +1445,14 @@
         <w:trPr/>
         <w:tc>
           <w:tcPr>
-            <w:tcW w:w="7375" w:type="dxa"/>
+            <w:tcW w:w="5838" w:type="dxa"/>
             <w:tcBorders/>
             <w:vAlign w:val="center"/>
           </w:tcPr>
           <w:p>
             <w:pPr>
               <w:pStyle w:val="Contenidodelatabla"/>
+              <w:widowControl w:val="false"/>
               <w:spacing w:before="0" w:after="200"/>
               <w:jc w:val="left"/>
               <w:rPr>
@@ -1247,22 +1469,26 @@
         </w:tc>
         <w:tc>
           <w:tcPr>
-            <w:tcW w:w="613" w:type="dxa"/>
+            <w:tcW w:w="2037" w:type="dxa"/>
             <w:tcBorders/>
             <w:vAlign w:val="center"/>
           </w:tcPr>
           <w:p>
             <w:pPr>
               <w:pStyle w:val="Contenidodelatabla"/>
+              <w:widowControl w:val="false"/>
               <w:spacing w:before="0" w:after="200"/>
               <w:jc w:val="center"/>
               <w:rPr>
-                <w:rFonts w:ascii="Calibri" w:hAnsi="Calibri"/>
+                <w:sz w:val="12"/>
+                <w:szCs w:val="12"/>
               </w:rPr>
             </w:pPr>
             <w:r>
               <w:rPr>
                 <w:rFonts w:ascii="Calibri" w:hAnsi="Calibri"/>
+                <w:sz w:val="12"/>
+                <w:szCs w:val="12"/>
               </w:rPr>
               <w:t>{{ant_apv_si}}</w:t>
             </w:r>
@@ -1270,22 +1496,26 @@
         </w:tc>
         <w:tc>
           <w:tcPr>
-            <w:tcW w:w="652" w:type="dxa"/>
+            <w:tcW w:w="2050" w:type="dxa"/>
             <w:tcBorders/>
             <w:vAlign w:val="center"/>
           </w:tcPr>
           <w:p>
             <w:pPr>
               <w:pStyle w:val="Contenidodelatabla"/>
+              <w:widowControl w:val="false"/>
               <w:spacing w:before="0" w:after="200"/>
               <w:jc w:val="center"/>
               <w:rPr>
-                <w:rFonts w:ascii="Calibri" w:hAnsi="Calibri"/>
+                <w:sz w:val="12"/>
+                <w:szCs w:val="12"/>
               </w:rPr>
             </w:pPr>
             <w:r>
               <w:rPr>
                 <w:rFonts w:ascii="Calibri" w:hAnsi="Calibri"/>
+                <w:sz w:val="12"/>
+                <w:szCs w:val="12"/>
               </w:rPr>
               <w:t>{{ant_apv_no}}</w:t>
             </w:r>
@@ -1296,13 +1526,14 @@
         <w:trPr/>
         <w:tc>
           <w:tcPr>
-            <w:tcW w:w="7375" w:type="dxa"/>
+            <w:tcW w:w="5838" w:type="dxa"/>
             <w:tcBorders/>
             <w:vAlign w:val="center"/>
           </w:tcPr>
           <w:p>
             <w:pPr>
               <w:pStyle w:val="Contenidodelatabla"/>
+              <w:widowControl w:val="false"/>
               <w:spacing w:before="0" w:after="200"/>
               <w:jc w:val="left"/>
               <w:rPr>
@@ -1319,13 +1550,14 @@
         </w:tc>
         <w:tc>
           <w:tcPr>
-            <w:tcW w:w="613" w:type="dxa"/>
+            <w:tcW w:w="2037" w:type="dxa"/>
             <w:tcBorders/>
             <w:vAlign w:val="center"/>
           </w:tcPr>
           <w:p>
             <w:pPr>
               <w:pStyle w:val="Contenidodelatabla"/>
+              <w:widowControl w:val="false"/>
               <w:spacing w:before="0" w:after="200"/>
               <w:jc w:val="center"/>
               <w:rPr>
@@ -1334,7 +1566,27 @@
             </w:pPr>
             <w:r>
               <w:rPr>
+                <w:sz w:val="12"/>
+                <w:szCs w:val="12"/>
+              </w:rPr>
+            </w:r>
+          </w:p>
+          <w:p>
+            <w:pPr>
+              <w:pStyle w:val="Contenidodelatabla"/>
+              <w:widowControl w:val="false"/>
+              <w:spacing w:before="0" w:after="200"/>
+              <w:jc w:val="center"/>
+              <w:rPr>
+                <w:sz w:val="12"/>
+                <w:szCs w:val="12"/>
+              </w:rPr>
+            </w:pPr>
+            <w:r>
+              <w:rPr>
                 <w:rFonts w:ascii="Calibri" w:hAnsi="Calibri"/>
+                <w:sz w:val="12"/>
+                <w:szCs w:val="12"/>
               </w:rPr>
               <w:t>{{ant_apvc_si}}</w:t>
             </w:r>
@@ -1342,13 +1594,14 @@
         </w:tc>
         <w:tc>
           <w:tcPr>
-            <w:tcW w:w="652" w:type="dxa"/>
+            <w:tcW w:w="2050" w:type="dxa"/>
             <w:tcBorders/>
             <w:vAlign w:val="center"/>
           </w:tcPr>
           <w:p>
             <w:pPr>
               <w:pStyle w:val="Contenidodelatabla"/>
+              <w:widowControl w:val="false"/>
               <w:spacing w:before="0" w:after="200"/>
               <w:jc w:val="center"/>
               <w:rPr>
@@ -1357,7 +1610,27 @@
             </w:pPr>
             <w:r>
               <w:rPr>
+                <w:sz w:val="12"/>
+                <w:szCs w:val="12"/>
+              </w:rPr>
+            </w:r>
+          </w:p>
+          <w:p>
+            <w:pPr>
+              <w:pStyle w:val="Contenidodelatabla"/>
+              <w:widowControl w:val="false"/>
+              <w:spacing w:before="0" w:after="200"/>
+              <w:jc w:val="center"/>
+              <w:rPr>
+                <w:sz w:val="12"/>
+                <w:szCs w:val="12"/>
+              </w:rPr>
+            </w:pPr>
+            <w:r>
+              <w:rPr>
                 <w:rFonts w:ascii="Calibri" w:hAnsi="Calibri"/>
+                <w:sz w:val="12"/>
+                <w:szCs w:val="12"/>
               </w:rPr>
               <w:t>{{ant_apvc_no}}</w:t>
             </w:r>
@@ -1368,13 +1641,14 @@
         <w:trPr/>
         <w:tc>
           <w:tcPr>
-            <w:tcW w:w="7375" w:type="dxa"/>
+            <w:tcW w:w="5838" w:type="dxa"/>
             <w:tcBorders/>
             <w:vAlign w:val="center"/>
           </w:tcPr>
           <w:p>
             <w:pPr>
               <w:pStyle w:val="Contenidodelatabla"/>
+              <w:widowControl w:val="false"/>
               <w:spacing w:before="0" w:after="200"/>
               <w:jc w:val="left"/>
               <w:rPr>
@@ -1391,13 +1665,14 @@
         </w:tc>
         <w:tc>
           <w:tcPr>
-            <w:tcW w:w="613" w:type="dxa"/>
+            <w:tcW w:w="2037" w:type="dxa"/>
             <w:tcBorders/>
             <w:vAlign w:val="center"/>
           </w:tcPr>
           <w:p>
             <w:pPr>
               <w:pStyle w:val="Contenidodelatabla"/>
+              <w:widowControl w:val="false"/>
               <w:spacing w:before="0" w:after="200"/>
               <w:jc w:val="center"/>
               <w:rPr>
@@ -1406,7 +1681,27 @@
             </w:pPr>
             <w:r>
               <w:rPr>
+                <w:sz w:val="12"/>
+                <w:szCs w:val="12"/>
+              </w:rPr>
+            </w:r>
+          </w:p>
+          <w:p>
+            <w:pPr>
+              <w:pStyle w:val="Contenidodelatabla"/>
+              <w:widowControl w:val="false"/>
+              <w:spacing w:before="0" w:after="200"/>
+              <w:jc w:val="center"/>
+              <w:rPr>
+                <w:sz w:val="12"/>
+                <w:szCs w:val="12"/>
+              </w:rPr>
+            </w:pPr>
+            <w:r>
+              <w:rPr>
                 <w:rFonts w:ascii="Calibri" w:hAnsi="Calibri"/>
+                <w:sz w:val="12"/>
+                <w:szCs w:val="12"/>
               </w:rPr>
               <w:t>{{ant_cav_si}}</w:t>
             </w:r>
@@ -1414,13 +1709,14 @@
         </w:tc>
         <w:tc>
           <w:tcPr>
-            <w:tcW w:w="652" w:type="dxa"/>
+            <w:tcW w:w="2050" w:type="dxa"/>
             <w:tcBorders/>
             <w:vAlign w:val="center"/>
           </w:tcPr>
           <w:p>
             <w:pPr>
               <w:pStyle w:val="Contenidodelatabla"/>
+              <w:widowControl w:val="false"/>
               <w:spacing w:before="0" w:after="200"/>
               <w:jc w:val="center"/>
               <w:rPr>
@@ -1429,7 +1725,27 @@
             </w:pPr>
             <w:r>
               <w:rPr>
+                <w:sz w:val="12"/>
+                <w:szCs w:val="12"/>
+              </w:rPr>
+            </w:r>
+          </w:p>
+          <w:p>
+            <w:pPr>
+              <w:pStyle w:val="Contenidodelatabla"/>
+              <w:widowControl w:val="false"/>
+              <w:spacing w:before="0" w:after="200"/>
+              <w:jc w:val="center"/>
+              <w:rPr>
+                <w:sz w:val="12"/>
+                <w:szCs w:val="12"/>
+              </w:rPr>
+            </w:pPr>
+            <w:r>
+              <w:rPr>
                 <w:rFonts w:ascii="Calibri" w:hAnsi="Calibri"/>
+                <w:sz w:val="12"/>
+                <w:szCs w:val="12"/>
               </w:rPr>
               <w:t>{{ant_cav_no}}</w:t>
             </w:r>
@@ -1440,13 +1756,14 @@
         <w:trPr/>
         <w:tc>
           <w:tcPr>
-            <w:tcW w:w="7375" w:type="dxa"/>
+            <w:tcW w:w="5838" w:type="dxa"/>
             <w:tcBorders/>
             <w:vAlign w:val="center"/>
           </w:tcPr>
           <w:p>
             <w:pPr>
               <w:pStyle w:val="Contenidodelatabla"/>
+              <w:widowControl w:val="false"/>
               <w:spacing w:before="0" w:after="200"/>
               <w:jc w:val="left"/>
               <w:rPr>
@@ -1463,13 +1780,14 @@
         </w:tc>
         <w:tc>
           <w:tcPr>
-            <w:tcW w:w="613" w:type="dxa"/>
+            <w:tcW w:w="2037" w:type="dxa"/>
             <w:tcBorders/>
             <w:vAlign w:val="center"/>
           </w:tcPr>
           <w:p>
             <w:pPr>
               <w:pStyle w:val="Contenidodelatabla"/>
+              <w:widowControl w:val="false"/>
               <w:spacing w:before="0" w:after="200"/>
               <w:jc w:val="center"/>
               <w:rPr>
@@ -1478,7 +1796,27 @@
             </w:pPr>
             <w:r>
               <w:rPr>
+                <w:sz w:val="12"/>
+                <w:szCs w:val="12"/>
+              </w:rPr>
+            </w:r>
+          </w:p>
+          <w:p>
+            <w:pPr>
+              <w:pStyle w:val="Contenidodelatabla"/>
+              <w:widowControl w:val="false"/>
+              <w:spacing w:before="0" w:after="200"/>
+              <w:jc w:val="center"/>
+              <w:rPr>
+                <w:sz w:val="12"/>
+                <w:szCs w:val="12"/>
+              </w:rPr>
+            </w:pPr>
+            <w:r>
+              <w:rPr>
                 <w:rFonts w:ascii="Calibri" w:hAnsi="Calibri"/>
+                <w:sz w:val="12"/>
+                <w:szCs w:val="12"/>
               </w:rPr>
               <w:t>{{ant_depositos_si}}</w:t>
             </w:r>
@@ -1486,13 +1824,14 @@
         </w:tc>
         <w:tc>
           <w:tcPr>
-            <w:tcW w:w="652" w:type="dxa"/>
+            <w:tcW w:w="2050" w:type="dxa"/>
             <w:tcBorders/>
             <w:vAlign w:val="center"/>
           </w:tcPr>
           <w:p>
             <w:pPr>
               <w:pStyle w:val="Contenidodelatabla"/>
+              <w:widowControl w:val="false"/>
               <w:spacing w:before="0" w:after="200"/>
               <w:jc w:val="center"/>
               <w:rPr>
@@ -1501,7 +1840,27 @@
             </w:pPr>
             <w:r>
               <w:rPr>
+                <w:sz w:val="12"/>
+                <w:szCs w:val="12"/>
+              </w:rPr>
+            </w:r>
+          </w:p>
+          <w:p>
+            <w:pPr>
+              <w:pStyle w:val="Contenidodelatabla"/>
+              <w:widowControl w:val="false"/>
+              <w:spacing w:before="0" w:after="200"/>
+              <w:jc w:val="center"/>
+              <w:rPr>
+                <w:sz w:val="12"/>
+                <w:szCs w:val="12"/>
+              </w:rPr>
+            </w:pPr>
+            <w:r>
+              <w:rPr>
                 <w:rFonts w:ascii="Calibri" w:hAnsi="Calibri"/>
+                <w:sz w:val="12"/>
+                <w:szCs w:val="12"/>
               </w:rPr>
               <w:t>{{ant_depositos_no}}</w:t>
             </w:r>
@@ -1512,13 +1871,14 @@
         <w:trPr/>
         <w:tc>
           <w:tcPr>
-            <w:tcW w:w="7375" w:type="dxa"/>
+            <w:tcW w:w="5838" w:type="dxa"/>
             <w:tcBorders/>
             <w:vAlign w:val="center"/>
           </w:tcPr>
           <w:p>
             <w:pPr>
               <w:pStyle w:val="Contenidodelatabla"/>
+              <w:widowControl w:val="false"/>
               <w:spacing w:before="0" w:after="200"/>
               <w:jc w:val="left"/>
               <w:rPr>
@@ -1535,22 +1895,26 @@
         </w:tc>
         <w:tc>
           <w:tcPr>
-            <w:tcW w:w="613" w:type="dxa"/>
+            <w:tcW w:w="2037" w:type="dxa"/>
             <w:tcBorders/>
             <w:vAlign w:val="center"/>
           </w:tcPr>
           <w:p>
             <w:pPr>
               <w:pStyle w:val="Contenidodelatabla"/>
+              <w:widowControl w:val="false"/>
               <w:spacing w:before="0" w:after="200"/>
               <w:jc w:val="center"/>
               <w:rPr>
-                <w:rFonts w:ascii="Calibri" w:hAnsi="Calibri"/>
+                <w:sz w:val="12"/>
+                <w:szCs w:val="12"/>
               </w:rPr>
             </w:pPr>
             <w:r>
               <w:rPr>
                 <w:rFonts w:ascii="Calibri" w:hAnsi="Calibri"/>
+                <w:sz w:val="12"/>
+                <w:szCs w:val="12"/>
               </w:rPr>
               <w:t>{{ant_cesantia_si}}</w:t>
             </w:r>
@@ -1558,22 +1922,26 @@
         </w:tc>
         <w:tc>
           <w:tcPr>
-            <w:tcW w:w="652" w:type="dxa"/>
+            <w:tcW w:w="2050" w:type="dxa"/>
             <w:tcBorders/>
             <w:vAlign w:val="center"/>
           </w:tcPr>
           <w:p>
             <w:pPr>
               <w:pStyle w:val="Contenidodelatabla"/>
+              <w:widowControl w:val="false"/>
               <w:spacing w:before="0" w:after="200"/>
               <w:jc w:val="center"/>
               <w:rPr>
-                <w:rFonts w:ascii="Calibri" w:hAnsi="Calibri"/>
+                <w:sz w:val="12"/>
+                <w:szCs w:val="12"/>
               </w:rPr>
             </w:pPr>
             <w:r>
               <w:rPr>
                 <w:rFonts w:ascii="Calibri" w:hAnsi="Calibri"/>
+                <w:sz w:val="12"/>
+                <w:szCs w:val="12"/>
               </w:rPr>
               <w:t>{{ant_cesantia_no}}</w:t>
             </w:r>
@@ -1584,13 +1952,14 @@
         <w:trPr/>
         <w:tc>
           <w:tcPr>
-            <w:tcW w:w="7375" w:type="dxa"/>
+            <w:tcW w:w="5838" w:type="dxa"/>
             <w:tcBorders/>
             <w:vAlign w:val="center"/>
           </w:tcPr>
           <w:p>
             <w:pPr>
               <w:pStyle w:val="Contenidodelatabla"/>
+              <w:widowControl w:val="false"/>
               <w:spacing w:before="0" w:after="200"/>
               <w:jc w:val="left"/>
               <w:rPr>
@@ -1607,13 +1976,14 @@
         </w:tc>
         <w:tc>
           <w:tcPr>
-            <w:tcW w:w="613" w:type="dxa"/>
+            <w:tcW w:w="2037" w:type="dxa"/>
             <w:tcBorders/>
             <w:vAlign w:val="center"/>
           </w:tcPr>
           <w:p>
             <w:pPr>
               <w:pStyle w:val="Contenidodelatabla"/>
+              <w:widowControl w:val="false"/>
               <w:spacing w:before="0" w:after="200"/>
               <w:jc w:val="center"/>
               <w:rPr>
@@ -1622,7 +1992,27 @@
             </w:pPr>
             <w:r>
               <w:rPr>
+                <w:sz w:val="12"/>
+                <w:szCs w:val="12"/>
+              </w:rPr>
+            </w:r>
+          </w:p>
+          <w:p>
+            <w:pPr>
+              <w:pStyle w:val="Contenidodelatabla"/>
+              <w:widowControl w:val="false"/>
+              <w:spacing w:before="0" w:after="200"/>
+              <w:jc w:val="center"/>
+              <w:rPr>
+                <w:sz w:val="12"/>
+                <w:szCs w:val="12"/>
+              </w:rPr>
+            </w:pPr>
+            <w:r>
+              <w:rPr>
                 <w:rFonts w:ascii="Calibri" w:hAnsi="Calibri"/>
+                <w:sz w:val="12"/>
+                <w:szCs w:val="12"/>
               </w:rPr>
               <w:t>{{ant_otro_pais_si}}</w:t>
             </w:r>
@@ -1630,13 +2020,14 @@
         </w:tc>
         <w:tc>
           <w:tcPr>
-            <w:tcW w:w="652" w:type="dxa"/>
+            <w:tcW w:w="2050" w:type="dxa"/>
             <w:tcBorders/>
             <w:vAlign w:val="center"/>
           </w:tcPr>
           <w:p>
             <w:pPr>
               <w:pStyle w:val="Contenidodelatabla"/>
+              <w:widowControl w:val="false"/>
               <w:spacing w:before="0" w:after="200"/>
               <w:jc w:val="center"/>
               <w:rPr>
@@ -1645,7 +2036,27 @@
             </w:pPr>
             <w:r>
               <w:rPr>
+                <w:sz w:val="12"/>
+                <w:szCs w:val="12"/>
+              </w:rPr>
+            </w:r>
+          </w:p>
+          <w:p>
+            <w:pPr>
+              <w:pStyle w:val="Contenidodelatabla"/>
+              <w:widowControl w:val="false"/>
+              <w:spacing w:before="0" w:after="200"/>
+              <w:jc w:val="center"/>
+              <w:rPr>
+                <w:sz w:val="12"/>
+                <w:szCs w:val="12"/>
+              </w:rPr>
+            </w:pPr>
+            <w:r>
+              <w:rPr>
                 <w:rFonts w:ascii="Calibri" w:hAnsi="Calibri"/>
+                <w:sz w:val="12"/>
+                <w:szCs w:val="12"/>
               </w:rPr>
               <w:t>{{ant_otro_pais_no}}</w:t>
             </w:r>
@@ -1656,13 +2067,14 @@
         <w:trPr/>
         <w:tc>
           <w:tcPr>
-            <w:tcW w:w="7375" w:type="dxa"/>
+            <w:tcW w:w="5838" w:type="dxa"/>
             <w:tcBorders/>
             <w:vAlign w:val="center"/>
           </w:tcPr>
           <w:p>
             <w:pPr>
               <w:pStyle w:val="Contenidodelatabla"/>
+              <w:widowControl w:val="false"/>
               <w:spacing w:before="0" w:after="200"/>
               <w:jc w:val="left"/>
               <w:rPr>
@@ -1679,13 +2091,14 @@
         </w:tc>
         <w:tc>
           <w:tcPr>
-            <w:tcW w:w="613" w:type="dxa"/>
+            <w:tcW w:w="2037" w:type="dxa"/>
             <w:tcBorders/>
             <w:vAlign w:val="center"/>
           </w:tcPr>
           <w:p>
             <w:pPr>
               <w:pStyle w:val="Contenidodelatabla"/>
+              <w:widowControl w:val="false"/>
               <w:spacing w:before="0" w:after="200"/>
               <w:jc w:val="center"/>
               <w:rPr>
@@ -1694,7 +2107,27 @@
             </w:pPr>
             <w:r>
               <w:rPr>
+                <w:sz w:val="12"/>
+                <w:szCs w:val="12"/>
+              </w:rPr>
+            </w:r>
+          </w:p>
+          <w:p>
+            <w:pPr>
+              <w:pStyle w:val="Contenidodelatabla"/>
+              <w:widowControl w:val="false"/>
+              <w:spacing w:before="0" w:after="200"/>
+              <w:jc w:val="center"/>
+              <w:rPr>
+                <w:sz w:val="12"/>
+                <w:szCs w:val="12"/>
+              </w:rPr>
+            </w:pPr>
+            <w:r>
+              <w:rPr>
                 <w:rFonts w:ascii="Calibri" w:hAnsi="Calibri"/>
+                <w:sz w:val="12"/>
+                <w:szCs w:val="12"/>
               </w:rPr>
               <w:t>{{ant_residencia_si}}</w:t>
             </w:r>
@@ -1702,13 +2135,14 @@
         </w:tc>
         <w:tc>
           <w:tcPr>
-            <w:tcW w:w="652" w:type="dxa"/>
+            <w:tcW w:w="2050" w:type="dxa"/>
             <w:tcBorders/>
             <w:vAlign w:val="center"/>
           </w:tcPr>
           <w:p>
             <w:pPr>
               <w:pStyle w:val="Contenidodelatabla"/>
+              <w:widowControl w:val="false"/>
               <w:spacing w:before="0" w:after="200"/>
               <w:jc w:val="center"/>
               <w:rPr>
@@ -1717,7 +2151,27 @@
             </w:pPr>
             <w:r>
               <w:rPr>
+                <w:sz w:val="12"/>
+                <w:szCs w:val="12"/>
+              </w:rPr>
+            </w:r>
+          </w:p>
+          <w:p>
+            <w:pPr>
+              <w:pStyle w:val="Contenidodelatabla"/>
+              <w:widowControl w:val="false"/>
+              <w:spacing w:before="0" w:after="200"/>
+              <w:jc w:val="center"/>
+              <w:rPr>
+                <w:sz w:val="12"/>
+                <w:szCs w:val="12"/>
+              </w:rPr>
+            </w:pPr>
+            <w:r>
+              <w:rPr>
                 <w:rFonts w:ascii="Calibri" w:hAnsi="Calibri"/>
+                <w:sz w:val="12"/>
+                <w:szCs w:val="12"/>
               </w:rPr>
               <w:t>{{ant_residencia_no}}</w:t>
             </w:r>
@@ -1728,13 +2182,14 @@
         <w:trPr/>
         <w:tc>
           <w:tcPr>
-            <w:tcW w:w="7375" w:type="dxa"/>
+            <w:tcW w:w="5838" w:type="dxa"/>
             <w:tcBorders/>
             <w:vAlign w:val="center"/>
           </w:tcPr>
           <w:p>
             <w:pPr>
               <w:pStyle w:val="Contenidodelatabla"/>
+              <w:widowControl w:val="false"/>
               <w:spacing w:before="0" w:after="200"/>
               <w:jc w:val="left"/>
               <w:rPr>
@@ -1751,13 +2206,14 @@
         </w:tc>
         <w:tc>
           <w:tcPr>
-            <w:tcW w:w="613" w:type="dxa"/>
+            <w:tcW w:w="2037" w:type="dxa"/>
             <w:tcBorders/>
             <w:vAlign w:val="center"/>
           </w:tcPr>
           <w:p>
             <w:pPr>
               <w:pStyle w:val="Contenidodelatabla"/>
+              <w:widowControl w:val="false"/>
               <w:spacing w:before="0" w:after="200"/>
               <w:jc w:val="center"/>
               <w:rPr>
@@ -1766,7 +2222,27 @@
             </w:pPr>
             <w:r>
               <w:rPr>
+                <w:sz w:val="12"/>
+                <w:szCs w:val="12"/>
+              </w:rPr>
+            </w:r>
+          </w:p>
+          <w:p>
+            <w:pPr>
+              <w:pStyle w:val="Contenidodelatabla"/>
+              <w:widowControl w:val="false"/>
+              <w:spacing w:before="0" w:after="200"/>
+              <w:jc w:val="center"/>
+              <w:rPr>
+                <w:sz w:val="12"/>
+                <w:szCs w:val="12"/>
+              </w:rPr>
+            </w:pPr>
+            <w:r>
+              <w:rPr>
                 <w:rFonts w:ascii="Calibri" w:hAnsi="Calibri"/>
+                <w:sz w:val="12"/>
+                <w:szCs w:val="12"/>
               </w:rPr>
               <w:t>{{ant_fondo_si}}</w:t>
             </w:r>
@@ -1774,13 +2250,14 @@
         </w:tc>
         <w:tc>
           <w:tcPr>
-            <w:tcW w:w="652" w:type="dxa"/>
+            <w:tcW w:w="2050" w:type="dxa"/>
             <w:tcBorders/>
             <w:vAlign w:val="center"/>
           </w:tcPr>
           <w:p>
             <w:pPr>
               <w:pStyle w:val="Contenidodelatabla"/>
+              <w:widowControl w:val="false"/>
               <w:spacing w:before="0" w:after="200"/>
               <w:jc w:val="center"/>
               <w:rPr>
@@ -1789,7 +2266,27 @@
             </w:pPr>
             <w:r>
               <w:rPr>
+                <w:sz w:val="12"/>
+                <w:szCs w:val="12"/>
+              </w:rPr>
+            </w:r>
+          </w:p>
+          <w:p>
+            <w:pPr>
+              <w:pStyle w:val="Contenidodelatabla"/>
+              <w:widowControl w:val="false"/>
+              <w:spacing w:before="0" w:after="200"/>
+              <w:jc w:val="center"/>
+              <w:rPr>
+                <w:sz w:val="12"/>
+                <w:szCs w:val="12"/>
+              </w:rPr>
+            </w:pPr>
+            <w:r>
+              <w:rPr>
                 <w:rFonts w:ascii="Calibri" w:hAnsi="Calibri"/>
+                <w:sz w:val="12"/>
+                <w:szCs w:val="12"/>
               </w:rPr>
               <w:t>{{ant_fondo_no}}</w:t>
             </w:r>
@@ -1800,13 +2297,14 @@
         <w:trPr/>
         <w:tc>
           <w:tcPr>
-            <w:tcW w:w="7375" w:type="dxa"/>
+            <w:tcW w:w="5838" w:type="dxa"/>
             <w:tcBorders/>
             <w:vAlign w:val="center"/>
           </w:tcPr>
           <w:p>
             <w:pPr>
               <w:pStyle w:val="Contenidodelatabla"/>
+              <w:widowControl w:val="false"/>
               <w:spacing w:before="0" w:after="200"/>
               <w:jc w:val="left"/>
               <w:rPr>
@@ -1823,13 +2321,14 @@
         </w:tc>
         <w:tc>
           <w:tcPr>
-            <w:tcW w:w="613" w:type="dxa"/>
+            <w:tcW w:w="2037" w:type="dxa"/>
             <w:tcBorders/>
             <w:vAlign w:val="center"/>
           </w:tcPr>
           <w:p>
             <w:pPr>
               <w:pStyle w:val="Contenidodelatabla"/>
+              <w:widowControl w:val="false"/>
               <w:spacing w:before="0" w:after="200"/>
               <w:jc w:val="center"/>
               <w:rPr>
@@ -1838,7 +2337,27 @@
             </w:pPr>
             <w:r>
               <w:rPr>
+                <w:sz w:val="12"/>
+                <w:szCs w:val="12"/>
+              </w:rPr>
+            </w:r>
+          </w:p>
+          <w:p>
+            <w:pPr>
+              <w:pStyle w:val="Contenidodelatabla"/>
+              <w:widowControl w:val="false"/>
+              <w:spacing w:before="0" w:after="200"/>
+              <w:jc w:val="center"/>
+              <w:rPr>
+                <w:sz w:val="12"/>
+                <w:szCs w:val="12"/>
+              </w:rPr>
+            </w:pPr>
+            <w:r>
+              <w:rPr>
                 <w:rFonts w:ascii="Calibri" w:hAnsi="Calibri"/>
+                <w:sz w:val="12"/>
+                <w:szCs w:val="12"/>
               </w:rPr>
               <w:t>{{ant_listado_si}}</w:t>
             </w:r>
@@ -1846,13 +2365,14 @@
         </w:tc>
         <w:tc>
           <w:tcPr>
-            <w:tcW w:w="652" w:type="dxa"/>
+            <w:tcW w:w="2050" w:type="dxa"/>
             <w:tcBorders/>
             <w:vAlign w:val="center"/>
           </w:tcPr>
           <w:p>
             <w:pPr>
               <w:pStyle w:val="Contenidodelatabla"/>
+              <w:widowControl w:val="false"/>
               <w:spacing w:before="0" w:after="200"/>
               <w:jc w:val="center"/>
               <w:rPr>
@@ -1861,7 +2381,27 @@
             </w:pPr>
             <w:r>
               <w:rPr>
+                <w:sz w:val="12"/>
+                <w:szCs w:val="12"/>
+              </w:rPr>
+            </w:r>
+          </w:p>
+          <w:p>
+            <w:pPr>
+              <w:pStyle w:val="Contenidodelatabla"/>
+              <w:widowControl w:val="false"/>
+              <w:spacing w:before="0" w:after="200"/>
+              <w:jc w:val="center"/>
+              <w:rPr>
+                <w:sz w:val="12"/>
+                <w:szCs w:val="12"/>
+              </w:rPr>
+            </w:pPr>
+            <w:r>
+              <w:rPr>
                 <w:rFonts w:ascii="Calibri" w:hAnsi="Calibri"/>
+                <w:sz w:val="12"/>
+                <w:szCs w:val="12"/>
               </w:rPr>
               <w:t>{{ant_listado_no}}</w:t>
             </w:r>
@@ -1898,7 +2438,7 @@
     </w:p>
     <w:tbl>
       <w:tblPr>
-        <w:tblW w:w="5000" w:type="pct"/>
+        <w:tblW w:w="9925" w:type="dxa"/>
         <w:jc w:val="left"/>
         <w:tblInd w:w="0" w:type="dxa"/>
         <w:tblLayout w:type="fixed"/>
@@ -1910,21 +2450,22 @@
         </w:tblCellMar>
       </w:tblPr>
       <w:tblGrid>
-        <w:gridCol w:w="7375"/>
-        <w:gridCol w:w="613"/>
-        <w:gridCol w:w="652"/>
+        <w:gridCol w:w="6525"/>
+        <w:gridCol w:w="1588"/>
+        <w:gridCol w:w="1812"/>
       </w:tblGrid>
       <w:tr>
         <w:trPr/>
         <w:tc>
           <w:tcPr>
-            <w:tcW w:w="7375" w:type="dxa"/>
+            <w:tcW w:w="6525" w:type="dxa"/>
             <w:tcBorders/>
             <w:vAlign w:val="center"/>
           </w:tcPr>
           <w:p>
             <w:pPr>
               <w:pStyle w:val="Contenidodelatabla"/>
+              <w:widowControl w:val="false"/>
               <w:spacing w:before="0" w:after="200"/>
               <w:jc w:val="center"/>
               <w:rPr>
@@ -1940,13 +2481,14 @@
         </w:tc>
         <w:tc>
           <w:tcPr>
-            <w:tcW w:w="613" w:type="dxa"/>
+            <w:tcW w:w="1588" w:type="dxa"/>
             <w:tcBorders/>
             <w:vAlign w:val="center"/>
           </w:tcPr>
           <w:p>
             <w:pPr>
               <w:pStyle w:val="Contenidodelatabla"/>
+              <w:widowControl w:val="false"/>
               <w:spacing w:before="0" w:after="200"/>
               <w:jc w:val="center"/>
               <w:rPr>
@@ -1963,13 +2505,14 @@
         </w:tc>
         <w:tc>
           <w:tcPr>
-            <w:tcW w:w="652" w:type="dxa"/>
+            <w:tcW w:w="1812" w:type="dxa"/>
             <w:tcBorders/>
             <w:vAlign w:val="center"/>
           </w:tcPr>
           <w:p>
             <w:pPr>
               <w:pStyle w:val="Contenidodelatabla"/>
+              <w:widowControl w:val="false"/>
               <w:spacing w:before="0" w:after="200"/>
               <w:jc w:val="center"/>
               <w:rPr>
@@ -1989,13 +2532,14 @@
         <w:trPr/>
         <w:tc>
           <w:tcPr>
-            <w:tcW w:w="7375" w:type="dxa"/>
+            <w:tcW w:w="6525" w:type="dxa"/>
             <w:tcBorders/>
             <w:vAlign w:val="center"/>
           </w:tcPr>
           <w:p>
             <w:pPr>
               <w:pStyle w:val="Contenidodelatabla"/>
+              <w:widowControl w:val="false"/>
               <w:spacing w:before="0" w:after="200"/>
               <w:jc w:val="left"/>
               <w:rPr>
@@ -2012,22 +2556,26 @@
         </w:tc>
         <w:tc>
           <w:tcPr>
-            <w:tcW w:w="613" w:type="dxa"/>
+            <w:tcW w:w="1588" w:type="dxa"/>
             <w:tcBorders/>
             <w:vAlign w:val="center"/>
           </w:tcPr>
           <w:p>
             <w:pPr>
               <w:pStyle w:val="Contenidodelatabla"/>
+              <w:widowControl w:val="false"/>
               <w:spacing w:before="0" w:after="200"/>
               <w:jc w:val="center"/>
               <w:rPr>
-                <w:rFonts w:ascii="Calibri" w:hAnsi="Calibri"/>
+                <w:sz w:val="12"/>
+                <w:szCs w:val="12"/>
               </w:rPr>
             </w:pPr>
             <w:r>
               <w:rPr>
                 <w:rFonts w:ascii="Calibri" w:hAnsi="Calibri"/>
+                <w:sz w:val="12"/>
+                <w:szCs w:val="12"/>
               </w:rPr>
               <w:t>{{aut_bono_si}}</w:t>
             </w:r>
@@ -2035,22 +2583,26 @@
         </w:tc>
         <w:tc>
           <w:tcPr>
-            <w:tcW w:w="652" w:type="dxa"/>
+            <w:tcW w:w="1812" w:type="dxa"/>
             <w:tcBorders/>
             <w:vAlign w:val="center"/>
           </w:tcPr>
           <w:p>
             <w:pPr>
               <w:pStyle w:val="Contenidodelatabla"/>
+              <w:widowControl w:val="false"/>
               <w:spacing w:before="0" w:after="200"/>
               <w:jc w:val="center"/>
               <w:rPr>
-                <w:rFonts w:ascii="Calibri" w:hAnsi="Calibri"/>
+                <w:sz w:val="12"/>
+                <w:szCs w:val="12"/>
               </w:rPr>
             </w:pPr>
             <w:r>
               <w:rPr>
                 <w:rFonts w:ascii="Calibri" w:hAnsi="Calibri"/>
+                <w:sz w:val="12"/>
+                <w:szCs w:val="12"/>
               </w:rPr>
               <w:t>{{aut_bono_no}}</w:t>
             </w:r>
@@ -2061,13 +2613,14 @@
         <w:trPr/>
         <w:tc>
           <w:tcPr>
-            <w:tcW w:w="7375" w:type="dxa"/>
+            <w:tcW w:w="6525" w:type="dxa"/>
             <w:tcBorders/>
             <w:vAlign w:val="center"/>
           </w:tcPr>
           <w:p>
             <w:pPr>
               <w:pStyle w:val="Contenidodelatabla"/>
+              <w:widowControl w:val="false"/>
               <w:spacing w:before="0" w:after="200"/>
               <w:jc w:val="left"/>
               <w:rPr>
@@ -2084,22 +2637,26 @@
         </w:tc>
         <w:tc>
           <w:tcPr>
-            <w:tcW w:w="613" w:type="dxa"/>
+            <w:tcW w:w="1588" w:type="dxa"/>
             <w:tcBorders/>
             <w:vAlign w:val="center"/>
           </w:tcPr>
           <w:p>
             <w:pPr>
               <w:pStyle w:val="Contenidodelatabla"/>
+              <w:widowControl w:val="false"/>
               <w:spacing w:before="0" w:after="200"/>
               <w:jc w:val="center"/>
               <w:rPr>
-                <w:rFonts w:ascii="Calibri" w:hAnsi="Calibri"/>
+                <w:sz w:val="12"/>
+                <w:szCs w:val="12"/>
               </w:rPr>
             </w:pPr>
             <w:r>
               <w:rPr>
                 <w:rFonts w:ascii="Calibri" w:hAnsi="Calibri"/>
+                <w:sz w:val="12"/>
+                <w:szCs w:val="12"/>
               </w:rPr>
               <w:t>{{aut_estado_si}}</w:t>
             </w:r>
@@ -2107,22 +2664,26 @@
         </w:tc>
         <w:tc>
           <w:tcPr>
-            <w:tcW w:w="652" w:type="dxa"/>
+            <w:tcW w:w="1812" w:type="dxa"/>
             <w:tcBorders/>
             <w:vAlign w:val="center"/>
           </w:tcPr>
           <w:p>
             <w:pPr>
               <w:pStyle w:val="Contenidodelatabla"/>
+              <w:widowControl w:val="false"/>
               <w:spacing w:before="0" w:after="200"/>
               <w:jc w:val="center"/>
               <w:rPr>
-                <w:rFonts w:ascii="Calibri" w:hAnsi="Calibri"/>
+                <w:sz w:val="12"/>
+                <w:szCs w:val="12"/>
               </w:rPr>
             </w:pPr>
             <w:r>
               <w:rPr>
                 <w:rFonts w:ascii="Calibri" w:hAnsi="Calibri"/>
+                <w:sz w:val="12"/>
+                <w:szCs w:val="12"/>
               </w:rPr>
               <w:t>{{aut_estado_no}}</w:t>
             </w:r>
@@ -2133,13 +2694,14 @@
         <w:trPr/>
         <w:tc>
           <w:tcPr>
-            <w:tcW w:w="7375" w:type="dxa"/>
+            <w:tcW w:w="6525" w:type="dxa"/>
             <w:tcBorders/>
             <w:vAlign w:val="center"/>
           </w:tcPr>
           <w:p>
             <w:pPr>
               <w:pStyle w:val="Contenidodelatabla"/>
+              <w:widowControl w:val="false"/>
               <w:spacing w:before="0" w:after="200"/>
               <w:jc w:val="left"/>
               <w:rPr>
@@ -2156,22 +2718,26 @@
         </w:tc>
         <w:tc>
           <w:tcPr>
-            <w:tcW w:w="613" w:type="dxa"/>
+            <w:tcW w:w="1588" w:type="dxa"/>
             <w:tcBorders/>
             <w:vAlign w:val="center"/>
           </w:tcPr>
           <w:p>
             <w:pPr>
               <w:pStyle w:val="Contenidodelatabla"/>
+              <w:widowControl w:val="false"/>
               <w:spacing w:before="0" w:after="200"/>
               <w:jc w:val="center"/>
               <w:rPr>
-                <w:rFonts w:ascii="Calibri" w:hAnsi="Calibri"/>
+                <w:sz w:val="12"/>
+                <w:szCs w:val="12"/>
               </w:rPr>
             </w:pPr>
             <w:r>
               <w:rPr>
                 <w:rFonts w:ascii="Calibri" w:hAnsi="Calibri"/>
+                <w:sz w:val="12"/>
+                <w:szCs w:val="12"/>
               </w:rPr>
               <w:t>{{aut_certificado_si}}</w:t>
             </w:r>
@@ -2179,22 +2745,26 @@
         </w:tc>
         <w:tc>
           <w:tcPr>
-            <w:tcW w:w="652" w:type="dxa"/>
+            <w:tcW w:w="1812" w:type="dxa"/>
             <w:tcBorders/>
             <w:vAlign w:val="center"/>
           </w:tcPr>
           <w:p>
             <w:pPr>
               <w:pStyle w:val="Contenidodelatabla"/>
+              <w:widowControl w:val="false"/>
               <w:spacing w:before="0" w:after="200"/>
               <w:jc w:val="center"/>
               <w:rPr>
-                <w:rFonts w:ascii="Calibri" w:hAnsi="Calibri"/>
+                <w:sz w:val="12"/>
+                <w:szCs w:val="12"/>
               </w:rPr>
             </w:pPr>
             <w:r>
               <w:rPr>
                 <w:rFonts w:ascii="Calibri" w:hAnsi="Calibri"/>
+                <w:sz w:val="12"/>
+                <w:szCs w:val="12"/>
               </w:rPr>
               <w:t>{{aut_certificado_no}}</w:t>
             </w:r>
@@ -2205,13 +2775,14 @@
         <w:trPr/>
         <w:tc>
           <w:tcPr>
-            <w:tcW w:w="7375" w:type="dxa"/>
+            <w:tcW w:w="6525" w:type="dxa"/>
             <w:tcBorders/>
             <w:vAlign w:val="center"/>
           </w:tcPr>
           <w:p>
             <w:pPr>
               <w:pStyle w:val="Contenidodelatabla"/>
+              <w:widowControl w:val="false"/>
               <w:spacing w:before="0" w:after="200"/>
               <w:jc w:val="left"/>
               <w:rPr>
@@ -2228,22 +2799,26 @@
         </w:tc>
         <w:tc>
           <w:tcPr>
-            <w:tcW w:w="613" w:type="dxa"/>
+            <w:tcW w:w="1588" w:type="dxa"/>
             <w:tcBorders/>
             <w:vAlign w:val="center"/>
           </w:tcPr>
           <w:p>
             <w:pPr>
               <w:pStyle w:val="Contenidodelatabla"/>
+              <w:widowControl w:val="false"/>
               <w:spacing w:before="0" w:after="200"/>
               <w:jc w:val="center"/>
               <w:rPr>
-                <w:rFonts w:ascii="Calibri" w:hAnsi="Calibri"/>
+                <w:sz w:val="12"/>
+                <w:szCs w:val="12"/>
               </w:rPr>
             </w:pPr>
             <w:r>
               <w:rPr>
                 <w:rFonts w:ascii="Calibri" w:hAnsi="Calibri"/>
+                <w:sz w:val="12"/>
+                <w:szCs w:val="12"/>
               </w:rPr>
               <w:t>{{aut_destino_si}}</w:t>
             </w:r>
@@ -2251,22 +2826,26 @@
         </w:tc>
         <w:tc>
           <w:tcPr>
-            <w:tcW w:w="652" w:type="dxa"/>
+            <w:tcW w:w="1812" w:type="dxa"/>
             <w:tcBorders/>
             <w:vAlign w:val="center"/>
           </w:tcPr>
           <w:p>
             <w:pPr>
               <w:pStyle w:val="Contenidodelatabla"/>
+              <w:widowControl w:val="false"/>
               <w:spacing w:before="0" w:after="200"/>
               <w:jc w:val="center"/>
               <w:rPr>
-                <w:rFonts w:ascii="Calibri" w:hAnsi="Calibri"/>
+                <w:sz w:val="12"/>
+                <w:szCs w:val="12"/>
               </w:rPr>
             </w:pPr>
             <w:r>
               <w:rPr>
                 <w:rFonts w:ascii="Calibri" w:hAnsi="Calibri"/>
+                <w:sz w:val="12"/>
+                <w:szCs w:val="12"/>
               </w:rPr>
               <w:t>{{aut_destino_no}}</w:t>
             </w:r>
@@ -2277,13 +2856,14 @@
         <w:trPr/>
         <w:tc>
           <w:tcPr>
-            <w:tcW w:w="7375" w:type="dxa"/>
+            <w:tcW w:w="6525" w:type="dxa"/>
             <w:tcBorders/>
             <w:vAlign w:val="center"/>
           </w:tcPr>
           <w:p>
             <w:pPr>
               <w:pStyle w:val="Contenidodelatabla"/>
+              <w:widowControl w:val="false"/>
               <w:spacing w:before="0" w:after="200"/>
               <w:jc w:val="left"/>
               <w:rPr>
@@ -2300,22 +2880,26 @@
         </w:tc>
         <w:tc>
           <w:tcPr>
-            <w:tcW w:w="613" w:type="dxa"/>
+            <w:tcW w:w="1588" w:type="dxa"/>
             <w:tcBorders/>
             <w:vAlign w:val="center"/>
           </w:tcPr>
           <w:p>
             <w:pPr>
               <w:pStyle w:val="Contenidodelatabla"/>
+              <w:widowControl w:val="false"/>
               <w:spacing w:before="0" w:after="200"/>
               <w:jc w:val="center"/>
               <w:rPr>
-                <w:rFonts w:ascii="Calibri" w:hAnsi="Calibri"/>
+                <w:sz w:val="12"/>
+                <w:szCs w:val="12"/>
               </w:rPr>
             </w:pPr>
             <w:r>
               <w:rPr>
                 <w:rFonts w:ascii="Calibri" w:hAnsi="Calibri"/>
+                <w:sz w:val="12"/>
+                <w:szCs w:val="12"/>
               </w:rPr>
               <w:t>{{aut_transferencia_si}}</w:t>
             </w:r>
@@ -2323,22 +2907,26 @@
         </w:tc>
         <w:tc>
           <w:tcPr>
-            <w:tcW w:w="652" w:type="dxa"/>
+            <w:tcW w:w="1812" w:type="dxa"/>
             <w:tcBorders/>
             <w:vAlign w:val="center"/>
           </w:tcPr>
           <w:p>
             <w:pPr>
               <w:pStyle w:val="Contenidodelatabla"/>
+              <w:widowControl w:val="false"/>
               <w:spacing w:before="0" w:after="200"/>
               <w:jc w:val="center"/>
               <w:rPr>
-                <w:rFonts w:ascii="Calibri" w:hAnsi="Calibri"/>
+                <w:sz w:val="12"/>
+                <w:szCs w:val="12"/>
               </w:rPr>
             </w:pPr>
             <w:r>
               <w:rPr>
                 <w:rFonts w:ascii="Calibri" w:hAnsi="Calibri"/>
+                <w:sz w:val="12"/>
+                <w:szCs w:val="12"/>
               </w:rPr>
               <w:t>{{aut_transferencia_no}}</w:t>
             </w:r>
@@ -2349,13 +2937,14 @@
         <w:trPr/>
         <w:tc>
           <w:tcPr>
-            <w:tcW w:w="7375" w:type="dxa"/>
+            <w:tcW w:w="6525" w:type="dxa"/>
             <w:tcBorders/>
             <w:vAlign w:val="center"/>
           </w:tcPr>
           <w:p>
             <w:pPr>
               <w:pStyle w:val="Contenidodelatabla"/>
+              <w:widowControl w:val="false"/>
               <w:spacing w:before="0" w:after="200"/>
               <w:jc w:val="left"/>
               <w:rPr>
@@ -2372,22 +2961,26 @@
         </w:tc>
         <w:tc>
           <w:tcPr>
-            <w:tcW w:w="613" w:type="dxa"/>
+            <w:tcW w:w="1588" w:type="dxa"/>
             <w:tcBorders/>
             <w:vAlign w:val="center"/>
           </w:tcPr>
           <w:p>
             <w:pPr>
               <w:pStyle w:val="Contenidodelatabla"/>
+              <w:widowControl w:val="false"/>
               <w:spacing w:before="0" w:after="200"/>
               <w:jc w:val="center"/>
               <w:rPr>
-                <w:rFonts w:ascii="Calibri" w:hAnsi="Calibri"/>
+                <w:sz w:val="12"/>
+                <w:szCs w:val="12"/>
               </w:rPr>
             </w:pPr>
             <w:r>
               <w:rPr>
                 <w:rFonts w:ascii="Calibri" w:hAnsi="Calibri"/>
+                <w:sz w:val="12"/>
+                <w:szCs w:val="12"/>
               </w:rPr>
               <w:t>{{aut_seleccion_apv_si}}</w:t>
             </w:r>
@@ -2395,22 +2988,26 @@
         </w:tc>
         <w:tc>
           <w:tcPr>
-            <w:tcW w:w="652" w:type="dxa"/>
+            <w:tcW w:w="1812" w:type="dxa"/>
             <w:tcBorders/>
             <w:vAlign w:val="center"/>
           </w:tcPr>
           <w:p>
             <w:pPr>
               <w:pStyle w:val="Contenidodelatabla"/>
+              <w:widowControl w:val="false"/>
               <w:spacing w:before="0" w:after="200"/>
               <w:jc w:val="center"/>
               <w:rPr>
-                <w:rFonts w:ascii="Calibri" w:hAnsi="Calibri"/>
+                <w:sz w:val="12"/>
+                <w:szCs w:val="12"/>
               </w:rPr>
             </w:pPr>
             <w:r>
               <w:rPr>
                 <w:rFonts w:ascii="Calibri" w:hAnsi="Calibri"/>
+                <w:sz w:val="12"/>
+                <w:szCs w:val="12"/>
               </w:rPr>
               <w:t>{{aut_seleccion_apv_no}}</w:t>
             </w:r>
@@ -2421,13 +3018,14 @@
         <w:trPr/>
         <w:tc>
           <w:tcPr>
-            <w:tcW w:w="7375" w:type="dxa"/>
+            <w:tcW w:w="6525" w:type="dxa"/>
             <w:tcBorders/>
             <w:vAlign w:val="center"/>
           </w:tcPr>
           <w:p>
             <w:pPr>
               <w:pStyle w:val="Contenidodelatabla"/>
+              <w:widowControl w:val="false"/>
               <w:spacing w:before="0" w:after="200"/>
               <w:jc w:val="left"/>
               <w:rPr>
@@ -2444,22 +3042,26 @@
         </w:tc>
         <w:tc>
           <w:tcPr>
-            <w:tcW w:w="613" w:type="dxa"/>
+            <w:tcW w:w="1588" w:type="dxa"/>
             <w:tcBorders/>
             <w:vAlign w:val="center"/>
           </w:tcPr>
           <w:p>
             <w:pPr>
               <w:pStyle w:val="Contenidodelatabla"/>
+              <w:widowControl w:val="false"/>
               <w:spacing w:before="0" w:after="200"/>
               <w:jc w:val="center"/>
               <w:rPr>
-                <w:rFonts w:ascii="Calibri" w:hAnsi="Calibri"/>
+                <w:sz w:val="12"/>
+                <w:szCs w:val="12"/>
               </w:rPr>
             </w:pPr>
             <w:r>
               <w:rPr>
                 <w:rFonts w:ascii="Calibri" w:hAnsi="Calibri"/>
+                <w:sz w:val="12"/>
+                <w:szCs w:val="12"/>
               </w:rPr>
               <w:t>{{aut_modalidad_si}}</w:t>
             </w:r>
@@ -2467,22 +3069,26 @@
         </w:tc>
         <w:tc>
           <w:tcPr>
-            <w:tcW w:w="652" w:type="dxa"/>
+            <w:tcW w:w="1812" w:type="dxa"/>
             <w:tcBorders/>
             <w:vAlign w:val="center"/>
           </w:tcPr>
           <w:p>
             <w:pPr>
               <w:pStyle w:val="Contenidodelatabla"/>
+              <w:widowControl w:val="false"/>
               <w:spacing w:before="0" w:after="200"/>
               <w:jc w:val="center"/>
               <w:rPr>
-                <w:rFonts w:ascii="Calibri" w:hAnsi="Calibri"/>
+                <w:sz w:val="12"/>
+                <w:szCs w:val="12"/>
               </w:rPr>
             </w:pPr>
             <w:r>
               <w:rPr>
                 <w:rFonts w:ascii="Calibri" w:hAnsi="Calibri"/>
+                <w:sz w:val="12"/>
+                <w:szCs w:val="12"/>
               </w:rPr>
               <w:t>{{aut_modalidad_no}}</w:t>
             </w:r>
@@ -2493,13 +3099,14 @@
         <w:trPr/>
         <w:tc>
           <w:tcPr>
-            <w:tcW w:w="7375" w:type="dxa"/>
+            <w:tcW w:w="6525" w:type="dxa"/>
             <w:tcBorders/>
             <w:vAlign w:val="center"/>
           </w:tcPr>
           <w:p>
             <w:pPr>
               <w:pStyle w:val="Contenidodelatabla"/>
+              <w:widowControl w:val="false"/>
               <w:spacing w:before="0" w:after="200"/>
               <w:jc w:val="left"/>
               <w:rPr>
@@ -2516,22 +3123,26 @@
         </w:tc>
         <w:tc>
           <w:tcPr>
-            <w:tcW w:w="613" w:type="dxa"/>
+            <w:tcW w:w="1588" w:type="dxa"/>
             <w:tcBorders/>
             <w:vAlign w:val="center"/>
           </w:tcPr>
           <w:p>
             <w:pPr>
               <w:pStyle w:val="Contenidodelatabla"/>
+              <w:widowControl w:val="false"/>
               <w:spacing w:before="0" w:after="200"/>
               <w:jc w:val="center"/>
               <w:rPr>
-                <w:rFonts w:ascii="Calibri" w:hAnsi="Calibri"/>
+                <w:sz w:val="12"/>
+                <w:szCs w:val="12"/>
               </w:rPr>
             </w:pPr>
             <w:r>
               <w:rPr>
                 <w:rFonts w:ascii="Calibri" w:hAnsi="Calibri"/>
+                <w:sz w:val="12"/>
+                <w:szCs w:val="12"/>
               </w:rPr>
               <w:t>{{aut_excedente_si}}</w:t>
             </w:r>
@@ -2539,22 +3150,26 @@
         </w:tc>
         <w:tc>
           <w:tcPr>
-            <w:tcW w:w="652" w:type="dxa"/>
+            <w:tcW w:w="1812" w:type="dxa"/>
             <w:tcBorders/>
             <w:vAlign w:val="center"/>
           </w:tcPr>
           <w:p>
             <w:pPr>
               <w:pStyle w:val="Contenidodelatabla"/>
+              <w:widowControl w:val="false"/>
               <w:spacing w:before="0" w:after="200"/>
               <w:jc w:val="center"/>
               <w:rPr>
-                <w:rFonts w:ascii="Calibri" w:hAnsi="Calibri"/>
+                <w:sz w:val="12"/>
+                <w:szCs w:val="12"/>
               </w:rPr>
             </w:pPr>
             <w:r>
               <w:rPr>
                 <w:rFonts w:ascii="Calibri" w:hAnsi="Calibri"/>
+                <w:sz w:val="12"/>
+                <w:szCs w:val="12"/>
               </w:rPr>
               <w:t>{{aut_excedente_no}}</w:t>
             </w:r>
@@ -2565,13 +3180,14 @@
         <w:trPr/>
         <w:tc>
           <w:tcPr>
-            <w:tcW w:w="7375" w:type="dxa"/>
+            <w:tcW w:w="6525" w:type="dxa"/>
             <w:tcBorders/>
             <w:vAlign w:val="center"/>
           </w:tcPr>
           <w:p>
             <w:pPr>
               <w:pStyle w:val="Contenidodelatabla"/>
+              <w:widowControl w:val="false"/>
               <w:spacing w:before="0" w:after="200"/>
               <w:jc w:val="left"/>
               <w:rPr>
@@ -2588,22 +3204,26 @@
         </w:tc>
         <w:tc>
           <w:tcPr>
-            <w:tcW w:w="613" w:type="dxa"/>
+            <w:tcW w:w="1588" w:type="dxa"/>
             <w:tcBorders/>
             <w:vAlign w:val="center"/>
           </w:tcPr>
           <w:p>
             <w:pPr>
               <w:pStyle w:val="Contenidodelatabla"/>
+              <w:widowControl w:val="false"/>
               <w:spacing w:before="0" w:after="200"/>
               <w:jc w:val="center"/>
               <w:rPr>
-                <w:rFonts w:ascii="Calibri" w:hAnsi="Calibri"/>
+                <w:sz w:val="12"/>
+                <w:szCs w:val="12"/>
               </w:rPr>
             </w:pPr>
             <w:r>
               <w:rPr>
                 <w:rFonts w:ascii="Calibri" w:hAnsi="Calibri"/>
+                <w:sz w:val="12"/>
+                <w:szCs w:val="12"/>
               </w:rPr>
               <w:t>{{aut_valor_nominal_si}}</w:t>
             </w:r>
@@ -2611,22 +3231,26 @@
         </w:tc>
         <w:tc>
           <w:tcPr>
-            <w:tcW w:w="652" w:type="dxa"/>
+            <w:tcW w:w="1812" w:type="dxa"/>
             <w:tcBorders/>
             <w:vAlign w:val="center"/>
           </w:tcPr>
           <w:p>
             <w:pPr>
               <w:pStyle w:val="Contenidodelatabla"/>
+              <w:widowControl w:val="false"/>
               <w:spacing w:before="0" w:after="200"/>
               <w:jc w:val="center"/>
               <w:rPr>
-                <w:rFonts w:ascii="Calibri" w:hAnsi="Calibri"/>
+                <w:sz w:val="12"/>
+                <w:szCs w:val="12"/>
               </w:rPr>
             </w:pPr>
             <w:r>
               <w:rPr>
                 <w:rFonts w:ascii="Calibri" w:hAnsi="Calibri"/>
+                <w:sz w:val="12"/>
+                <w:szCs w:val="12"/>
               </w:rPr>
               <w:t>{{aut_valor_nominal_no}}</w:t>
             </w:r>
@@ -2650,9 +3274,8 @@
     <w:p>
       <w:pPr>
         <w:pStyle w:val="Normal"/>
-        <w:rPr>
-          <w:rFonts w:ascii="Calibri" w:hAnsi="Calibri"/>
-        </w:rPr>
+        <w:jc w:val="both"/>
+        <w:rPr/>
       </w:pPr>
       <w:r>
         <w:rPr>
@@ -2664,9 +3287,8 @@
     <w:p>
       <w:pPr>
         <w:pStyle w:val="Normal"/>
-        <w:rPr>
-          <w:rFonts w:ascii="Calibri" w:hAnsi="Calibri"/>
-        </w:rPr>
+        <w:jc w:val="both"/>
+        <w:rPr/>
       </w:pPr>
       <w:r>
         <w:rPr>
@@ -2688,6 +3310,52 @@
           <w:rFonts w:ascii="Calibri" w:hAnsi="Calibri"/>
         </w:rPr>
         <w:br/>
+      </w:r>
+    </w:p>
+    <w:p>
+      <w:pPr>
+        <w:pStyle w:val="Normal"/>
+        <w:rPr>
+          <w:rFonts w:ascii="Calibri" w:hAnsi="Calibri"/>
+        </w:rPr>
+      </w:pPr>
+      <w:r>
+        <w:rPr/>
+      </w:r>
+    </w:p>
+    <w:p>
+      <w:pPr>
+        <w:pStyle w:val="Normal"/>
+        <w:rPr>
+          <w:rFonts w:ascii="Calibri" w:hAnsi="Calibri"/>
+        </w:rPr>
+      </w:pPr>
+      <w:r>
+        <w:rPr/>
+      </w:r>
+    </w:p>
+    <w:p>
+      <w:pPr>
+        <w:pStyle w:val="Normal"/>
+        <w:rPr>
+          <w:rFonts w:ascii="Calibri" w:hAnsi="Calibri"/>
+        </w:rPr>
+      </w:pPr>
+      <w:r>
+        <w:rPr/>
+      </w:r>
+    </w:p>
+    <w:p>
+      <w:pPr>
+        <w:pStyle w:val="Normal"/>
+        <w:rPr>
+          <w:rFonts w:ascii="Calibri" w:hAnsi="Calibri"/>
+        </w:rPr>
+      </w:pPr>
+      <w:r>
+        <w:rPr>
+          <w:rFonts w:ascii="Calibri" w:hAnsi="Calibri"/>
+        </w:rPr>
         <w:br/>
       </w:r>
     </w:p>
@@ -2844,6 +3512,7 @@
         </w:tabs>
         <w:ind w:left="1080" w:hanging="360"/>
       </w:pPr>
+      <w:rPr/>
     </w:lvl>
     <w:lvl w:ilvl="2">
       <w:start w:val="1"/>
@@ -2856,6 +3525,7 @@
         </w:tabs>
         <w:ind w:left="1440" w:hanging="360"/>
       </w:pPr>
+      <w:rPr/>
     </w:lvl>
     <w:lvl w:ilvl="3">
       <w:start w:val="1"/>
@@ -2868,6 +3538,7 @@
         </w:tabs>
         <w:ind w:left="1800" w:hanging="360"/>
       </w:pPr>
+      <w:rPr/>
     </w:lvl>
     <w:lvl w:ilvl="4">
       <w:start w:val="1"/>
@@ -2880,6 +3551,7 @@
         </w:tabs>
         <w:ind w:left="2160" w:hanging="360"/>
       </w:pPr>
+      <w:rPr/>
     </w:lvl>
     <w:lvl w:ilvl="5">
       <w:start w:val="1"/>
@@ -2892,6 +3564,7 @@
         </w:tabs>
         <w:ind w:left="2520" w:hanging="360"/>
       </w:pPr>
+      <w:rPr/>
     </w:lvl>
     <w:lvl w:ilvl="6">
       <w:start w:val="1"/>
@@ -2904,6 +3577,7 @@
         </w:tabs>
         <w:ind w:left="2880" w:hanging="360"/>
       </w:pPr>
+      <w:rPr/>
     </w:lvl>
     <w:lvl w:ilvl="7">
       <w:start w:val="1"/>
@@ -2916,6 +3590,7 @@
         </w:tabs>
         <w:ind w:left="3240" w:hanging="360"/>
       </w:pPr>
+      <w:rPr/>
     </w:lvl>
     <w:lvl w:ilvl="8">
       <w:start w:val="1"/>
@@ -2928,6 +3603,7 @@
         </w:tabs>
         <w:ind w:left="3600" w:hanging="360"/>
       </w:pPr>
+      <w:rPr/>
     </w:lvl>
   </w:abstractNum>
   <w:abstractNum w:abstractNumId="2">
@@ -2957,6 +3633,7 @@
         </w:tabs>
         <w:ind w:left="1080" w:hanging="360"/>
       </w:pPr>
+      <w:rPr/>
     </w:lvl>
     <w:lvl w:ilvl="2">
       <w:start w:val="1"/>
@@ -2969,6 +3646,7 @@
         </w:tabs>
         <w:ind w:left="1440" w:hanging="360"/>
       </w:pPr>
+      <w:rPr/>
     </w:lvl>
     <w:lvl w:ilvl="3">
       <w:start w:val="1"/>
@@ -2981,6 +3659,7 @@
         </w:tabs>
         <w:ind w:left="1800" w:hanging="360"/>
       </w:pPr>
+      <w:rPr/>
     </w:lvl>
     <w:lvl w:ilvl="4">
       <w:start w:val="1"/>
@@ -2993,6 +3672,7 @@
         </w:tabs>
         <w:ind w:left="2160" w:hanging="360"/>
       </w:pPr>
+      <w:rPr/>
     </w:lvl>
     <w:lvl w:ilvl="5">
       <w:start w:val="1"/>
@@ -3005,6 +3685,7 @@
         </w:tabs>
         <w:ind w:left="2520" w:hanging="360"/>
       </w:pPr>
+      <w:rPr/>
     </w:lvl>
     <w:lvl w:ilvl="6">
       <w:start w:val="1"/>
@@ -3017,6 +3698,7 @@
         </w:tabs>
         <w:ind w:left="2880" w:hanging="360"/>
       </w:pPr>
+      <w:rPr/>
     </w:lvl>
     <w:lvl w:ilvl="7">
       <w:start w:val="1"/>
@@ -3029,6 +3711,7 @@
         </w:tabs>
         <w:ind w:left="3240" w:hanging="360"/>
       </w:pPr>
+      <w:rPr/>
     </w:lvl>
     <w:lvl w:ilvl="8">
       <w:start w:val="1"/>
@@ -3041,6 +3724,7 @@
         </w:tabs>
         <w:ind w:left="3600" w:hanging="360"/>
       </w:pPr>
+      <w:rPr/>
     </w:lvl>
   </w:abstractNum>
   <w:abstractNum w:abstractNumId="3">
@@ -3070,6 +3754,7 @@
         </w:tabs>
         <w:ind w:left="1080" w:hanging="360"/>
       </w:pPr>
+      <w:rPr/>
     </w:lvl>
     <w:lvl w:ilvl="2">
       <w:start w:val="1"/>
@@ -3082,6 +3767,7 @@
         </w:tabs>
         <w:ind w:left="1440" w:hanging="360"/>
       </w:pPr>
+      <w:rPr/>
     </w:lvl>
     <w:lvl w:ilvl="3">
       <w:start w:val="1"/>
@@ -3094,6 +3780,7 @@
         </w:tabs>
         <w:ind w:left="1800" w:hanging="360"/>
       </w:pPr>
+      <w:rPr/>
     </w:lvl>
     <w:lvl w:ilvl="4">
       <w:start w:val="1"/>
@@ -3106,6 +3793,7 @@
         </w:tabs>
         <w:ind w:left="2160" w:hanging="360"/>
       </w:pPr>
+      <w:rPr/>
     </w:lvl>
     <w:lvl w:ilvl="5">
       <w:start w:val="1"/>
@@ -3118,6 +3806,7 @@
         </w:tabs>
         <w:ind w:left="2520" w:hanging="360"/>
       </w:pPr>
+      <w:rPr/>
     </w:lvl>
     <w:lvl w:ilvl="6">
       <w:start w:val="1"/>
@@ -3130,6 +3819,7 @@
         </w:tabs>
         <w:ind w:left="2880" w:hanging="360"/>
       </w:pPr>
+      <w:rPr/>
     </w:lvl>
     <w:lvl w:ilvl="7">
       <w:start w:val="1"/>
@@ -3142,6 +3832,7 @@
         </w:tabs>
         <w:ind w:left="3240" w:hanging="360"/>
       </w:pPr>
+      <w:rPr/>
     </w:lvl>
     <w:lvl w:ilvl="8">
       <w:start w:val="1"/>
@@ -3154,6 +3845,7 @@
         </w:tabs>
         <w:ind w:left="3600" w:hanging="360"/>
       </w:pPr>
+      <w:rPr/>
     </w:lvl>
   </w:abstractNum>
   <w:abstractNum w:abstractNumId="4">
@@ -3181,6 +3873,7 @@
         </w:tabs>
         <w:ind w:left="1080" w:hanging="360"/>
       </w:pPr>
+      <w:rPr/>
     </w:lvl>
     <w:lvl w:ilvl="2">
       <w:start w:val="1"/>
@@ -3193,6 +3886,7 @@
         </w:tabs>
         <w:ind w:left="1440" w:hanging="360"/>
       </w:pPr>
+      <w:rPr/>
     </w:lvl>
     <w:lvl w:ilvl="3">
       <w:start w:val="1"/>
@@ -3205,6 +3899,7 @@
         </w:tabs>
         <w:ind w:left="1800" w:hanging="360"/>
       </w:pPr>
+      <w:rPr/>
     </w:lvl>
     <w:lvl w:ilvl="4">
       <w:start w:val="1"/>
@@ -3217,6 +3912,7 @@
         </w:tabs>
         <w:ind w:left="2160" w:hanging="360"/>
       </w:pPr>
+      <w:rPr/>
     </w:lvl>
     <w:lvl w:ilvl="5">
       <w:start w:val="1"/>
@@ -3229,6 +3925,7 @@
         </w:tabs>
         <w:ind w:left="2520" w:hanging="360"/>
       </w:pPr>
+      <w:rPr/>
     </w:lvl>
     <w:lvl w:ilvl="6">
       <w:start w:val="1"/>
@@ -3241,6 +3938,7 @@
         </w:tabs>
         <w:ind w:left="2880" w:hanging="360"/>
       </w:pPr>
+      <w:rPr/>
     </w:lvl>
     <w:lvl w:ilvl="7">
       <w:start w:val="1"/>
@@ -3253,6 +3951,7 @@
         </w:tabs>
         <w:ind w:left="3240" w:hanging="360"/>
       </w:pPr>
+      <w:rPr/>
     </w:lvl>
     <w:lvl w:ilvl="8">
       <w:start w:val="1"/>
@@ -3265,6 +3964,7 @@
         </w:tabs>
         <w:ind w:left="3600" w:hanging="360"/>
       </w:pPr>
+      <w:rPr/>
     </w:lvl>
   </w:abstractNum>
   <w:abstractNum w:abstractNumId="5">
@@ -3292,6 +3992,7 @@
         </w:tabs>
         <w:ind w:left="1080" w:hanging="360"/>
       </w:pPr>
+      <w:rPr/>
     </w:lvl>
     <w:lvl w:ilvl="2">
       <w:start w:val="1"/>
@@ -3304,6 +4005,7 @@
         </w:tabs>
         <w:ind w:left="1440" w:hanging="360"/>
       </w:pPr>
+      <w:rPr/>
     </w:lvl>
     <w:lvl w:ilvl="3">
       <w:start w:val="1"/>
@@ -3316,6 +4018,7 @@
         </w:tabs>
         <w:ind w:left="1800" w:hanging="360"/>
       </w:pPr>
+      <w:rPr/>
     </w:lvl>
     <w:lvl w:ilvl="4">
       <w:start w:val="1"/>
@@ -3328,6 +4031,7 @@
         </w:tabs>
         <w:ind w:left="2160" w:hanging="360"/>
       </w:pPr>
+      <w:rPr/>
     </w:lvl>
     <w:lvl w:ilvl="5">
       <w:start w:val="1"/>
@@ -3340,6 +4044,7 @@
         </w:tabs>
         <w:ind w:left="2520" w:hanging="360"/>
       </w:pPr>
+      <w:rPr/>
     </w:lvl>
     <w:lvl w:ilvl="6">
       <w:start w:val="1"/>
@@ -3352,6 +4057,7 @@
         </w:tabs>
         <w:ind w:left="2880" w:hanging="360"/>
       </w:pPr>
+      <w:rPr/>
     </w:lvl>
     <w:lvl w:ilvl="7">
       <w:start w:val="1"/>
@@ -3364,6 +4070,7 @@
         </w:tabs>
         <w:ind w:left="3240" w:hanging="360"/>
       </w:pPr>
+      <w:rPr/>
     </w:lvl>
     <w:lvl w:ilvl="8">
       <w:start w:val="1"/>
@@ -3376,6 +4083,7 @@
         </w:tabs>
         <w:ind w:left="3600" w:hanging="360"/>
       </w:pPr>
+      <w:rPr/>
     </w:lvl>
   </w:abstractNum>
   <w:abstractNum w:abstractNumId="6">
@@ -3403,6 +4111,7 @@
         </w:tabs>
         <w:ind w:left="1080" w:hanging="360"/>
       </w:pPr>
+      <w:rPr/>
     </w:lvl>
     <w:lvl w:ilvl="2">
       <w:start w:val="1"/>
@@ -3415,6 +4124,7 @@
         </w:tabs>
         <w:ind w:left="1440" w:hanging="360"/>
       </w:pPr>
+      <w:rPr/>
     </w:lvl>
     <w:lvl w:ilvl="3">
       <w:start w:val="1"/>
@@ -3427,6 +4137,7 @@
         </w:tabs>
         <w:ind w:left="1800" w:hanging="360"/>
       </w:pPr>
+      <w:rPr/>
     </w:lvl>
     <w:lvl w:ilvl="4">
       <w:start w:val="1"/>
@@ -3439,6 +4150,7 @@
         </w:tabs>
         <w:ind w:left="2160" w:hanging="360"/>
       </w:pPr>
+      <w:rPr/>
     </w:lvl>
     <w:lvl w:ilvl="5">
       <w:start w:val="1"/>
@@ -3451,6 +4163,7 @@
         </w:tabs>
         <w:ind w:left="2520" w:hanging="360"/>
       </w:pPr>
+      <w:rPr/>
     </w:lvl>
     <w:lvl w:ilvl="6">
       <w:start w:val="1"/>
@@ -3463,6 +4176,7 @@
         </w:tabs>
         <w:ind w:left="2880" w:hanging="360"/>
       </w:pPr>
+      <w:rPr/>
     </w:lvl>
     <w:lvl w:ilvl="7">
       <w:start w:val="1"/>
@@ -3475,6 +4189,7 @@
         </w:tabs>
         <w:ind w:left="3240" w:hanging="360"/>
       </w:pPr>
+      <w:rPr/>
     </w:lvl>
     <w:lvl w:ilvl="8">
       <w:start w:val="1"/>
@@ -3487,6 +4202,7 @@
         </w:tabs>
         <w:ind w:left="3600" w:hanging="360"/>
       </w:pPr>
+      <w:rPr/>
     </w:lvl>
   </w:abstractNum>
   <w:abstractNum w:abstractNumId="7">
@@ -3794,6 +4510,7 @@
     <w:rsid w:val="00fc693f"/>
     <w:pPr>
       <w:widowControl/>
+      <w:suppressAutoHyphens w:val="true"/>
       <w:bidi w:val="0"/>
       <w:spacing w:lineRule="auto" w:line="276" w:before="0" w:after="200"/>
       <w:jc w:val="left"/>
@@ -4473,6 +5190,7 @@
     <w:rsid w:val="00fc693f"/>
     <w:pPr>
       <w:widowControl/>
+      <w:suppressAutoHyphens w:val="true"/>
       <w:bidi w:val="0"/>
       <w:spacing w:lineRule="auto" w:line="240" w:before="0" w:after="0"/>
       <w:jc w:val="left"/>
@@ -4571,24 +5289,29 @@
       <w:szCs w:val="16"/>
     </w:rPr>
   </w:style>
-  <w:style w:type="paragraph" w:styleId="Lista2">
+  <w:style w:type="paragraph" w:styleId="ListBullet3">
     <w:name w:val="List Bullet 3"/>
     <w:basedOn w:val="Normal"/>
     <w:uiPriority w:val="99"/>
     <w:unhideWhenUsed/>
+    <w:qFormat/>
     <w:rsid w:val="00326f90"/>
     <w:pPr>
+      <w:numPr>
+        <w:ilvl w:val="0"/>
+        <w:numId w:val="3"/>
+      </w:numPr>
       <w:spacing w:before="0" w:after="200"/>
-      <w:ind w:left="720" w:hanging="360"/>
       <w:contextualSpacing/>
     </w:pPr>
     <w:rPr/>
   </w:style>
-  <w:style w:type="paragraph" w:styleId="Lista3">
+  <w:style w:type="paragraph" w:styleId="ListBullet4">
     <w:name w:val="List Bullet 4"/>
     <w:basedOn w:val="Normal"/>
     <w:uiPriority w:val="99"/>
     <w:unhideWhenUsed/>
+    <w:qFormat/>
     <w:rsid w:val="00326f90"/>
     <w:pPr>
       <w:spacing w:before="0" w:after="200"/>
@@ -4625,23 +5348,6 @@
       <w:numPr>
         <w:ilvl w:val="0"/>
         <w:numId w:val="2"/>
-      </w:numPr>
-      <w:spacing w:before="0" w:after="200"/>
-      <w:contextualSpacing/>
-    </w:pPr>
-    <w:rPr/>
-  </w:style>
-  <w:style w:type="paragraph" w:styleId="ListBullet3">
-    <w:name w:val="List Bullet 3"/>
-    <w:basedOn w:val="Normal"/>
-    <w:uiPriority w:val="99"/>
-    <w:unhideWhenUsed/>
-    <w:qFormat/>
-    <w:rsid w:val="00326f90"/>
-    <w:pPr>
-      <w:numPr>
-        <w:ilvl w:val="0"/>
-        <w:numId w:val="3"/>
       </w:numPr>
       <w:spacing w:before="0" w:after="200"/>
       <w:contextualSpacing/>
@@ -4760,6 +5466,7 @@
         <w:tab w:val="left" w:pos="3456" w:leader="none"/>
         <w:tab w:val="left" w:pos="4032" w:leader="none"/>
       </w:tabs>
+      <w:suppressAutoHyphens w:val="true"/>
       <w:bidi w:val="0"/>
       <w:spacing w:lineRule="auto" w:line="276" w:before="0" w:after="200"/>
       <w:jc w:val="left"/>

</xml_diff>

<commit_message>
se corrige archivo de mandatos y se modifica llamado a fetch
</commit_message>
<xml_diff>
--- a/mandato_template.docx
+++ b/mandato_template.docx
@@ -7,10 +7,13 @@
         <w:pStyle w:val="Ttulo1"/>
         <w:spacing w:before="480" w:after="0"/>
         <w:jc w:val="center"/>
-        <w:rPr/>
+        <w:rPr>
+          <w:rFonts w:ascii="Liberation Serif" w:hAnsi="Liberation Serif"/>
+        </w:rPr>
       </w:pPr>
       <w:r>
         <w:rPr>
+          <w:rFonts w:ascii="Liberation Serif" w:hAnsi="Liberation Serif"/>
           <w:color w:val="000000"/>
         </w:rPr>
         <w:t>MANDATO PARA {{mandante_tipoPension}}</w:t>
@@ -20,24 +23,27 @@
       <w:pPr>
         <w:pStyle w:val="Normal"/>
         <w:jc w:val="center"/>
-        <w:rPr/>
+        <w:rPr>
+          <w:rFonts w:ascii="Liberation Serif" w:hAnsi="Liberation Serif"/>
+        </w:rPr>
       </w:pPr>
       <w:r>
         <w:rPr>
-          <w:rFonts w:ascii="Calibri" w:hAnsi="Calibri"/>
+          <w:rFonts w:ascii="Liberation Serif" w:hAnsi="Liberation Serif"/>
         </w:rPr>
-        <w:t>{{mandante_tipoPension}}</w:t>
       </w:r>
     </w:p>
     <w:p>
       <w:pPr>
         <w:pStyle w:val="Normal"/>
         <w:jc w:val="both"/>
-        <w:rPr/>
+        <w:rPr>
+          <w:rFonts w:ascii="Liberation Serif" w:hAnsi="Liberation Serif"/>
+        </w:rPr>
       </w:pPr>
       <w:r>
         <w:rPr>
-          <w:rFonts w:ascii="Calibri" w:hAnsi="Calibri"/>
+          <w:rFonts w:ascii="Liberation Serif" w:hAnsi="Liberation Serif"/>
         </w:rPr>
         <w:t>Con fecha {{fecha_actual}} y por medio del siguiente instrumento, yo {{mandante_nombre_completo}}, RUT {{mandante_rut}}, de nacionalidad {{nacionalidad}}, de sexo {{sexo}}, nacido el {{fecha_nacimiento}}, estado civil {{estado_civil}}, de profesión u oficio {{profesion}}, domiciliado en {{direccion}}, comuna de {{comuna}}, ciudad de {{ciudad}}, teléfono {{telefono}}, correo electrónico {{email}}, e incorporado a la Institución de Salud {{salud}}, confiero poder a Don/Doña {{mandatario_nombre}}, RUT {{mandatario_rut}}, domiciliado en {{mandatario_direccion}}, comuna de {{mandatario_comuna}}, ciudad de {{mandatario_ciudad}}, teléfono {{mandatario_telefono}}, correo electrónico {{mandatario_email}}, para que en mi nombre suscriba en {{mandante_afp}}, una solicitud de {{mandante_tipoPension}}.</w:t>
       </w:r>
@@ -46,12 +52,12 @@
       <w:pPr>
         <w:pStyle w:val="Normal"/>
         <w:rPr>
-          <w:rFonts w:ascii="Calibri" w:hAnsi="Calibri"/>
+          <w:rFonts w:ascii="Liberation Serif" w:hAnsi="Liberation Serif"/>
         </w:rPr>
       </w:pPr>
       <w:r>
         <w:rPr>
-          <w:rFonts w:ascii="Calibri" w:hAnsi="Calibri"/>
+          <w:rFonts w:ascii="Liberation Serif" w:hAnsi="Liberation Serif"/>
         </w:rPr>
         <w:br/>
         <w:t>Asimismo, expongo que a la fecha, los datos de mi empleador son los siguientes:</w:t>
@@ -61,12 +67,12 @@
       <w:pPr>
         <w:pStyle w:val="Normal"/>
         <w:rPr>
-          <w:rFonts w:ascii="Calibri" w:hAnsi="Calibri"/>
+          <w:rFonts w:ascii="Liberation Serif" w:hAnsi="Liberation Serif"/>
         </w:rPr>
       </w:pPr>
       <w:r>
         <w:rPr>
-          <w:rFonts w:ascii="Calibri" w:hAnsi="Calibri"/>
+          <w:rFonts w:ascii="Liberation Serif" w:hAnsi="Liberation Serif"/>
         </w:rPr>
         <w:t>Nombre: {{empleador_nombre}}</w:t>
       </w:r>
@@ -75,12 +81,12 @@
       <w:pPr>
         <w:pStyle w:val="Normal"/>
         <w:rPr>
-          <w:rFonts w:ascii="Calibri" w:hAnsi="Calibri"/>
+          <w:rFonts w:ascii="Liberation Serif" w:hAnsi="Liberation Serif"/>
         </w:rPr>
       </w:pPr>
       <w:r>
         <w:rPr>
-          <w:rFonts w:ascii="Calibri" w:hAnsi="Calibri"/>
+          <w:rFonts w:ascii="Liberation Serif" w:hAnsi="Liberation Serif"/>
         </w:rPr>
         <w:t>RUT: {{empleador_rut}}</w:t>
       </w:r>
@@ -89,12 +95,12 @@
       <w:pPr>
         <w:pStyle w:val="Normal"/>
         <w:rPr>
-          <w:rFonts w:ascii="Calibri" w:hAnsi="Calibri"/>
+          <w:rFonts w:ascii="Liberation Serif" w:hAnsi="Liberation Serif"/>
         </w:rPr>
       </w:pPr>
       <w:r>
         <w:rPr>
-          <w:rFonts w:ascii="Calibri" w:hAnsi="Calibri"/>
+          <w:rFonts w:ascii="Liberation Serif" w:hAnsi="Liberation Serif"/>
         </w:rPr>
         <w:t>Dirección: {{empleador_direccion}}</w:t>
       </w:r>
@@ -103,12 +109,12 @@
       <w:pPr>
         <w:pStyle w:val="Normal"/>
         <w:rPr>
-          <w:rFonts w:ascii="Calibri" w:hAnsi="Calibri"/>
+          <w:rFonts w:ascii="Liberation Serif" w:hAnsi="Liberation Serif"/>
         </w:rPr>
       </w:pPr>
       <w:r>
         <w:rPr>
-          <w:rFonts w:ascii="Calibri" w:hAnsi="Calibri"/>
+          <w:rFonts w:ascii="Liberation Serif" w:hAnsi="Liberation Serif"/>
         </w:rPr>
         <w:t>Teléfono: {{empleador_telefono}}</w:t>
       </w:r>
@@ -118,12 +124,12 @@
         <w:pStyle w:val="Normal"/>
         <w:jc w:val="both"/>
         <w:rPr>
-          <w:rFonts w:ascii="Calibri" w:hAnsi="Calibri"/>
+          <w:rFonts w:ascii="Liberation Serif" w:hAnsi="Liberation Serif"/>
         </w:rPr>
       </w:pPr>
       <w:r>
         <w:rPr>
-          <w:rFonts w:ascii="Calibri" w:hAnsi="Calibri"/>
+          <w:rFonts w:ascii="Liberation Serif" w:hAnsi="Liberation Serif"/>
         </w:rPr>
         <w:br/>
         <w:t>Para efectos de la suscripción de la pensión antes mencionada, declaro conocer que tienen la calidad de beneficiarios de pensión de sobrevivencia: el cónyuge, los hijos, la madre o padre de hijos de filiación no matrimonial y, a falta de todos los anteriores, los padres. En consecuencia, efectúo la siguiente declaración de beneficiarios:</w:t>
@@ -165,14 +171,12 @@
               <w:widowControl w:val="false"/>
               <w:spacing w:before="0" w:after="200"/>
               <w:rPr>
-                <w:rFonts w:ascii="Calibri" w:hAnsi="Calibri"/>
-                <w:sz w:val="18"/>
-                <w:szCs w:val="18"/>
+                <w:rFonts w:ascii="Liberation Serif" w:hAnsi="Liberation Serif"/>
               </w:rPr>
             </w:pPr>
             <w:r>
               <w:rPr>
-                <w:rFonts w:ascii="Calibri" w:hAnsi="Calibri"/>
+                <w:rFonts w:ascii="Liberation Serif" w:hAnsi="Liberation Serif"/>
                 <w:sz w:val="18"/>
                 <w:szCs w:val="18"/>
               </w:rPr>
@@ -191,14 +195,12 @@
               <w:widowControl w:val="false"/>
               <w:spacing w:before="0" w:after="200"/>
               <w:rPr>
-                <w:rFonts w:ascii="Calibri" w:hAnsi="Calibri"/>
-                <w:sz w:val="18"/>
-                <w:szCs w:val="18"/>
+                <w:rFonts w:ascii="Liberation Serif" w:hAnsi="Liberation Serif"/>
               </w:rPr>
             </w:pPr>
             <w:r>
               <w:rPr>
-                <w:rFonts w:ascii="Calibri" w:hAnsi="Calibri"/>
+                <w:rFonts w:ascii="Liberation Serif" w:hAnsi="Liberation Serif"/>
                 <w:sz w:val="18"/>
                 <w:szCs w:val="18"/>
               </w:rPr>
@@ -217,14 +219,12 @@
               <w:widowControl w:val="false"/>
               <w:spacing w:before="0" w:after="200"/>
               <w:rPr>
-                <w:rFonts w:ascii="Calibri" w:hAnsi="Calibri"/>
-                <w:sz w:val="18"/>
-                <w:szCs w:val="18"/>
+                <w:rFonts w:ascii="Liberation Serif" w:hAnsi="Liberation Serif"/>
               </w:rPr>
             </w:pPr>
             <w:r>
               <w:rPr>
-                <w:rFonts w:ascii="Calibri" w:hAnsi="Calibri"/>
+                <w:rFonts w:ascii="Liberation Serif" w:hAnsi="Liberation Serif"/>
                 <w:sz w:val="18"/>
                 <w:szCs w:val="18"/>
               </w:rPr>
@@ -243,14 +243,12 @@
               <w:widowControl w:val="false"/>
               <w:spacing w:before="0" w:after="200"/>
               <w:rPr>
-                <w:rFonts w:ascii="Calibri" w:hAnsi="Calibri"/>
-                <w:sz w:val="18"/>
-                <w:szCs w:val="18"/>
+                <w:rFonts w:ascii="Liberation Serif" w:hAnsi="Liberation Serif"/>
               </w:rPr>
             </w:pPr>
             <w:r>
               <w:rPr>
-                <w:rFonts w:ascii="Calibri" w:hAnsi="Calibri"/>
+                <w:rFonts w:ascii="Liberation Serif" w:hAnsi="Liberation Serif"/>
                 <w:sz w:val="18"/>
                 <w:szCs w:val="18"/>
               </w:rPr>
@@ -269,14 +267,12 @@
               <w:widowControl w:val="false"/>
               <w:spacing w:before="0" w:after="200"/>
               <w:rPr>
-                <w:rFonts w:ascii="Calibri" w:hAnsi="Calibri"/>
-                <w:sz w:val="18"/>
-                <w:szCs w:val="18"/>
+                <w:rFonts w:ascii="Liberation Serif" w:hAnsi="Liberation Serif"/>
               </w:rPr>
             </w:pPr>
             <w:r>
               <w:rPr>
-                <w:rFonts w:ascii="Calibri" w:hAnsi="Calibri"/>
+                <w:rFonts w:ascii="Liberation Serif" w:hAnsi="Liberation Serif"/>
                 <w:sz w:val="18"/>
                 <w:szCs w:val="18"/>
               </w:rPr>
@@ -295,14 +291,12 @@
               <w:widowControl w:val="false"/>
               <w:spacing w:before="0" w:after="200"/>
               <w:rPr>
-                <w:rFonts w:ascii="Calibri" w:hAnsi="Calibri"/>
-                <w:sz w:val="18"/>
-                <w:szCs w:val="18"/>
+                <w:rFonts w:ascii="Liberation Serif" w:hAnsi="Liberation Serif"/>
               </w:rPr>
             </w:pPr>
             <w:r>
               <w:rPr>
-                <w:rFonts w:ascii="Calibri" w:hAnsi="Calibri"/>
+                <w:rFonts w:ascii="Liberation Serif" w:hAnsi="Liberation Serif"/>
                 <w:sz w:val="18"/>
                 <w:szCs w:val="18"/>
               </w:rPr>
@@ -321,14 +315,12 @@
               <w:widowControl w:val="false"/>
               <w:spacing w:before="0" w:after="200"/>
               <w:rPr>
-                <w:rFonts w:ascii="Calibri" w:hAnsi="Calibri"/>
-                <w:sz w:val="18"/>
-                <w:szCs w:val="18"/>
+                <w:rFonts w:ascii="Liberation Serif" w:hAnsi="Liberation Serif"/>
               </w:rPr>
             </w:pPr>
             <w:r>
               <w:rPr>
-                <w:rFonts w:ascii="Calibri" w:hAnsi="Calibri"/>
+                <w:rFonts w:ascii="Liberation Serif" w:hAnsi="Liberation Serif"/>
                 <w:sz w:val="18"/>
                 <w:szCs w:val="18"/>
               </w:rPr>
@@ -347,14 +339,12 @@
               <w:widowControl w:val="false"/>
               <w:spacing w:before="0" w:after="200"/>
               <w:rPr>
-                <w:rFonts w:ascii="Calibri" w:hAnsi="Calibri"/>
-                <w:sz w:val="18"/>
-                <w:szCs w:val="18"/>
+                <w:rFonts w:ascii="Liberation Serif" w:hAnsi="Liberation Serif"/>
               </w:rPr>
             </w:pPr>
             <w:r>
               <w:rPr>
-                <w:rFonts w:ascii="Calibri" w:hAnsi="Calibri"/>
+                <w:rFonts w:ascii="Liberation Serif" w:hAnsi="Liberation Serif"/>
                 <w:sz w:val="18"/>
                 <w:szCs w:val="18"/>
               </w:rPr>
@@ -376,17 +366,18 @@
               <w:widowControl w:val="false"/>
               <w:spacing w:before="0" w:after="200"/>
               <w:rPr>
+                <w:rFonts w:ascii="Liberation Serif" w:hAnsi="Liberation Serif"/>
                 <w:sz w:val="12"/>
                 <w:szCs w:val="12"/>
               </w:rPr>
             </w:pPr>
             <w:r>
               <w:rPr>
-                <w:rFonts w:ascii="Calibri" w:hAnsi="Calibri"/>
-                <w:sz w:val="12"/>
-                <w:szCs w:val="12"/>
-              </w:rPr>
-              <w:t>{#beneficiarios}{apellidoPaterno}</w:t>
+                <w:rFonts w:ascii="Liberation Serif" w:hAnsi="Liberation Serif"/>
+                <w:sz w:val="12"/>
+                <w:szCs w:val="12"/>
+              </w:rPr>
+              <w:t>{#beneficiarios}</w:t>
             </w:r>
           </w:p>
         </w:tc>
@@ -401,13 +392,218 @@
               <w:widowControl w:val="false"/>
               <w:spacing w:before="0" w:after="200"/>
               <w:rPr>
+                <w:rFonts w:ascii="Liberation Serif" w:hAnsi="Liberation Serif"/>
                 <w:sz w:val="12"/>
                 <w:szCs w:val="12"/>
               </w:rPr>
             </w:pPr>
             <w:r>
               <w:rPr>
-                <w:rFonts w:ascii="Calibri" w:hAnsi="Calibri"/>
+                <w:rFonts w:ascii="Liberation Serif" w:hAnsi="Liberation Serif"/>
+                <w:sz w:val="12"/>
+                <w:szCs w:val="12"/>
+              </w:rPr>
+            </w:r>
+          </w:p>
+        </w:tc>
+        <w:tc>
+          <w:tcPr>
+            <w:tcW w:w="1080" w:type="dxa"/>
+            <w:tcBorders/>
+          </w:tcPr>
+          <w:p>
+            <w:pPr>
+              <w:pStyle w:val="Contenidodelatabla"/>
+              <w:widowControl w:val="false"/>
+              <w:spacing w:before="0" w:after="200"/>
+              <w:rPr>
+                <w:rFonts w:ascii="Liberation Serif" w:hAnsi="Liberation Serif"/>
+                <w:sz w:val="12"/>
+                <w:szCs w:val="12"/>
+              </w:rPr>
+            </w:pPr>
+            <w:r>
+              <w:rPr>
+                <w:rFonts w:ascii="Liberation Serif" w:hAnsi="Liberation Serif"/>
+                <w:sz w:val="12"/>
+                <w:szCs w:val="12"/>
+              </w:rPr>
+            </w:r>
+          </w:p>
+        </w:tc>
+        <w:tc>
+          <w:tcPr>
+            <w:tcW w:w="724" w:type="dxa"/>
+            <w:tcBorders/>
+          </w:tcPr>
+          <w:p>
+            <w:pPr>
+              <w:pStyle w:val="Contenidodelatabla"/>
+              <w:widowControl w:val="false"/>
+              <w:spacing w:before="0" w:after="200"/>
+              <w:rPr>
+                <w:rFonts w:ascii="Liberation Serif" w:hAnsi="Liberation Serif"/>
+                <w:sz w:val="12"/>
+                <w:szCs w:val="12"/>
+              </w:rPr>
+            </w:pPr>
+            <w:r>
+              <w:rPr>
+                <w:rFonts w:ascii="Liberation Serif" w:hAnsi="Liberation Serif"/>
+                <w:sz w:val="12"/>
+                <w:szCs w:val="12"/>
+              </w:rPr>
+            </w:r>
+          </w:p>
+        </w:tc>
+        <w:tc>
+          <w:tcPr>
+            <w:tcW w:w="512" w:type="dxa"/>
+            <w:tcBorders/>
+          </w:tcPr>
+          <w:p>
+            <w:pPr>
+              <w:pStyle w:val="Contenidodelatabla"/>
+              <w:widowControl w:val="false"/>
+              <w:spacing w:before="0" w:after="200"/>
+              <w:rPr>
+                <w:rFonts w:ascii="Liberation Serif" w:hAnsi="Liberation Serif"/>
+                <w:sz w:val="12"/>
+                <w:szCs w:val="12"/>
+              </w:rPr>
+            </w:pPr>
+            <w:r>
+              <w:rPr>
+                <w:rFonts w:ascii="Liberation Serif" w:hAnsi="Liberation Serif"/>
+                <w:sz w:val="12"/>
+                <w:szCs w:val="12"/>
+              </w:rPr>
+            </w:r>
+          </w:p>
+        </w:tc>
+        <w:tc>
+          <w:tcPr>
+            <w:tcW w:w="1813" w:type="dxa"/>
+            <w:tcBorders/>
+          </w:tcPr>
+          <w:p>
+            <w:pPr>
+              <w:pStyle w:val="Contenidodelatabla"/>
+              <w:widowControl w:val="false"/>
+              <w:spacing w:before="0" w:after="200"/>
+              <w:rPr>
+                <w:rFonts w:ascii="Liberation Serif" w:hAnsi="Liberation Serif"/>
+                <w:sz w:val="12"/>
+                <w:szCs w:val="12"/>
+              </w:rPr>
+            </w:pPr>
+            <w:r>
+              <w:rPr>
+                <w:rFonts w:ascii="Liberation Serif" w:hAnsi="Liberation Serif"/>
+                <w:sz w:val="12"/>
+                <w:szCs w:val="12"/>
+              </w:rPr>
+            </w:r>
+          </w:p>
+        </w:tc>
+        <w:tc>
+          <w:tcPr>
+            <w:tcW w:w="1271" w:type="dxa"/>
+            <w:tcBorders/>
+          </w:tcPr>
+          <w:p>
+            <w:pPr>
+              <w:pStyle w:val="Contenidodelatabla"/>
+              <w:widowControl w:val="false"/>
+              <w:spacing w:before="0" w:after="200"/>
+              <w:rPr>
+                <w:rFonts w:ascii="Liberation Serif" w:hAnsi="Liberation Serif"/>
+                <w:sz w:val="12"/>
+                <w:szCs w:val="12"/>
+              </w:rPr>
+            </w:pPr>
+            <w:r>
+              <w:rPr>
+                <w:rFonts w:ascii="Liberation Serif" w:hAnsi="Liberation Serif"/>
+                <w:sz w:val="12"/>
+                <w:szCs w:val="12"/>
+              </w:rPr>
+            </w:r>
+          </w:p>
+        </w:tc>
+        <w:tc>
+          <w:tcPr>
+            <w:tcW w:w="1080" w:type="dxa"/>
+            <w:tcBorders/>
+          </w:tcPr>
+          <w:p>
+            <w:pPr>
+              <w:pStyle w:val="Contenidodelatabla"/>
+              <w:widowControl w:val="false"/>
+              <w:spacing w:before="0" w:after="200"/>
+              <w:rPr>
+                <w:rFonts w:ascii="Liberation Serif" w:hAnsi="Liberation Serif"/>
+                <w:sz w:val="12"/>
+                <w:szCs w:val="12"/>
+              </w:rPr>
+            </w:pPr>
+            <w:r>
+              <w:rPr>
+                <w:rFonts w:ascii="Liberation Serif" w:hAnsi="Liberation Serif"/>
+                <w:sz w:val="12"/>
+                <w:szCs w:val="12"/>
+              </w:rPr>
+            </w:r>
+          </w:p>
+        </w:tc>
+      </w:tr>
+      <w:tr>
+        <w:trPr/>
+        <w:tc>
+          <w:tcPr>
+            <w:tcW w:w="1138" w:type="dxa"/>
+            <w:tcBorders/>
+          </w:tcPr>
+          <w:p>
+            <w:pPr>
+              <w:pStyle w:val="Contenidodelatabla"/>
+              <w:widowControl w:val="false"/>
+              <w:spacing w:before="0" w:after="200"/>
+              <w:rPr>
+                <w:rFonts w:ascii="Liberation Serif" w:hAnsi="Liberation Serif"/>
+                <w:sz w:val="12"/>
+                <w:szCs w:val="12"/>
+              </w:rPr>
+            </w:pPr>
+            <w:r>
+              <w:rPr>
+                <w:rFonts w:ascii="Liberation Serif" w:hAnsi="Liberation Serif"/>
+                <w:sz w:val="12"/>
+                <w:szCs w:val="12"/>
+              </w:rPr>
+              <w:t>{apellidoPaterno}</w:t>
+            </w:r>
+          </w:p>
+        </w:tc>
+        <w:tc>
+          <w:tcPr>
+            <w:tcW w:w="1021" w:type="dxa"/>
+            <w:tcBorders/>
+          </w:tcPr>
+          <w:p>
+            <w:pPr>
+              <w:pStyle w:val="Contenidodelatabla"/>
+              <w:widowControl w:val="false"/>
+              <w:spacing w:before="0" w:after="200"/>
+              <w:rPr>
+                <w:rFonts w:ascii="Liberation Serif" w:hAnsi="Liberation Serif"/>
+                <w:sz w:val="12"/>
+                <w:szCs w:val="12"/>
+              </w:rPr>
+            </w:pPr>
+            <w:r>
+              <w:rPr>
+                <w:rFonts w:ascii="Liberation Serif" w:hAnsi="Liberation Serif"/>
                 <w:sz w:val="12"/>
                 <w:szCs w:val="12"/>
               </w:rPr>
@@ -426,13 +622,14 @@
               <w:widowControl w:val="false"/>
               <w:spacing w:before="0" w:after="200"/>
               <w:rPr>
+                <w:rFonts w:ascii="Liberation Serif" w:hAnsi="Liberation Serif"/>
                 <w:sz w:val="12"/>
                 <w:szCs w:val="12"/>
               </w:rPr>
             </w:pPr>
             <w:r>
               <w:rPr>
-                <w:rFonts w:ascii="Calibri" w:hAnsi="Calibri"/>
+                <w:rFonts w:ascii="Liberation Serif" w:hAnsi="Liberation Serif"/>
                 <w:sz w:val="12"/>
                 <w:szCs w:val="12"/>
               </w:rPr>
@@ -451,13 +648,14 @@
               <w:widowControl w:val="false"/>
               <w:spacing w:before="0" w:after="200"/>
               <w:rPr>
+                <w:rFonts w:ascii="Liberation Serif" w:hAnsi="Liberation Serif"/>
                 <w:sz w:val="12"/>
                 <w:szCs w:val="12"/>
               </w:rPr>
             </w:pPr>
             <w:r>
               <w:rPr>
-                <w:rFonts w:ascii="Calibri" w:hAnsi="Calibri"/>
+                <w:rFonts w:ascii="Liberation Serif" w:hAnsi="Liberation Serif"/>
                 <w:sz w:val="12"/>
                 <w:szCs w:val="12"/>
               </w:rPr>
@@ -476,13 +674,14 @@
               <w:widowControl w:val="false"/>
               <w:spacing w:before="0" w:after="200"/>
               <w:rPr>
+                <w:rFonts w:ascii="Liberation Serif" w:hAnsi="Liberation Serif"/>
                 <w:sz w:val="12"/>
                 <w:szCs w:val="12"/>
               </w:rPr>
             </w:pPr>
             <w:r>
               <w:rPr>
-                <w:rFonts w:ascii="Calibri" w:hAnsi="Calibri"/>
+                <w:rFonts w:ascii="Liberation Serif" w:hAnsi="Liberation Serif"/>
                 <w:sz w:val="12"/>
                 <w:szCs w:val="12"/>
               </w:rPr>
@@ -501,13 +700,14 @@
               <w:widowControl w:val="false"/>
               <w:spacing w:before="0" w:after="200"/>
               <w:rPr>
+                <w:rFonts w:ascii="Liberation Serif" w:hAnsi="Liberation Serif"/>
                 <w:sz w:val="12"/>
                 <w:szCs w:val="12"/>
               </w:rPr>
             </w:pPr>
             <w:r>
               <w:rPr>
-                <w:rFonts w:ascii="Calibri" w:hAnsi="Calibri"/>
+                <w:rFonts w:ascii="Liberation Serif" w:hAnsi="Liberation Serif"/>
                 <w:sz w:val="12"/>
                 <w:szCs w:val="12"/>
               </w:rPr>
@@ -526,13 +726,14 @@
               <w:widowControl w:val="false"/>
               <w:spacing w:before="0" w:after="200"/>
               <w:rPr>
+                <w:rFonts w:ascii="Liberation Serif" w:hAnsi="Liberation Serif"/>
                 <w:sz w:val="12"/>
                 <w:szCs w:val="12"/>
               </w:rPr>
             </w:pPr>
             <w:r>
               <w:rPr>
-                <w:rFonts w:ascii="Calibri" w:hAnsi="Calibri"/>
+                <w:rFonts w:ascii="Liberation Serif" w:hAnsi="Liberation Serif"/>
                 <w:sz w:val="12"/>
                 <w:szCs w:val="12"/>
               </w:rPr>
@@ -551,13 +752,14 @@
               <w:widowControl w:val="false"/>
               <w:spacing w:before="0" w:after="200"/>
               <w:rPr>
+                <w:rFonts w:ascii="Liberation Serif" w:hAnsi="Liberation Serif"/>
                 <w:sz w:val="12"/>
                 <w:szCs w:val="12"/>
               </w:rPr>
             </w:pPr>
             <w:r>
               <w:rPr>
-                <w:rFonts w:ascii="Calibri" w:hAnsi="Calibri"/>
+                <w:rFonts w:ascii="Liberation Serif" w:hAnsi="Liberation Serif"/>
                 <w:sz w:val="12"/>
                 <w:szCs w:val="12"/>
               </w:rPr>
@@ -565,7 +767,7 @@
             </w:r>
             <w:r>
               <w:rPr>
-                <w:rFonts w:ascii="Calibri" w:hAnsi="Calibri"/>
+                <w:rFonts w:ascii="Liberation Serif" w:hAnsi="Liberation Serif"/>
                 <w:sz w:val="12"/>
                 <w:szCs w:val="12"/>
               </w:rPr>
@@ -573,11 +775,215 @@
             </w:r>
             <w:r>
               <w:rPr>
-                <w:rFonts w:ascii="Calibri" w:hAnsi="Calibri"/>
-                <w:sz w:val="12"/>
-                <w:szCs w:val="12"/>
-              </w:rPr>
-              <w:t>ones}{/beneficiarios}</w:t>
+                <w:rFonts w:ascii="Liberation Serif" w:hAnsi="Liberation Serif"/>
+                <w:sz w:val="12"/>
+                <w:szCs w:val="12"/>
+              </w:rPr>
+              <w:t>ones}</w:t>
+            </w:r>
+          </w:p>
+        </w:tc>
+      </w:tr>
+      <w:tr>
+        <w:trPr/>
+        <w:tc>
+          <w:tcPr>
+            <w:tcW w:w="1138" w:type="dxa"/>
+            <w:tcBorders/>
+          </w:tcPr>
+          <w:p>
+            <w:pPr>
+              <w:pStyle w:val="Contenidodelatabla"/>
+              <w:widowControl w:val="false"/>
+              <w:spacing w:before="0" w:after="200"/>
+              <w:rPr>
+                <w:rFonts w:ascii="Liberation Serif" w:hAnsi="Liberation Serif"/>
+                <w:sz w:val="12"/>
+                <w:szCs w:val="12"/>
+              </w:rPr>
+            </w:pPr>
+            <w:r>
+              <w:rPr>
+                <w:rFonts w:ascii="Liberation Serif" w:hAnsi="Liberation Serif"/>
+                <w:sz w:val="12"/>
+                <w:szCs w:val="12"/>
+              </w:rPr>
+              <w:t>{/beneficiarios}</w:t>
+            </w:r>
+          </w:p>
+        </w:tc>
+        <w:tc>
+          <w:tcPr>
+            <w:tcW w:w="1021" w:type="dxa"/>
+            <w:tcBorders/>
+          </w:tcPr>
+          <w:p>
+            <w:pPr>
+              <w:pStyle w:val="Contenidodelatabla"/>
+              <w:widowControl w:val="false"/>
+              <w:spacing w:before="0" w:after="200"/>
+              <w:rPr>
+                <w:rFonts w:ascii="Liberation Serif" w:hAnsi="Liberation Serif"/>
+                <w:sz w:val="12"/>
+                <w:szCs w:val="12"/>
+              </w:rPr>
+            </w:pPr>
+            <w:r>
+              <w:rPr>
+                <w:rFonts w:ascii="Liberation Serif" w:hAnsi="Liberation Serif"/>
+                <w:sz w:val="12"/>
+                <w:szCs w:val="12"/>
+              </w:rPr>
+            </w:r>
+          </w:p>
+        </w:tc>
+        <w:tc>
+          <w:tcPr>
+            <w:tcW w:w="1080" w:type="dxa"/>
+            <w:tcBorders/>
+          </w:tcPr>
+          <w:p>
+            <w:pPr>
+              <w:pStyle w:val="Contenidodelatabla"/>
+              <w:widowControl w:val="false"/>
+              <w:spacing w:before="0" w:after="200"/>
+              <w:rPr>
+                <w:rFonts w:ascii="Liberation Serif" w:hAnsi="Liberation Serif"/>
+                <w:sz w:val="12"/>
+                <w:szCs w:val="12"/>
+              </w:rPr>
+            </w:pPr>
+            <w:r>
+              <w:rPr>
+                <w:rFonts w:ascii="Liberation Serif" w:hAnsi="Liberation Serif"/>
+                <w:sz w:val="12"/>
+                <w:szCs w:val="12"/>
+              </w:rPr>
+            </w:r>
+          </w:p>
+        </w:tc>
+        <w:tc>
+          <w:tcPr>
+            <w:tcW w:w="724" w:type="dxa"/>
+            <w:tcBorders/>
+          </w:tcPr>
+          <w:p>
+            <w:pPr>
+              <w:pStyle w:val="Contenidodelatabla"/>
+              <w:widowControl w:val="false"/>
+              <w:spacing w:before="0" w:after="200"/>
+              <w:rPr>
+                <w:rFonts w:ascii="Liberation Serif" w:hAnsi="Liberation Serif"/>
+                <w:sz w:val="12"/>
+                <w:szCs w:val="12"/>
+              </w:rPr>
+            </w:pPr>
+            <w:r>
+              <w:rPr>
+                <w:rFonts w:ascii="Liberation Serif" w:hAnsi="Liberation Serif"/>
+                <w:sz w:val="12"/>
+                <w:szCs w:val="12"/>
+              </w:rPr>
+            </w:r>
+          </w:p>
+        </w:tc>
+        <w:tc>
+          <w:tcPr>
+            <w:tcW w:w="512" w:type="dxa"/>
+            <w:tcBorders/>
+          </w:tcPr>
+          <w:p>
+            <w:pPr>
+              <w:pStyle w:val="Contenidodelatabla"/>
+              <w:widowControl w:val="false"/>
+              <w:spacing w:before="0" w:after="200"/>
+              <w:rPr>
+                <w:rFonts w:ascii="Liberation Serif" w:hAnsi="Liberation Serif"/>
+                <w:sz w:val="12"/>
+                <w:szCs w:val="12"/>
+              </w:rPr>
+            </w:pPr>
+            <w:r>
+              <w:rPr>
+                <w:rFonts w:ascii="Liberation Serif" w:hAnsi="Liberation Serif"/>
+                <w:sz w:val="12"/>
+                <w:szCs w:val="12"/>
+              </w:rPr>
+            </w:r>
+          </w:p>
+        </w:tc>
+        <w:tc>
+          <w:tcPr>
+            <w:tcW w:w="1813" w:type="dxa"/>
+            <w:tcBorders/>
+          </w:tcPr>
+          <w:p>
+            <w:pPr>
+              <w:pStyle w:val="Contenidodelatabla"/>
+              <w:widowControl w:val="false"/>
+              <w:spacing w:before="0" w:after="200"/>
+              <w:rPr>
+                <w:rFonts w:ascii="Liberation Serif" w:hAnsi="Liberation Serif"/>
+                <w:sz w:val="12"/>
+                <w:szCs w:val="12"/>
+              </w:rPr>
+            </w:pPr>
+            <w:r>
+              <w:rPr>
+                <w:rFonts w:ascii="Liberation Serif" w:hAnsi="Liberation Serif"/>
+                <w:sz w:val="12"/>
+                <w:szCs w:val="12"/>
+              </w:rPr>
+            </w:r>
+          </w:p>
+        </w:tc>
+        <w:tc>
+          <w:tcPr>
+            <w:tcW w:w="1271" w:type="dxa"/>
+            <w:tcBorders/>
+          </w:tcPr>
+          <w:p>
+            <w:pPr>
+              <w:pStyle w:val="Contenidodelatabla"/>
+              <w:widowControl w:val="false"/>
+              <w:spacing w:before="0" w:after="200"/>
+              <w:rPr>
+                <w:rFonts w:ascii="Liberation Serif" w:hAnsi="Liberation Serif"/>
+                <w:sz w:val="12"/>
+                <w:szCs w:val="12"/>
+              </w:rPr>
+            </w:pPr>
+            <w:r>
+              <w:rPr>
+                <w:rFonts w:ascii="Liberation Serif" w:hAnsi="Liberation Serif"/>
+                <w:sz w:val="12"/>
+                <w:szCs w:val="12"/>
+              </w:rPr>
+            </w:r>
+          </w:p>
+        </w:tc>
+        <w:tc>
+          <w:tcPr>
+            <w:tcW w:w="1080" w:type="dxa"/>
+            <w:tcBorders/>
+          </w:tcPr>
+          <w:p>
+            <w:pPr>
+              <w:pStyle w:val="Contenidodelatabla"/>
+              <w:widowControl w:val="false"/>
+              <w:spacing w:before="0" w:after="200"/>
+              <w:rPr>
+                <w:rFonts w:ascii="Liberation Serif" w:hAnsi="Liberation Serif"/>
+                <w:sz w:val="12"/>
+                <w:szCs w:val="12"/>
+              </w:rPr>
+            </w:pPr>
+            <w:r>
+              <w:rPr>
+                <w:rFonts w:ascii="Liberation Serif" w:hAnsi="Liberation Serif"/>
+                <w:sz w:val="12"/>
+                <w:szCs w:val="12"/>
+              </w:rPr>
             </w:r>
           </w:p>
         </w:tc>
@@ -587,12 +993,12 @@
       <w:pPr>
         <w:pStyle w:val="Normal"/>
         <w:rPr>
-          <w:rFonts w:ascii="Calibri" w:hAnsi="Calibri"/>
+          <w:rFonts w:ascii="Liberation Serif" w:hAnsi="Liberation Serif"/>
         </w:rPr>
       </w:pPr>
       <w:r>
         <w:rPr>
-          <w:rFonts w:ascii="Calibri" w:hAnsi="Calibri"/>
+          <w:rFonts w:ascii="Liberation Serif" w:hAnsi="Liberation Serif"/>
         </w:rPr>
       </w:r>
       <w:r>
@@ -603,11 +1009,13 @@
       <w:pPr>
         <w:pStyle w:val="Normal"/>
         <w:jc w:val="both"/>
-        <w:rPr/>
+        <w:rPr>
+          <w:rFonts w:ascii="Liberation Serif" w:hAnsi="Liberation Serif"/>
+        </w:rPr>
       </w:pPr>
       <w:r>
         <w:rPr>
-          <w:rFonts w:ascii="Calibri" w:hAnsi="Calibri"/>
+          <w:rFonts w:ascii="Liberation Serif" w:hAnsi="Liberation Serif"/>
         </w:rPr>
         <w:t>Por otra parte, señalo los siguientes antecedentes que el mandatario deberá considerar para suscribir en mi nombre solicitud de pensión de Vejez.</w:t>
       </w:r>
@@ -645,12 +1053,12 @@
               <w:spacing w:before="0" w:after="200"/>
               <w:jc w:val="center"/>
               <w:rPr>
-                <w:rFonts w:ascii="Calibri" w:hAnsi="Calibri"/>
+                <w:rFonts w:ascii="Liberation Serif" w:hAnsi="Liberation Serif"/>
               </w:rPr>
             </w:pPr>
             <w:r>
               <w:rPr>
-                <w:rFonts w:ascii="Calibri" w:hAnsi="Calibri"/>
+                <w:rFonts w:ascii="Liberation Serif" w:hAnsi="Liberation Serif"/>
               </w:rPr>
             </w:r>
           </w:p>
@@ -668,12 +1076,12 @@
               <w:spacing w:lineRule="auto" w:line="276" w:before="57" w:after="257"/>
               <w:jc w:val="center"/>
               <w:rPr>
-                <w:rFonts w:ascii="Calibri" w:hAnsi="Calibri"/>
+                <w:rFonts w:ascii="Liberation Serif" w:hAnsi="Liberation Serif"/>
               </w:rPr>
             </w:pPr>
             <w:r>
               <w:rPr>
-                <w:rFonts w:ascii="Calibri" w:hAnsi="Calibri"/>
+                <w:rFonts w:ascii="Liberation Serif" w:hAnsi="Liberation Serif"/>
               </w:rPr>
               <w:t>Sí</w:t>
             </w:r>
@@ -692,12 +1100,12 @@
               <w:spacing w:before="0" w:after="200"/>
               <w:jc w:val="center"/>
               <w:rPr>
-                <w:rFonts w:ascii="Calibri" w:hAnsi="Calibri"/>
+                <w:rFonts w:ascii="Liberation Serif" w:hAnsi="Liberation Serif"/>
               </w:rPr>
             </w:pPr>
             <w:r>
               <w:rPr>
-                <w:rFonts w:ascii="Calibri" w:hAnsi="Calibri"/>
+                <w:rFonts w:ascii="Liberation Serif" w:hAnsi="Liberation Serif"/>
               </w:rPr>
               <w:t>No</w:t>
             </w:r>
@@ -719,12 +1127,12 @@
               <w:spacing w:before="0" w:after="200"/>
               <w:jc w:val="left"/>
               <w:rPr>
-                <w:rFonts w:ascii="Calibri" w:hAnsi="Calibri"/>
+                <w:rFonts w:ascii="Liberation Serif" w:hAnsi="Liberation Serif"/>
               </w:rPr>
             </w:pPr>
             <w:r>
               <w:rPr>
-                <w:rFonts w:ascii="Calibri" w:hAnsi="Calibri"/>
+                <w:rFonts w:ascii="Liberation Serif" w:hAnsi="Liberation Serif"/>
               </w:rPr>
               <w:t>Deseo pensión preliminar.</w:t>
             </w:r>
@@ -743,11 +1151,14 @@
               <w:spacing w:before="0" w:after="200"/>
               <w:jc w:val="center"/>
               <w:rPr>
-                <w:rFonts w:ascii="Calibri" w:hAnsi="Calibri"/>
+                <w:rFonts w:ascii="Liberation Serif" w:hAnsi="Liberation Serif"/>
+                <w:sz w:val="12"/>
+                <w:szCs w:val="12"/>
               </w:rPr>
             </w:pPr>
             <w:r>
               <w:rPr>
+                <w:rFonts w:ascii="Liberation Serif" w:hAnsi="Liberation Serif"/>
                 <w:sz w:val="12"/>
                 <w:szCs w:val="12"/>
               </w:rPr>
@@ -760,13 +1171,14 @@
               <w:spacing w:before="0" w:after="200"/>
               <w:jc w:val="center"/>
               <w:rPr>
+                <w:rFonts w:ascii="Liberation Serif" w:hAnsi="Liberation Serif"/>
                 <w:sz w:val="12"/>
                 <w:szCs w:val="12"/>
               </w:rPr>
             </w:pPr>
             <w:r>
               <w:rPr>
-                <w:rFonts w:ascii="Calibri" w:hAnsi="Calibri"/>
+                <w:rFonts w:ascii="Liberation Serif" w:hAnsi="Liberation Serif"/>
                 <w:sz w:val="12"/>
                 <w:szCs w:val="12"/>
               </w:rPr>
@@ -787,11 +1199,14 @@
               <w:spacing w:before="0" w:after="200"/>
               <w:jc w:val="center"/>
               <w:rPr>
-                <w:rFonts w:ascii="Calibri" w:hAnsi="Calibri"/>
+                <w:rFonts w:ascii="Liberation Serif" w:hAnsi="Liberation Serif"/>
+                <w:sz w:val="12"/>
+                <w:szCs w:val="12"/>
               </w:rPr>
             </w:pPr>
             <w:r>
               <w:rPr>
+                <w:rFonts w:ascii="Liberation Serif" w:hAnsi="Liberation Serif"/>
                 <w:sz w:val="12"/>
                 <w:szCs w:val="12"/>
               </w:rPr>
@@ -804,13 +1219,14 @@
               <w:spacing w:before="0" w:after="200"/>
               <w:jc w:val="center"/>
               <w:rPr>
+                <w:rFonts w:ascii="Liberation Serif" w:hAnsi="Liberation Serif"/>
                 <w:sz w:val="12"/>
                 <w:szCs w:val="12"/>
               </w:rPr>
             </w:pPr>
             <w:r>
               <w:rPr>
-                <w:rFonts w:ascii="Calibri" w:hAnsi="Calibri"/>
+                <w:rFonts w:ascii="Liberation Serif" w:hAnsi="Liberation Serif"/>
                 <w:sz w:val="12"/>
                 <w:szCs w:val="12"/>
               </w:rPr>
@@ -834,12 +1250,12 @@
               <w:spacing w:before="0" w:after="200"/>
               <w:jc w:val="left"/>
               <w:rPr>
-                <w:rFonts w:ascii="Calibri" w:hAnsi="Calibri"/>
+                <w:rFonts w:ascii="Liberation Serif" w:hAnsi="Liberation Serif"/>
               </w:rPr>
             </w:pPr>
             <w:r>
               <w:rPr>
-                <w:rFonts w:ascii="Calibri" w:hAnsi="Calibri"/>
+                <w:rFonts w:ascii="Liberation Serif" w:hAnsi="Liberation Serif"/>
               </w:rPr>
               <w:t>Solicito aporte previsional solidario (APS).</w:t>
             </w:r>
@@ -858,11 +1274,14 @@
               <w:spacing w:before="0" w:after="200"/>
               <w:jc w:val="center"/>
               <w:rPr>
-                <w:rFonts w:ascii="Calibri" w:hAnsi="Calibri"/>
+                <w:rFonts w:ascii="Liberation Serif" w:hAnsi="Liberation Serif"/>
+                <w:sz w:val="12"/>
+                <w:szCs w:val="12"/>
               </w:rPr>
             </w:pPr>
             <w:r>
               <w:rPr>
+                <w:rFonts w:ascii="Liberation Serif" w:hAnsi="Liberation Serif"/>
                 <w:sz w:val="12"/>
                 <w:szCs w:val="12"/>
               </w:rPr>
@@ -875,13 +1294,14 @@
               <w:spacing w:before="0" w:after="200"/>
               <w:jc w:val="center"/>
               <w:rPr>
+                <w:rFonts w:ascii="Liberation Serif" w:hAnsi="Liberation Serif"/>
                 <w:sz w:val="12"/>
                 <w:szCs w:val="12"/>
               </w:rPr>
             </w:pPr>
             <w:r>
               <w:rPr>
-                <w:rFonts w:ascii="Calibri" w:hAnsi="Calibri"/>
+                <w:rFonts w:ascii="Liberation Serif" w:hAnsi="Liberation Serif"/>
                 <w:sz w:val="12"/>
                 <w:szCs w:val="12"/>
               </w:rPr>
@@ -902,11 +1322,14 @@
               <w:spacing w:before="0" w:after="200"/>
               <w:jc w:val="center"/>
               <w:rPr>
-                <w:rFonts w:ascii="Calibri" w:hAnsi="Calibri"/>
+                <w:rFonts w:ascii="Liberation Serif" w:hAnsi="Liberation Serif"/>
+                <w:sz w:val="12"/>
+                <w:szCs w:val="12"/>
               </w:rPr>
             </w:pPr>
             <w:r>
               <w:rPr>
+                <w:rFonts w:ascii="Liberation Serif" w:hAnsi="Liberation Serif"/>
                 <w:sz w:val="12"/>
                 <w:szCs w:val="12"/>
               </w:rPr>
@@ -919,13 +1342,14 @@
               <w:spacing w:before="0" w:after="200"/>
               <w:jc w:val="center"/>
               <w:rPr>
+                <w:rFonts w:ascii="Liberation Serif" w:hAnsi="Liberation Serif"/>
                 <w:sz w:val="12"/>
                 <w:szCs w:val="12"/>
               </w:rPr>
             </w:pPr>
             <w:r>
               <w:rPr>
-                <w:rFonts w:ascii="Calibri" w:hAnsi="Calibri"/>
+                <w:rFonts w:ascii="Liberation Serif" w:hAnsi="Liberation Serif"/>
                 <w:sz w:val="12"/>
                 <w:szCs w:val="12"/>
               </w:rPr>
@@ -949,12 +1373,12 @@
               <w:spacing w:before="0" w:after="200"/>
               <w:jc w:val="left"/>
               <w:rPr>
-                <w:rFonts w:ascii="Calibri" w:hAnsi="Calibri"/>
+                <w:rFonts w:ascii="Liberation Serif" w:hAnsi="Liberation Serif"/>
               </w:rPr>
             </w:pPr>
             <w:r>
               <w:rPr>
-                <w:rFonts w:ascii="Calibri" w:hAnsi="Calibri"/>
+                <w:rFonts w:ascii="Liberation Serif" w:hAnsi="Liberation Serif"/>
               </w:rPr>
               <w:t>Recibo pensión antiguo sistema.</w:t>
             </w:r>
@@ -973,13 +1397,14 @@
               <w:spacing w:before="0" w:after="200"/>
               <w:jc w:val="center"/>
               <w:rPr>
+                <w:rFonts w:ascii="Liberation Serif" w:hAnsi="Liberation Serif"/>
                 <w:sz w:val="12"/>
                 <w:szCs w:val="12"/>
               </w:rPr>
             </w:pPr>
             <w:r>
               <w:rPr>
-                <w:rFonts w:ascii="Calibri" w:hAnsi="Calibri"/>
+                <w:rFonts w:ascii="Liberation Serif" w:hAnsi="Liberation Serif"/>
                 <w:sz w:val="12"/>
                 <w:szCs w:val="12"/>
               </w:rPr>
@@ -1000,13 +1425,14 @@
               <w:spacing w:before="0" w:after="200"/>
               <w:jc w:val="center"/>
               <w:rPr>
+                <w:rFonts w:ascii="Liberation Serif" w:hAnsi="Liberation Serif"/>
                 <w:sz w:val="12"/>
                 <w:szCs w:val="12"/>
               </w:rPr>
             </w:pPr>
             <w:r>
               <w:rPr>
-                <w:rFonts w:ascii="Calibri" w:hAnsi="Calibri"/>
+                <w:rFonts w:ascii="Liberation Serif" w:hAnsi="Liberation Serif"/>
                 <w:sz w:val="12"/>
                 <w:szCs w:val="12"/>
               </w:rPr>
@@ -1030,12 +1456,12 @@
               <w:spacing w:before="0" w:after="200"/>
               <w:jc w:val="left"/>
               <w:rPr>
-                <w:rFonts w:ascii="Calibri" w:hAnsi="Calibri"/>
+                <w:rFonts w:ascii="Liberation Serif" w:hAnsi="Liberation Serif"/>
               </w:rPr>
             </w:pPr>
             <w:r>
               <w:rPr>
-                <w:rFonts w:ascii="Calibri" w:hAnsi="Calibri"/>
+                <w:rFonts w:ascii="Liberation Serif" w:hAnsi="Liberation Serif"/>
               </w:rPr>
               <w:t>Recibo pensión invalidez de este Sistema.</w:t>
             </w:r>
@@ -1054,11 +1480,14 @@
               <w:spacing w:before="0" w:after="200"/>
               <w:jc w:val="center"/>
               <w:rPr>
-                <w:rFonts w:ascii="Calibri" w:hAnsi="Calibri"/>
+                <w:rFonts w:ascii="Liberation Serif" w:hAnsi="Liberation Serif"/>
+                <w:sz w:val="12"/>
+                <w:szCs w:val="12"/>
               </w:rPr>
             </w:pPr>
             <w:r>
               <w:rPr>
+                <w:rFonts w:ascii="Liberation Serif" w:hAnsi="Liberation Serif"/>
                 <w:sz w:val="12"/>
                 <w:szCs w:val="12"/>
               </w:rPr>
@@ -1071,13 +1500,14 @@
               <w:spacing w:before="0" w:after="200"/>
               <w:jc w:val="center"/>
               <w:rPr>
+                <w:rFonts w:ascii="Liberation Serif" w:hAnsi="Liberation Serif"/>
                 <w:sz w:val="12"/>
                 <w:szCs w:val="12"/>
               </w:rPr>
             </w:pPr>
             <w:r>
               <w:rPr>
-                <w:rFonts w:ascii="Calibri" w:hAnsi="Calibri"/>
+                <w:rFonts w:ascii="Liberation Serif" w:hAnsi="Liberation Serif"/>
                 <w:sz w:val="12"/>
                 <w:szCs w:val="12"/>
               </w:rPr>
@@ -1098,11 +1528,14 @@
               <w:spacing w:before="0" w:after="200"/>
               <w:jc w:val="center"/>
               <w:rPr>
-                <w:rFonts w:ascii="Calibri" w:hAnsi="Calibri"/>
+                <w:rFonts w:ascii="Liberation Serif" w:hAnsi="Liberation Serif"/>
+                <w:sz w:val="12"/>
+                <w:szCs w:val="12"/>
               </w:rPr>
             </w:pPr>
             <w:r>
               <w:rPr>
+                <w:rFonts w:ascii="Liberation Serif" w:hAnsi="Liberation Serif"/>
                 <w:sz w:val="12"/>
                 <w:szCs w:val="12"/>
               </w:rPr>
@@ -1115,13 +1548,14 @@
               <w:spacing w:before="0" w:after="200"/>
               <w:jc w:val="center"/>
               <w:rPr>
+                <w:rFonts w:ascii="Liberation Serif" w:hAnsi="Liberation Serif"/>
                 <w:sz w:val="12"/>
                 <w:szCs w:val="12"/>
               </w:rPr>
             </w:pPr>
             <w:r>
               <w:rPr>
-                <w:rFonts w:ascii="Calibri" w:hAnsi="Calibri"/>
+                <w:rFonts w:ascii="Liberation Serif" w:hAnsi="Liberation Serif"/>
                 <w:sz w:val="12"/>
                 <w:szCs w:val="12"/>
               </w:rPr>
@@ -1145,12 +1579,12 @@
               <w:spacing w:before="0" w:after="200"/>
               <w:jc w:val="left"/>
               <w:rPr>
-                <w:rFonts w:ascii="Calibri" w:hAnsi="Calibri"/>
+                <w:rFonts w:ascii="Liberation Serif" w:hAnsi="Liberation Serif"/>
               </w:rPr>
             </w:pPr>
             <w:r>
               <w:rPr>
-                <w:rFonts w:ascii="Calibri" w:hAnsi="Calibri"/>
+                <w:rFonts w:ascii="Liberation Serif" w:hAnsi="Liberation Serif"/>
               </w:rPr>
               <w:t>Deseo que mi pensión se ajuste a la pensión mínima, si resulta inferior a ella.</w:t>
             </w:r>
@@ -1169,11 +1603,14 @@
               <w:spacing w:before="0" w:after="200"/>
               <w:jc w:val="center"/>
               <w:rPr>
-                <w:rFonts w:ascii="Calibri" w:hAnsi="Calibri"/>
+                <w:rFonts w:ascii="Liberation Serif" w:hAnsi="Liberation Serif"/>
+                <w:sz w:val="12"/>
+                <w:szCs w:val="12"/>
               </w:rPr>
             </w:pPr>
             <w:r>
               <w:rPr>
+                <w:rFonts w:ascii="Liberation Serif" w:hAnsi="Liberation Serif"/>
                 <w:sz w:val="12"/>
                 <w:szCs w:val="12"/>
               </w:rPr>
@@ -1186,13 +1623,14 @@
               <w:spacing w:before="0" w:after="200"/>
               <w:jc w:val="center"/>
               <w:rPr>
+                <w:rFonts w:ascii="Liberation Serif" w:hAnsi="Liberation Serif"/>
                 <w:sz w:val="12"/>
                 <w:szCs w:val="12"/>
               </w:rPr>
             </w:pPr>
             <w:r>
               <w:rPr>
-                <w:rFonts w:ascii="Calibri" w:hAnsi="Calibri"/>
+                <w:rFonts w:ascii="Liberation Serif" w:hAnsi="Liberation Serif"/>
                 <w:sz w:val="12"/>
                 <w:szCs w:val="12"/>
               </w:rPr>
@@ -1213,11 +1651,14 @@
               <w:spacing w:before="0" w:after="200"/>
               <w:jc w:val="center"/>
               <w:rPr>
-                <w:rFonts w:ascii="Calibri" w:hAnsi="Calibri"/>
+                <w:rFonts w:ascii="Liberation Serif" w:hAnsi="Liberation Serif"/>
+                <w:sz w:val="12"/>
+                <w:szCs w:val="12"/>
               </w:rPr>
             </w:pPr>
             <w:r>
               <w:rPr>
+                <w:rFonts w:ascii="Liberation Serif" w:hAnsi="Liberation Serif"/>
                 <w:sz w:val="12"/>
                 <w:szCs w:val="12"/>
               </w:rPr>
@@ -1230,13 +1671,14 @@
               <w:spacing w:before="0" w:after="200"/>
               <w:jc w:val="center"/>
               <w:rPr>
+                <w:rFonts w:ascii="Liberation Serif" w:hAnsi="Liberation Serif"/>
                 <w:sz w:val="12"/>
                 <w:szCs w:val="12"/>
               </w:rPr>
             </w:pPr>
             <w:r>
               <w:rPr>
-                <w:rFonts w:ascii="Calibri" w:hAnsi="Calibri"/>
+                <w:rFonts w:ascii="Liberation Serif" w:hAnsi="Liberation Serif"/>
                 <w:sz w:val="12"/>
                 <w:szCs w:val="12"/>
               </w:rPr>
@@ -1260,12 +1702,12 @@
               <w:spacing w:before="0" w:after="200"/>
               <w:jc w:val="left"/>
               <w:rPr>
-                <w:rFonts w:ascii="Calibri" w:hAnsi="Calibri"/>
+                <w:rFonts w:ascii="Liberation Serif" w:hAnsi="Liberation Serif"/>
               </w:rPr>
             </w:pPr>
             <w:r>
               <w:rPr>
-                <w:rFonts w:ascii="Calibri" w:hAnsi="Calibri"/>
+                <w:rFonts w:ascii="Liberation Serif" w:hAnsi="Liberation Serif"/>
               </w:rPr>
               <w:t>Deseo que mi pensión se ajuste a la pensión básica solidaria, si resulta inferior a ella.</w:t>
             </w:r>
@@ -1284,11 +1726,14 @@
               <w:spacing w:before="0" w:after="200"/>
               <w:jc w:val="center"/>
               <w:rPr>
-                <w:rFonts w:ascii="Calibri" w:hAnsi="Calibri"/>
+                <w:rFonts w:ascii="Liberation Serif" w:hAnsi="Liberation Serif"/>
+                <w:sz w:val="12"/>
+                <w:szCs w:val="12"/>
               </w:rPr>
             </w:pPr>
             <w:r>
               <w:rPr>
+                <w:rFonts w:ascii="Liberation Serif" w:hAnsi="Liberation Serif"/>
                 <w:sz w:val="12"/>
                 <w:szCs w:val="12"/>
               </w:rPr>
@@ -1301,13 +1746,14 @@
               <w:spacing w:before="0" w:after="200"/>
               <w:jc w:val="center"/>
               <w:rPr>
+                <w:rFonts w:ascii="Liberation Serif" w:hAnsi="Liberation Serif"/>
                 <w:sz w:val="12"/>
                 <w:szCs w:val="12"/>
               </w:rPr>
             </w:pPr>
             <w:r>
               <w:rPr>
-                <w:rFonts w:ascii="Calibri" w:hAnsi="Calibri"/>
+                <w:rFonts w:ascii="Liberation Serif" w:hAnsi="Liberation Serif"/>
                 <w:sz w:val="12"/>
                 <w:szCs w:val="12"/>
               </w:rPr>
@@ -1328,11 +1774,14 @@
               <w:spacing w:before="0" w:after="200"/>
               <w:jc w:val="center"/>
               <w:rPr>
-                <w:rFonts w:ascii="Calibri" w:hAnsi="Calibri"/>
+                <w:rFonts w:ascii="Liberation Serif" w:hAnsi="Liberation Serif"/>
+                <w:sz w:val="12"/>
+                <w:szCs w:val="12"/>
               </w:rPr>
             </w:pPr>
             <w:r>
               <w:rPr>
+                <w:rFonts w:ascii="Liberation Serif" w:hAnsi="Liberation Serif"/>
                 <w:sz w:val="12"/>
                 <w:szCs w:val="12"/>
               </w:rPr>
@@ -1345,13 +1794,14 @@
               <w:spacing w:before="0" w:after="200"/>
               <w:jc w:val="center"/>
               <w:rPr>
+                <w:rFonts w:ascii="Liberation Serif" w:hAnsi="Liberation Serif"/>
                 <w:sz w:val="12"/>
                 <w:szCs w:val="12"/>
               </w:rPr>
             </w:pPr>
             <w:r>
               <w:rPr>
-                <w:rFonts w:ascii="Calibri" w:hAnsi="Calibri"/>
+                <w:rFonts w:ascii="Liberation Serif" w:hAnsi="Liberation Serif"/>
                 <w:sz w:val="12"/>
                 <w:szCs w:val="12"/>
               </w:rPr>
@@ -1375,12 +1825,12 @@
               <w:spacing w:before="0" w:after="200"/>
               <w:jc w:val="left"/>
               <w:rPr>
-                <w:rFonts w:ascii="Calibri" w:hAnsi="Calibri"/>
+                <w:rFonts w:ascii="Liberation Serif" w:hAnsi="Liberation Serif"/>
               </w:rPr>
             </w:pPr>
             <w:r>
               <w:rPr>
-                <w:rFonts w:ascii="Calibri" w:hAnsi="Calibri"/>
+                <w:rFonts w:ascii="Liberation Serif" w:hAnsi="Liberation Serif"/>
               </w:rPr>
               <w:t>Estoy afecto al Estatuto Administrativo (Ley 18.834) o Leyes números18.883, 19,070, 19,378 o artículo 332 número 6 del Código Orgánico de Tribunales, respecto de los cuales la obtención de pensión implica la cesación en el cargo.</w:t>
             </w:r>
@@ -1399,13 +1849,14 @@
               <w:spacing w:before="0" w:after="200"/>
               <w:jc w:val="center"/>
               <w:rPr>
+                <w:rFonts w:ascii="Liberation Serif" w:hAnsi="Liberation Serif"/>
                 <w:sz w:val="12"/>
                 <w:szCs w:val="12"/>
               </w:rPr>
             </w:pPr>
             <w:r>
               <w:rPr>
-                <w:rFonts w:ascii="Calibri" w:hAnsi="Calibri"/>
+                <w:rFonts w:ascii="Liberation Serif" w:hAnsi="Liberation Serif"/>
                 <w:sz w:val="12"/>
                 <w:szCs w:val="12"/>
               </w:rPr>
@@ -1426,13 +1877,14 @@
               <w:spacing w:before="0" w:after="200"/>
               <w:jc w:val="center"/>
               <w:rPr>
+                <w:rFonts w:ascii="Liberation Serif" w:hAnsi="Liberation Serif"/>
                 <w:sz w:val="12"/>
                 <w:szCs w:val="12"/>
               </w:rPr>
             </w:pPr>
             <w:r>
               <w:rPr>
-                <w:rFonts w:ascii="Calibri" w:hAnsi="Calibri"/>
+                <w:rFonts w:ascii="Liberation Serif" w:hAnsi="Liberation Serif"/>
                 <w:sz w:val="12"/>
                 <w:szCs w:val="12"/>
               </w:rPr>
@@ -1456,12 +1908,12 @@
               <w:spacing w:before="0" w:after="200"/>
               <w:jc w:val="left"/>
               <w:rPr>
-                <w:rFonts w:ascii="Calibri" w:hAnsi="Calibri"/>
+                <w:rFonts w:ascii="Liberation Serif" w:hAnsi="Liberation Serif"/>
               </w:rPr>
             </w:pPr>
             <w:r>
               <w:rPr>
-                <w:rFonts w:ascii="Calibri" w:hAnsi="Calibri"/>
+                <w:rFonts w:ascii="Liberation Serif" w:hAnsi="Liberation Serif"/>
               </w:rPr>
               <w:t>Destinaré Ahorro Previsional Voluntario al financiamiento de mi pensión.</w:t>
             </w:r>
@@ -1480,13 +1932,14 @@
               <w:spacing w:before="0" w:after="200"/>
               <w:jc w:val="center"/>
               <w:rPr>
+                <w:rFonts w:ascii="Liberation Serif" w:hAnsi="Liberation Serif"/>
                 <w:sz w:val="12"/>
                 <w:szCs w:val="12"/>
               </w:rPr>
             </w:pPr>
             <w:r>
               <w:rPr>
-                <w:rFonts w:ascii="Calibri" w:hAnsi="Calibri"/>
+                <w:rFonts w:ascii="Liberation Serif" w:hAnsi="Liberation Serif"/>
                 <w:sz w:val="12"/>
                 <w:szCs w:val="12"/>
               </w:rPr>
@@ -1507,13 +1960,14 @@
               <w:spacing w:before="0" w:after="200"/>
               <w:jc w:val="center"/>
               <w:rPr>
+                <w:rFonts w:ascii="Liberation Serif" w:hAnsi="Liberation Serif"/>
                 <w:sz w:val="12"/>
                 <w:szCs w:val="12"/>
               </w:rPr>
             </w:pPr>
             <w:r>
               <w:rPr>
-                <w:rFonts w:ascii="Calibri" w:hAnsi="Calibri"/>
+                <w:rFonts w:ascii="Liberation Serif" w:hAnsi="Liberation Serif"/>
                 <w:sz w:val="12"/>
                 <w:szCs w:val="12"/>
               </w:rPr>
@@ -1537,12 +1991,12 @@
               <w:spacing w:before="0" w:after="200"/>
               <w:jc w:val="left"/>
               <w:rPr>
-                <w:rFonts w:ascii="Calibri" w:hAnsi="Calibri"/>
+                <w:rFonts w:ascii="Liberation Serif" w:hAnsi="Liberation Serif"/>
               </w:rPr>
             </w:pPr>
             <w:r>
               <w:rPr>
-                <w:rFonts w:ascii="Calibri" w:hAnsi="Calibri"/>
+                <w:rFonts w:ascii="Liberation Serif" w:hAnsi="Liberation Serif"/>
               </w:rPr>
               <w:t>Destinaré Ahorro Previsional Voluntario Colectivo al financiamiento de mi pensión.</w:t>
             </w:r>
@@ -1561,11 +2015,14 @@
               <w:spacing w:before="0" w:after="200"/>
               <w:jc w:val="center"/>
               <w:rPr>
-                <w:rFonts w:ascii="Calibri" w:hAnsi="Calibri"/>
+                <w:rFonts w:ascii="Liberation Serif" w:hAnsi="Liberation Serif"/>
+                <w:sz w:val="12"/>
+                <w:szCs w:val="12"/>
               </w:rPr>
             </w:pPr>
             <w:r>
               <w:rPr>
+                <w:rFonts w:ascii="Liberation Serif" w:hAnsi="Liberation Serif"/>
                 <w:sz w:val="12"/>
                 <w:szCs w:val="12"/>
               </w:rPr>
@@ -1578,13 +2035,14 @@
               <w:spacing w:before="0" w:after="200"/>
               <w:jc w:val="center"/>
               <w:rPr>
+                <w:rFonts w:ascii="Liberation Serif" w:hAnsi="Liberation Serif"/>
                 <w:sz w:val="12"/>
                 <w:szCs w:val="12"/>
               </w:rPr>
             </w:pPr>
             <w:r>
               <w:rPr>
-                <w:rFonts w:ascii="Calibri" w:hAnsi="Calibri"/>
+                <w:rFonts w:ascii="Liberation Serif" w:hAnsi="Liberation Serif"/>
                 <w:sz w:val="12"/>
                 <w:szCs w:val="12"/>
               </w:rPr>
@@ -1605,11 +2063,14 @@
               <w:spacing w:before="0" w:after="200"/>
               <w:jc w:val="center"/>
               <w:rPr>
-                <w:rFonts w:ascii="Calibri" w:hAnsi="Calibri"/>
+                <w:rFonts w:ascii="Liberation Serif" w:hAnsi="Liberation Serif"/>
+                <w:sz w:val="12"/>
+                <w:szCs w:val="12"/>
               </w:rPr>
             </w:pPr>
             <w:r>
               <w:rPr>
+                <w:rFonts w:ascii="Liberation Serif" w:hAnsi="Liberation Serif"/>
                 <w:sz w:val="12"/>
                 <w:szCs w:val="12"/>
               </w:rPr>
@@ -1622,13 +2083,14 @@
               <w:spacing w:before="0" w:after="200"/>
               <w:jc w:val="center"/>
               <w:rPr>
+                <w:rFonts w:ascii="Liberation Serif" w:hAnsi="Liberation Serif"/>
                 <w:sz w:val="12"/>
                 <w:szCs w:val="12"/>
               </w:rPr>
             </w:pPr>
             <w:r>
               <w:rPr>
-                <w:rFonts w:ascii="Calibri" w:hAnsi="Calibri"/>
+                <w:rFonts w:ascii="Liberation Serif" w:hAnsi="Liberation Serif"/>
                 <w:sz w:val="12"/>
                 <w:szCs w:val="12"/>
               </w:rPr>
@@ -1652,12 +2114,12 @@
               <w:spacing w:before="0" w:after="200"/>
               <w:jc w:val="left"/>
               <w:rPr>
-                <w:rFonts w:ascii="Calibri" w:hAnsi="Calibri"/>
+                <w:rFonts w:ascii="Liberation Serif" w:hAnsi="Liberation Serif"/>
               </w:rPr>
             </w:pPr>
             <w:r>
               <w:rPr>
-                <w:rFonts w:ascii="Calibri" w:hAnsi="Calibri"/>
+                <w:rFonts w:ascii="Liberation Serif" w:hAnsi="Liberation Serif"/>
               </w:rPr>
               <w:t>Traspasaré fondos desde mi Cuenta de Ahorro Voluntario para el financiamiento de mi pensión.</w:t>
             </w:r>
@@ -1676,11 +2138,14 @@
               <w:spacing w:before="0" w:after="200"/>
               <w:jc w:val="center"/>
               <w:rPr>
-                <w:rFonts w:ascii="Calibri" w:hAnsi="Calibri"/>
+                <w:rFonts w:ascii="Liberation Serif" w:hAnsi="Liberation Serif"/>
+                <w:sz w:val="12"/>
+                <w:szCs w:val="12"/>
               </w:rPr>
             </w:pPr>
             <w:r>
               <w:rPr>
+                <w:rFonts w:ascii="Liberation Serif" w:hAnsi="Liberation Serif"/>
                 <w:sz w:val="12"/>
                 <w:szCs w:val="12"/>
               </w:rPr>
@@ -1693,13 +2158,14 @@
               <w:spacing w:before="0" w:after="200"/>
               <w:jc w:val="center"/>
               <w:rPr>
+                <w:rFonts w:ascii="Liberation Serif" w:hAnsi="Liberation Serif"/>
                 <w:sz w:val="12"/>
                 <w:szCs w:val="12"/>
               </w:rPr>
             </w:pPr>
             <w:r>
               <w:rPr>
-                <w:rFonts w:ascii="Calibri" w:hAnsi="Calibri"/>
+                <w:rFonts w:ascii="Liberation Serif" w:hAnsi="Liberation Serif"/>
                 <w:sz w:val="12"/>
                 <w:szCs w:val="12"/>
               </w:rPr>
@@ -1720,11 +2186,14 @@
               <w:spacing w:before="0" w:after="200"/>
               <w:jc w:val="center"/>
               <w:rPr>
-                <w:rFonts w:ascii="Calibri" w:hAnsi="Calibri"/>
+                <w:rFonts w:ascii="Liberation Serif" w:hAnsi="Liberation Serif"/>
+                <w:sz w:val="12"/>
+                <w:szCs w:val="12"/>
               </w:rPr>
             </w:pPr>
             <w:r>
               <w:rPr>
+                <w:rFonts w:ascii="Liberation Serif" w:hAnsi="Liberation Serif"/>
                 <w:sz w:val="12"/>
                 <w:szCs w:val="12"/>
               </w:rPr>
@@ -1737,13 +2206,14 @@
               <w:spacing w:before="0" w:after="200"/>
               <w:jc w:val="center"/>
               <w:rPr>
+                <w:rFonts w:ascii="Liberation Serif" w:hAnsi="Liberation Serif"/>
                 <w:sz w:val="12"/>
                 <w:szCs w:val="12"/>
               </w:rPr>
             </w:pPr>
             <w:r>
               <w:rPr>
-                <w:rFonts w:ascii="Calibri" w:hAnsi="Calibri"/>
+                <w:rFonts w:ascii="Liberation Serif" w:hAnsi="Liberation Serif"/>
                 <w:sz w:val="12"/>
                 <w:szCs w:val="12"/>
               </w:rPr>
@@ -1767,12 +2237,12 @@
               <w:spacing w:before="0" w:after="200"/>
               <w:jc w:val="left"/>
               <w:rPr>
-                <w:rFonts w:ascii="Calibri" w:hAnsi="Calibri"/>
+                <w:rFonts w:ascii="Liberation Serif" w:hAnsi="Liberation Serif"/>
               </w:rPr>
             </w:pPr>
             <w:r>
               <w:rPr>
-                <w:rFonts w:ascii="Calibri" w:hAnsi="Calibri"/>
+                <w:rFonts w:ascii="Liberation Serif" w:hAnsi="Liberation Serif"/>
               </w:rPr>
               <w:t>Poseo depósitos convenidos.</w:t>
             </w:r>
@@ -1791,11 +2261,14 @@
               <w:spacing w:before="0" w:after="200"/>
               <w:jc w:val="center"/>
               <w:rPr>
-                <w:rFonts w:ascii="Calibri" w:hAnsi="Calibri"/>
+                <w:rFonts w:ascii="Liberation Serif" w:hAnsi="Liberation Serif"/>
+                <w:sz w:val="12"/>
+                <w:szCs w:val="12"/>
               </w:rPr>
             </w:pPr>
             <w:r>
               <w:rPr>
+                <w:rFonts w:ascii="Liberation Serif" w:hAnsi="Liberation Serif"/>
                 <w:sz w:val="12"/>
                 <w:szCs w:val="12"/>
               </w:rPr>
@@ -1808,13 +2281,14 @@
               <w:spacing w:before="0" w:after="200"/>
               <w:jc w:val="center"/>
               <w:rPr>
+                <w:rFonts w:ascii="Liberation Serif" w:hAnsi="Liberation Serif"/>
                 <w:sz w:val="12"/>
                 <w:szCs w:val="12"/>
               </w:rPr>
             </w:pPr>
             <w:r>
               <w:rPr>
-                <w:rFonts w:ascii="Calibri" w:hAnsi="Calibri"/>
+                <w:rFonts w:ascii="Liberation Serif" w:hAnsi="Liberation Serif"/>
                 <w:sz w:val="12"/>
                 <w:szCs w:val="12"/>
               </w:rPr>
@@ -1835,11 +2309,14 @@
               <w:spacing w:before="0" w:after="200"/>
               <w:jc w:val="center"/>
               <w:rPr>
-                <w:rFonts w:ascii="Calibri" w:hAnsi="Calibri"/>
+                <w:rFonts w:ascii="Liberation Serif" w:hAnsi="Liberation Serif"/>
+                <w:sz w:val="12"/>
+                <w:szCs w:val="12"/>
               </w:rPr>
             </w:pPr>
             <w:r>
               <w:rPr>
+                <w:rFonts w:ascii="Liberation Serif" w:hAnsi="Liberation Serif"/>
                 <w:sz w:val="12"/>
                 <w:szCs w:val="12"/>
               </w:rPr>
@@ -1852,13 +2329,14 @@
               <w:spacing w:before="0" w:after="200"/>
               <w:jc w:val="center"/>
               <w:rPr>
+                <w:rFonts w:ascii="Liberation Serif" w:hAnsi="Liberation Serif"/>
                 <w:sz w:val="12"/>
                 <w:szCs w:val="12"/>
               </w:rPr>
             </w:pPr>
             <w:r>
               <w:rPr>
-                <w:rFonts w:ascii="Calibri" w:hAnsi="Calibri"/>
+                <w:rFonts w:ascii="Liberation Serif" w:hAnsi="Liberation Serif"/>
                 <w:sz w:val="12"/>
                 <w:szCs w:val="12"/>
               </w:rPr>
@@ -1882,12 +2360,12 @@
               <w:spacing w:before="0" w:after="200"/>
               <w:jc w:val="left"/>
               <w:rPr>
-                <w:rFonts w:ascii="Calibri" w:hAnsi="Calibri"/>
+                <w:rFonts w:ascii="Liberation Serif" w:hAnsi="Liberation Serif"/>
               </w:rPr>
             </w:pPr>
             <w:r>
               <w:rPr>
-                <w:rFonts w:ascii="Calibri" w:hAnsi="Calibri"/>
+                <w:rFonts w:ascii="Liberation Serif" w:hAnsi="Liberation Serif"/>
               </w:rPr>
               <w:t>Traspasaré fondos desde mi Cuenta Individual de Cesantía.</w:t>
             </w:r>
@@ -1906,13 +2384,14 @@
               <w:spacing w:before="0" w:after="200"/>
               <w:jc w:val="center"/>
               <w:rPr>
+                <w:rFonts w:ascii="Liberation Serif" w:hAnsi="Liberation Serif"/>
                 <w:sz w:val="12"/>
                 <w:szCs w:val="12"/>
               </w:rPr>
             </w:pPr>
             <w:r>
               <w:rPr>
-                <w:rFonts w:ascii="Calibri" w:hAnsi="Calibri"/>
+                <w:rFonts w:ascii="Liberation Serif" w:hAnsi="Liberation Serif"/>
                 <w:sz w:val="12"/>
                 <w:szCs w:val="12"/>
               </w:rPr>
@@ -1933,13 +2412,14 @@
               <w:spacing w:before="0" w:after="200"/>
               <w:jc w:val="center"/>
               <w:rPr>
+                <w:rFonts w:ascii="Liberation Serif" w:hAnsi="Liberation Serif"/>
                 <w:sz w:val="12"/>
                 <w:szCs w:val="12"/>
               </w:rPr>
             </w:pPr>
             <w:r>
               <w:rPr>
-                <w:rFonts w:ascii="Calibri" w:hAnsi="Calibri"/>
+                <w:rFonts w:ascii="Liberation Serif" w:hAnsi="Liberation Serif"/>
                 <w:sz w:val="12"/>
                 <w:szCs w:val="12"/>
               </w:rPr>
@@ -1963,12 +2443,12 @@
               <w:spacing w:before="0" w:after="200"/>
               <w:jc w:val="left"/>
               <w:rPr>
-                <w:rFonts w:ascii="Calibri" w:hAnsi="Calibri"/>
+                <w:rFonts w:ascii="Liberation Serif" w:hAnsi="Liberation Serif"/>
               </w:rPr>
             </w:pPr>
             <w:r>
               <w:rPr>
-                <w:rFonts w:ascii="Calibri" w:hAnsi="Calibri"/>
+                <w:rFonts w:ascii="Liberation Serif" w:hAnsi="Liberation Serif"/>
               </w:rPr>
               <w:t>Tengo cotizaciones en otro país.</w:t>
             </w:r>
@@ -1987,11 +2467,14 @@
               <w:spacing w:before="0" w:after="200"/>
               <w:jc w:val="center"/>
               <w:rPr>
-                <w:rFonts w:ascii="Calibri" w:hAnsi="Calibri"/>
+                <w:rFonts w:ascii="Liberation Serif" w:hAnsi="Liberation Serif"/>
+                <w:sz w:val="12"/>
+                <w:szCs w:val="12"/>
               </w:rPr>
             </w:pPr>
             <w:r>
               <w:rPr>
+                <w:rFonts w:ascii="Liberation Serif" w:hAnsi="Liberation Serif"/>
                 <w:sz w:val="12"/>
                 <w:szCs w:val="12"/>
               </w:rPr>
@@ -2004,13 +2487,14 @@
               <w:spacing w:before="0" w:after="200"/>
               <w:jc w:val="center"/>
               <w:rPr>
+                <w:rFonts w:ascii="Liberation Serif" w:hAnsi="Liberation Serif"/>
                 <w:sz w:val="12"/>
                 <w:szCs w:val="12"/>
               </w:rPr>
             </w:pPr>
             <w:r>
               <w:rPr>
-                <w:rFonts w:ascii="Calibri" w:hAnsi="Calibri"/>
+                <w:rFonts w:ascii="Liberation Serif" w:hAnsi="Liberation Serif"/>
                 <w:sz w:val="12"/>
                 <w:szCs w:val="12"/>
               </w:rPr>
@@ -2031,11 +2515,14 @@
               <w:spacing w:before="0" w:after="200"/>
               <w:jc w:val="center"/>
               <w:rPr>
-                <w:rFonts w:ascii="Calibri" w:hAnsi="Calibri"/>
+                <w:rFonts w:ascii="Liberation Serif" w:hAnsi="Liberation Serif"/>
+                <w:sz w:val="12"/>
+                <w:szCs w:val="12"/>
               </w:rPr>
             </w:pPr>
             <w:r>
               <w:rPr>
+                <w:rFonts w:ascii="Liberation Serif" w:hAnsi="Liberation Serif"/>
                 <w:sz w:val="12"/>
                 <w:szCs w:val="12"/>
               </w:rPr>
@@ -2048,13 +2535,14 @@
               <w:spacing w:before="0" w:after="200"/>
               <w:jc w:val="center"/>
               <w:rPr>
+                <w:rFonts w:ascii="Liberation Serif" w:hAnsi="Liberation Serif"/>
                 <w:sz w:val="12"/>
                 <w:szCs w:val="12"/>
               </w:rPr>
             </w:pPr>
             <w:r>
               <w:rPr>
-                <w:rFonts w:ascii="Calibri" w:hAnsi="Calibri"/>
+                <w:rFonts w:ascii="Liberation Serif" w:hAnsi="Liberation Serif"/>
                 <w:sz w:val="12"/>
                 <w:szCs w:val="12"/>
               </w:rPr>
@@ -2078,12 +2566,12 @@
               <w:spacing w:before="0" w:after="200"/>
               <w:jc w:val="left"/>
               <w:rPr>
-                <w:rFonts w:ascii="Calibri" w:hAnsi="Calibri"/>
+                <w:rFonts w:ascii="Liberation Serif" w:hAnsi="Liberation Serif"/>
               </w:rPr>
             </w:pPr>
             <w:r>
               <w:rPr>
-                <w:rFonts w:ascii="Calibri" w:hAnsi="Calibri"/>
+                <w:rFonts w:ascii="Liberation Serif" w:hAnsi="Liberation Serif"/>
               </w:rPr>
               <w:t>Tengo períodos de residencia en otro país.</w:t>
             </w:r>
@@ -2102,11 +2590,14 @@
               <w:spacing w:before="0" w:after="200"/>
               <w:jc w:val="center"/>
               <w:rPr>
-                <w:rFonts w:ascii="Calibri" w:hAnsi="Calibri"/>
+                <w:rFonts w:ascii="Liberation Serif" w:hAnsi="Liberation Serif"/>
+                <w:sz w:val="12"/>
+                <w:szCs w:val="12"/>
               </w:rPr>
             </w:pPr>
             <w:r>
               <w:rPr>
+                <w:rFonts w:ascii="Liberation Serif" w:hAnsi="Liberation Serif"/>
                 <w:sz w:val="12"/>
                 <w:szCs w:val="12"/>
               </w:rPr>
@@ -2119,13 +2610,14 @@
               <w:spacing w:before="0" w:after="200"/>
               <w:jc w:val="center"/>
               <w:rPr>
+                <w:rFonts w:ascii="Liberation Serif" w:hAnsi="Liberation Serif"/>
                 <w:sz w:val="12"/>
                 <w:szCs w:val="12"/>
               </w:rPr>
             </w:pPr>
             <w:r>
               <w:rPr>
-                <w:rFonts w:ascii="Calibri" w:hAnsi="Calibri"/>
+                <w:rFonts w:ascii="Liberation Serif" w:hAnsi="Liberation Serif"/>
                 <w:sz w:val="12"/>
                 <w:szCs w:val="12"/>
               </w:rPr>
@@ -2146,11 +2638,14 @@
               <w:spacing w:before="0" w:after="200"/>
               <w:jc w:val="center"/>
               <w:rPr>
-                <w:rFonts w:ascii="Calibri" w:hAnsi="Calibri"/>
+                <w:rFonts w:ascii="Liberation Serif" w:hAnsi="Liberation Serif"/>
+                <w:sz w:val="12"/>
+                <w:szCs w:val="12"/>
               </w:rPr>
             </w:pPr>
             <w:r>
               <w:rPr>
+                <w:rFonts w:ascii="Liberation Serif" w:hAnsi="Liberation Serif"/>
                 <w:sz w:val="12"/>
                 <w:szCs w:val="12"/>
               </w:rPr>
@@ -2163,13 +2658,14 @@
               <w:spacing w:before="0" w:after="200"/>
               <w:jc w:val="center"/>
               <w:rPr>
+                <w:rFonts w:ascii="Liberation Serif" w:hAnsi="Liberation Serif"/>
                 <w:sz w:val="12"/>
                 <w:szCs w:val="12"/>
               </w:rPr>
             </w:pPr>
             <w:r>
               <w:rPr>
-                <w:rFonts w:ascii="Calibri" w:hAnsi="Calibri"/>
+                <w:rFonts w:ascii="Liberation Serif" w:hAnsi="Liberation Serif"/>
                 <w:sz w:val="12"/>
                 <w:szCs w:val="12"/>
               </w:rPr>
@@ -2193,12 +2689,12 @@
               <w:spacing w:before="0" w:after="200"/>
               <w:jc w:val="left"/>
               <w:rPr>
-                <w:rFonts w:ascii="Calibri" w:hAnsi="Calibri"/>
+                <w:rFonts w:ascii="Liberation Serif" w:hAnsi="Liberation Serif"/>
               </w:rPr>
             </w:pPr>
             <w:r>
               <w:rPr>
-                <w:rFonts w:ascii="Calibri" w:hAnsi="Calibri"/>
+                <w:rFonts w:ascii="Liberation Serif" w:hAnsi="Liberation Serif"/>
               </w:rPr>
               <w:t>Deseo cambiar de Tipo de Fondo.</w:t>
             </w:r>
@@ -2217,11 +2713,14 @@
               <w:spacing w:before="0" w:after="200"/>
               <w:jc w:val="center"/>
               <w:rPr>
-                <w:rFonts w:ascii="Calibri" w:hAnsi="Calibri"/>
+                <w:rFonts w:ascii="Liberation Serif" w:hAnsi="Liberation Serif"/>
+                <w:sz w:val="12"/>
+                <w:szCs w:val="12"/>
               </w:rPr>
             </w:pPr>
             <w:r>
               <w:rPr>
+                <w:rFonts w:ascii="Liberation Serif" w:hAnsi="Liberation Serif"/>
                 <w:sz w:val="12"/>
                 <w:szCs w:val="12"/>
               </w:rPr>
@@ -2234,13 +2733,14 @@
               <w:spacing w:before="0" w:after="200"/>
               <w:jc w:val="center"/>
               <w:rPr>
+                <w:rFonts w:ascii="Liberation Serif" w:hAnsi="Liberation Serif"/>
                 <w:sz w:val="12"/>
                 <w:szCs w:val="12"/>
               </w:rPr>
             </w:pPr>
             <w:r>
               <w:rPr>
-                <w:rFonts w:ascii="Calibri" w:hAnsi="Calibri"/>
+                <w:rFonts w:ascii="Liberation Serif" w:hAnsi="Liberation Serif"/>
                 <w:sz w:val="12"/>
                 <w:szCs w:val="12"/>
               </w:rPr>
@@ -2261,11 +2761,14 @@
               <w:spacing w:before="0" w:after="200"/>
               <w:jc w:val="center"/>
               <w:rPr>
-                <w:rFonts w:ascii="Calibri" w:hAnsi="Calibri"/>
+                <w:rFonts w:ascii="Liberation Serif" w:hAnsi="Liberation Serif"/>
+                <w:sz w:val="12"/>
+                <w:szCs w:val="12"/>
               </w:rPr>
             </w:pPr>
             <w:r>
               <w:rPr>
+                <w:rFonts w:ascii="Liberation Serif" w:hAnsi="Liberation Serif"/>
                 <w:sz w:val="12"/>
                 <w:szCs w:val="12"/>
               </w:rPr>
@@ -2278,13 +2781,14 @@
               <w:spacing w:before="0" w:after="200"/>
               <w:jc w:val="center"/>
               <w:rPr>
+                <w:rFonts w:ascii="Liberation Serif" w:hAnsi="Liberation Serif"/>
                 <w:sz w:val="12"/>
                 <w:szCs w:val="12"/>
               </w:rPr>
             </w:pPr>
             <w:r>
               <w:rPr>
-                <w:rFonts w:ascii="Calibri" w:hAnsi="Calibri"/>
+                <w:rFonts w:ascii="Liberation Serif" w:hAnsi="Liberation Serif"/>
                 <w:sz w:val="12"/>
                 <w:szCs w:val="12"/>
               </w:rPr>
@@ -2308,12 +2812,12 @@
               <w:spacing w:before="0" w:after="200"/>
               <w:jc w:val="left"/>
               <w:rPr>
-                <w:rFonts w:ascii="Calibri" w:hAnsi="Calibri"/>
+                <w:rFonts w:ascii="Liberation Serif" w:hAnsi="Liberation Serif"/>
               </w:rPr>
             </w:pPr>
             <w:r>
               <w:rPr>
-                <w:rFonts w:ascii="Calibri" w:hAnsi="Calibri"/>
+                <w:rFonts w:ascii="Liberation Serif" w:hAnsi="Liberation Serif"/>
               </w:rPr>
               <w:t>Deseo que mis datos personales (nombre, Rut, dirección, saldo cuenta capitalización individual, bono de reconocimiento) y los datos de mis beneficiarios de pensión, aparezcan en un LISTADO PÚBLICO DE INFORMACIÓN.</w:t>
             </w:r>
@@ -2332,11 +2836,14 @@
               <w:spacing w:before="0" w:after="200"/>
               <w:jc w:val="center"/>
               <w:rPr>
-                <w:rFonts w:ascii="Calibri" w:hAnsi="Calibri"/>
+                <w:rFonts w:ascii="Liberation Serif" w:hAnsi="Liberation Serif"/>
+                <w:sz w:val="12"/>
+                <w:szCs w:val="12"/>
               </w:rPr>
             </w:pPr>
             <w:r>
               <w:rPr>
+                <w:rFonts w:ascii="Liberation Serif" w:hAnsi="Liberation Serif"/>
                 <w:sz w:val="12"/>
                 <w:szCs w:val="12"/>
               </w:rPr>
@@ -2349,13 +2856,14 @@
               <w:spacing w:before="0" w:after="200"/>
               <w:jc w:val="center"/>
               <w:rPr>
+                <w:rFonts w:ascii="Liberation Serif" w:hAnsi="Liberation Serif"/>
                 <w:sz w:val="12"/>
                 <w:szCs w:val="12"/>
               </w:rPr>
             </w:pPr>
             <w:r>
               <w:rPr>
-                <w:rFonts w:ascii="Calibri" w:hAnsi="Calibri"/>
+                <w:rFonts w:ascii="Liberation Serif" w:hAnsi="Liberation Serif"/>
                 <w:sz w:val="12"/>
                 <w:szCs w:val="12"/>
               </w:rPr>
@@ -2376,11 +2884,14 @@
               <w:spacing w:before="0" w:after="200"/>
               <w:jc w:val="center"/>
               <w:rPr>
-                <w:rFonts w:ascii="Calibri" w:hAnsi="Calibri"/>
+                <w:rFonts w:ascii="Liberation Serif" w:hAnsi="Liberation Serif"/>
+                <w:sz w:val="12"/>
+                <w:szCs w:val="12"/>
               </w:rPr>
             </w:pPr>
             <w:r>
               <w:rPr>
+                <w:rFonts w:ascii="Liberation Serif" w:hAnsi="Liberation Serif"/>
                 <w:sz w:val="12"/>
                 <w:szCs w:val="12"/>
               </w:rPr>
@@ -2393,13 +2904,14 @@
               <w:spacing w:before="0" w:after="200"/>
               <w:jc w:val="center"/>
               <w:rPr>
+                <w:rFonts w:ascii="Liberation Serif" w:hAnsi="Liberation Serif"/>
                 <w:sz w:val="12"/>
                 <w:szCs w:val="12"/>
               </w:rPr>
             </w:pPr>
             <w:r>
               <w:rPr>
-                <w:rFonts w:ascii="Calibri" w:hAnsi="Calibri"/>
+                <w:rFonts w:ascii="Liberation Serif" w:hAnsi="Liberation Serif"/>
                 <w:sz w:val="12"/>
                 <w:szCs w:val="12"/>
               </w:rPr>
@@ -2413,12 +2925,12 @@
       <w:pPr>
         <w:pStyle w:val="Normal"/>
         <w:rPr>
-          <w:rFonts w:ascii="Calibri" w:hAnsi="Calibri"/>
+          <w:rFonts w:ascii="Liberation Serif" w:hAnsi="Liberation Serif"/>
         </w:rPr>
       </w:pPr>
       <w:r>
         <w:rPr>
-          <w:rFonts w:ascii="Calibri" w:hAnsi="Calibri"/>
+          <w:rFonts w:ascii="Liberation Serif" w:hAnsi="Liberation Serif"/>
         </w:rPr>
       </w:r>
     </w:p>
@@ -2426,12 +2938,12 @@
       <w:pPr>
         <w:pStyle w:val="Normal"/>
         <w:rPr>
-          <w:rFonts w:ascii="Calibri" w:hAnsi="Calibri"/>
+          <w:rFonts w:ascii="Liberation Serif" w:hAnsi="Liberation Serif"/>
         </w:rPr>
       </w:pPr>
       <w:r>
         <w:rPr>
-          <w:rFonts w:ascii="Calibri" w:hAnsi="Calibri"/>
+          <w:rFonts w:ascii="Liberation Serif" w:hAnsi="Liberation Serif"/>
         </w:rPr>
         <w:t>Asimismo, autorizo al mandatario para:</w:t>
       </w:r>
@@ -2469,12 +2981,12 @@
               <w:spacing w:before="0" w:after="200"/>
               <w:jc w:val="center"/>
               <w:rPr>
-                <w:rFonts w:ascii="Calibri" w:hAnsi="Calibri"/>
+                <w:rFonts w:ascii="Liberation Serif" w:hAnsi="Liberation Serif"/>
               </w:rPr>
             </w:pPr>
             <w:r>
               <w:rPr>
-                <w:rFonts w:ascii="Calibri" w:hAnsi="Calibri"/>
+                <w:rFonts w:ascii="Liberation Serif" w:hAnsi="Liberation Serif"/>
               </w:rPr>
             </w:r>
           </w:p>
@@ -2492,12 +3004,12 @@
               <w:spacing w:before="0" w:after="200"/>
               <w:jc w:val="center"/>
               <w:rPr>
-                <w:rFonts w:ascii="Calibri" w:hAnsi="Calibri"/>
+                <w:rFonts w:ascii="Liberation Serif" w:hAnsi="Liberation Serif"/>
               </w:rPr>
             </w:pPr>
             <w:r>
               <w:rPr>
-                <w:rFonts w:ascii="Calibri" w:hAnsi="Calibri"/>
+                <w:rFonts w:ascii="Liberation Serif" w:hAnsi="Liberation Serif"/>
               </w:rPr>
               <w:t>Sí</w:t>
             </w:r>
@@ -2516,12 +3028,12 @@
               <w:spacing w:before="0" w:after="200"/>
               <w:jc w:val="center"/>
               <w:rPr>
-                <w:rFonts w:ascii="Calibri" w:hAnsi="Calibri"/>
+                <w:rFonts w:ascii="Liberation Serif" w:hAnsi="Liberation Serif"/>
               </w:rPr>
             </w:pPr>
             <w:r>
               <w:rPr>
-                <w:rFonts w:ascii="Calibri" w:hAnsi="Calibri"/>
+                <w:rFonts w:ascii="Liberation Serif" w:hAnsi="Liberation Serif"/>
               </w:rPr>
               <w:t>No</w:t>
             </w:r>
@@ -2543,12 +3055,12 @@
               <w:spacing w:before="0" w:after="200"/>
               <w:jc w:val="left"/>
               <w:rPr>
-                <w:rFonts w:ascii="Calibri" w:hAnsi="Calibri"/>
+                <w:rFonts w:ascii="Liberation Serif" w:hAnsi="Liberation Serif"/>
               </w:rPr>
             </w:pPr>
             <w:r>
               <w:rPr>
-                <w:rFonts w:ascii="Calibri" w:hAnsi="Calibri"/>
+                <w:rFonts w:ascii="Liberation Serif" w:hAnsi="Liberation Serif"/>
               </w:rPr>
               <w:t>Suscribir solicitud de Bono de Reconocimiento</w:t>
             </w:r>
@@ -2567,13 +3079,14 @@
               <w:spacing w:before="0" w:after="200"/>
               <w:jc w:val="center"/>
               <w:rPr>
+                <w:rFonts w:ascii="Liberation Serif" w:hAnsi="Liberation Serif"/>
                 <w:sz w:val="12"/>
                 <w:szCs w:val="12"/>
               </w:rPr>
             </w:pPr>
             <w:r>
               <w:rPr>
-                <w:rFonts w:ascii="Calibri" w:hAnsi="Calibri"/>
+                <w:rFonts w:ascii="Liberation Serif" w:hAnsi="Liberation Serif"/>
                 <w:sz w:val="12"/>
                 <w:szCs w:val="12"/>
               </w:rPr>
@@ -2594,13 +3107,14 @@
               <w:spacing w:before="0" w:after="200"/>
               <w:jc w:val="center"/>
               <w:rPr>
+                <w:rFonts w:ascii="Liberation Serif" w:hAnsi="Liberation Serif"/>
                 <w:sz w:val="12"/>
                 <w:szCs w:val="12"/>
               </w:rPr>
             </w:pPr>
             <w:r>
               <w:rPr>
-                <w:rFonts w:ascii="Calibri" w:hAnsi="Calibri"/>
+                <w:rFonts w:ascii="Liberation Serif" w:hAnsi="Liberation Serif"/>
                 <w:sz w:val="12"/>
                 <w:szCs w:val="12"/>
               </w:rPr>
@@ -2624,12 +3138,12 @@
               <w:spacing w:before="0" w:after="200"/>
               <w:jc w:val="left"/>
               <w:rPr>
-                <w:rFonts w:ascii="Calibri" w:hAnsi="Calibri"/>
+                <w:rFonts w:ascii="Liberation Serif" w:hAnsi="Liberation Serif"/>
               </w:rPr>
             </w:pPr>
             <w:r>
               <w:rPr>
-                <w:rFonts w:ascii="Calibri" w:hAnsi="Calibri"/>
+                <w:rFonts w:ascii="Liberation Serif" w:hAnsi="Liberation Serif"/>
               </w:rPr>
               <w:t>Solicitar información respecto del estado del trámite de pensión</w:t>
             </w:r>
@@ -2648,13 +3162,14 @@
               <w:spacing w:before="0" w:after="200"/>
               <w:jc w:val="center"/>
               <w:rPr>
+                <w:rFonts w:ascii="Liberation Serif" w:hAnsi="Liberation Serif"/>
                 <w:sz w:val="12"/>
                 <w:szCs w:val="12"/>
               </w:rPr>
             </w:pPr>
             <w:r>
               <w:rPr>
-                <w:rFonts w:ascii="Calibri" w:hAnsi="Calibri"/>
+                <w:rFonts w:ascii="Liberation Serif" w:hAnsi="Liberation Serif"/>
                 <w:sz w:val="12"/>
                 <w:szCs w:val="12"/>
               </w:rPr>
@@ -2675,13 +3190,14 @@
               <w:spacing w:before="0" w:after="200"/>
               <w:jc w:val="center"/>
               <w:rPr>
+                <w:rFonts w:ascii="Liberation Serif" w:hAnsi="Liberation Serif"/>
                 <w:sz w:val="12"/>
                 <w:szCs w:val="12"/>
               </w:rPr>
             </w:pPr>
             <w:r>
               <w:rPr>
-                <w:rFonts w:ascii="Calibri" w:hAnsi="Calibri"/>
+                <w:rFonts w:ascii="Liberation Serif" w:hAnsi="Liberation Serif"/>
                 <w:sz w:val="12"/>
                 <w:szCs w:val="12"/>
               </w:rPr>
@@ -2705,12 +3221,12 @@
               <w:spacing w:before="0" w:after="200"/>
               <w:jc w:val="left"/>
               <w:rPr>
-                <w:rFonts w:ascii="Calibri" w:hAnsi="Calibri"/>
+                <w:rFonts w:ascii="Liberation Serif" w:hAnsi="Liberation Serif"/>
               </w:rPr>
             </w:pPr>
             <w:r>
               <w:rPr>
-                <w:rFonts w:ascii="Calibri" w:hAnsi="Calibri"/>
+                <w:rFonts w:ascii="Liberation Serif" w:hAnsi="Liberation Serif"/>
               </w:rPr>
               <w:t>Retirar en la AFP el Certificado de Saldo</w:t>
             </w:r>
@@ -2729,13 +3245,14 @@
               <w:spacing w:before="0" w:after="200"/>
               <w:jc w:val="center"/>
               <w:rPr>
+                <w:rFonts w:ascii="Liberation Serif" w:hAnsi="Liberation Serif"/>
                 <w:sz w:val="12"/>
                 <w:szCs w:val="12"/>
               </w:rPr>
             </w:pPr>
             <w:r>
               <w:rPr>
-                <w:rFonts w:ascii="Calibri" w:hAnsi="Calibri"/>
+                <w:rFonts w:ascii="Liberation Serif" w:hAnsi="Liberation Serif"/>
                 <w:sz w:val="12"/>
                 <w:szCs w:val="12"/>
               </w:rPr>
@@ -2756,13 +3273,14 @@
               <w:spacing w:before="0" w:after="200"/>
               <w:jc w:val="center"/>
               <w:rPr>
+                <w:rFonts w:ascii="Liberation Serif" w:hAnsi="Liberation Serif"/>
                 <w:sz w:val="12"/>
                 <w:szCs w:val="12"/>
               </w:rPr>
             </w:pPr>
             <w:r>
               <w:rPr>
-                <w:rFonts w:ascii="Calibri" w:hAnsi="Calibri"/>
+                <w:rFonts w:ascii="Liberation Serif" w:hAnsi="Liberation Serif"/>
                 <w:sz w:val="12"/>
                 <w:szCs w:val="12"/>
               </w:rPr>
@@ -2786,12 +3304,12 @@
               <w:spacing w:before="0" w:after="200"/>
               <w:jc w:val="left"/>
               <w:rPr>
-                <w:rFonts w:ascii="Calibri" w:hAnsi="Calibri"/>
+                <w:rFonts w:ascii="Liberation Serif" w:hAnsi="Liberation Serif"/>
               </w:rPr>
             </w:pPr>
             <w:r>
               <w:rPr>
-                <w:rFonts w:ascii="Calibri" w:hAnsi="Calibri"/>
+                <w:rFonts w:ascii="Liberation Serif" w:hAnsi="Liberation Serif"/>
               </w:rPr>
               <w:t>Suscribir formulario "Destino de Cotizaciones Voluntarias"</w:t>
             </w:r>
@@ -2810,13 +3328,14 @@
               <w:spacing w:before="0" w:after="200"/>
               <w:jc w:val="center"/>
               <w:rPr>
+                <w:rFonts w:ascii="Liberation Serif" w:hAnsi="Liberation Serif"/>
                 <w:sz w:val="12"/>
                 <w:szCs w:val="12"/>
               </w:rPr>
             </w:pPr>
             <w:r>
               <w:rPr>
-                <w:rFonts w:ascii="Calibri" w:hAnsi="Calibri"/>
+                <w:rFonts w:ascii="Liberation Serif" w:hAnsi="Liberation Serif"/>
                 <w:sz w:val="12"/>
                 <w:szCs w:val="12"/>
               </w:rPr>
@@ -2837,13 +3356,14 @@
               <w:spacing w:before="0" w:after="200"/>
               <w:jc w:val="center"/>
               <w:rPr>
+                <w:rFonts w:ascii="Liberation Serif" w:hAnsi="Liberation Serif"/>
                 <w:sz w:val="12"/>
                 <w:szCs w:val="12"/>
               </w:rPr>
             </w:pPr>
             <w:r>
               <w:rPr>
-                <w:rFonts w:ascii="Calibri" w:hAnsi="Calibri"/>
+                <w:rFonts w:ascii="Liberation Serif" w:hAnsi="Liberation Serif"/>
                 <w:sz w:val="12"/>
                 <w:szCs w:val="12"/>
               </w:rPr>
@@ -2867,12 +3387,12 @@
               <w:spacing w:before="0" w:after="200"/>
               <w:jc w:val="left"/>
               <w:rPr>
-                <w:rFonts w:ascii="Calibri" w:hAnsi="Calibri"/>
+                <w:rFonts w:ascii="Liberation Serif" w:hAnsi="Liberation Serif"/>
               </w:rPr>
             </w:pPr>
             <w:r>
               <w:rPr>
-                <w:rFonts w:ascii="Calibri" w:hAnsi="Calibri"/>
+                <w:rFonts w:ascii="Liberation Serif" w:hAnsi="Liberation Serif"/>
               </w:rPr>
               <w:t>Suscribir formulario "Transferencia de Fondos desde la Cuenta de Ahorro Voluntario"</w:t>
             </w:r>
@@ -2891,13 +3411,14 @@
               <w:spacing w:before="0" w:after="200"/>
               <w:jc w:val="center"/>
               <w:rPr>
+                <w:rFonts w:ascii="Liberation Serif" w:hAnsi="Liberation Serif"/>
                 <w:sz w:val="12"/>
                 <w:szCs w:val="12"/>
               </w:rPr>
             </w:pPr>
             <w:r>
               <w:rPr>
-                <w:rFonts w:ascii="Calibri" w:hAnsi="Calibri"/>
+                <w:rFonts w:ascii="Liberation Serif" w:hAnsi="Liberation Serif"/>
                 <w:sz w:val="12"/>
                 <w:szCs w:val="12"/>
               </w:rPr>
@@ -2918,13 +3439,14 @@
               <w:spacing w:before="0" w:after="200"/>
               <w:jc w:val="center"/>
               <w:rPr>
+                <w:rFonts w:ascii="Liberation Serif" w:hAnsi="Liberation Serif"/>
                 <w:sz w:val="12"/>
                 <w:szCs w:val="12"/>
               </w:rPr>
             </w:pPr>
             <w:r>
               <w:rPr>
-                <w:rFonts w:ascii="Calibri" w:hAnsi="Calibri"/>
+                <w:rFonts w:ascii="Liberation Serif" w:hAnsi="Liberation Serif"/>
                 <w:sz w:val="12"/>
                 <w:szCs w:val="12"/>
               </w:rPr>
@@ -2948,12 +3470,12 @@
               <w:spacing w:before="0" w:after="200"/>
               <w:jc w:val="left"/>
               <w:rPr>
-                <w:rFonts w:ascii="Calibri" w:hAnsi="Calibri"/>
+                <w:rFonts w:ascii="Liberation Serif" w:hAnsi="Liberation Serif"/>
               </w:rPr>
             </w:pPr>
             <w:r>
               <w:rPr>
-                <w:rFonts w:ascii="Calibri" w:hAnsi="Calibri"/>
+                <w:rFonts w:ascii="Liberation Serif" w:hAnsi="Liberation Serif"/>
               </w:rPr>
               <w:t>Suscribir formulario "Selección de Alternativas de Ahorro Previsional Voluntario"</w:t>
             </w:r>
@@ -2972,13 +3494,14 @@
               <w:spacing w:before="0" w:after="200"/>
               <w:jc w:val="center"/>
               <w:rPr>
+                <w:rFonts w:ascii="Liberation Serif" w:hAnsi="Liberation Serif"/>
                 <w:sz w:val="12"/>
                 <w:szCs w:val="12"/>
               </w:rPr>
             </w:pPr>
             <w:r>
               <w:rPr>
-                <w:rFonts w:ascii="Calibri" w:hAnsi="Calibri"/>
+                <w:rFonts w:ascii="Liberation Serif" w:hAnsi="Liberation Serif"/>
                 <w:sz w:val="12"/>
                 <w:szCs w:val="12"/>
               </w:rPr>
@@ -2999,13 +3522,14 @@
               <w:spacing w:before="0" w:after="200"/>
               <w:jc w:val="center"/>
               <w:rPr>
+                <w:rFonts w:ascii="Liberation Serif" w:hAnsi="Liberation Serif"/>
                 <w:sz w:val="12"/>
                 <w:szCs w:val="12"/>
               </w:rPr>
             </w:pPr>
             <w:r>
               <w:rPr>
-                <w:rFonts w:ascii="Calibri" w:hAnsi="Calibri"/>
+                <w:rFonts w:ascii="Liberation Serif" w:hAnsi="Liberation Serif"/>
                 <w:sz w:val="12"/>
                 <w:szCs w:val="12"/>
               </w:rPr>
@@ -3029,12 +3553,12 @@
               <w:spacing w:before="0" w:after="200"/>
               <w:jc w:val="left"/>
               <w:rPr>
-                <w:rFonts w:ascii="Calibri" w:hAnsi="Calibri"/>
+                <w:rFonts w:ascii="Liberation Serif" w:hAnsi="Liberation Serif"/>
               </w:rPr>
             </w:pPr>
             <w:r>
               <w:rPr>
-                <w:rFonts w:ascii="Calibri" w:hAnsi="Calibri"/>
+                <w:rFonts w:ascii="Liberation Serif" w:hAnsi="Liberation Serif"/>
               </w:rPr>
               <w:t>Suscribir solicitud de cambio de modalidad de pensión</w:t>
             </w:r>
@@ -3053,13 +3577,14 @@
               <w:spacing w:before="0" w:after="200"/>
               <w:jc w:val="center"/>
               <w:rPr>
+                <w:rFonts w:ascii="Liberation Serif" w:hAnsi="Liberation Serif"/>
                 <w:sz w:val="12"/>
                 <w:szCs w:val="12"/>
               </w:rPr>
             </w:pPr>
             <w:r>
               <w:rPr>
-                <w:rFonts w:ascii="Calibri" w:hAnsi="Calibri"/>
+                <w:rFonts w:ascii="Liberation Serif" w:hAnsi="Liberation Serif"/>
                 <w:sz w:val="12"/>
                 <w:szCs w:val="12"/>
               </w:rPr>
@@ -3080,13 +3605,14 @@
               <w:spacing w:before="0" w:after="200"/>
               <w:jc w:val="center"/>
               <w:rPr>
+                <w:rFonts w:ascii="Liberation Serif" w:hAnsi="Liberation Serif"/>
                 <w:sz w:val="12"/>
                 <w:szCs w:val="12"/>
               </w:rPr>
             </w:pPr>
             <w:r>
               <w:rPr>
-                <w:rFonts w:ascii="Calibri" w:hAnsi="Calibri"/>
+                <w:rFonts w:ascii="Liberation Serif" w:hAnsi="Liberation Serif"/>
                 <w:sz w:val="12"/>
                 <w:szCs w:val="12"/>
               </w:rPr>
@@ -3110,12 +3636,12 @@
               <w:spacing w:before="0" w:after="200"/>
               <w:jc w:val="left"/>
               <w:rPr>
-                <w:rFonts w:ascii="Calibri" w:hAnsi="Calibri"/>
+                <w:rFonts w:ascii="Liberation Serif" w:hAnsi="Liberation Serif"/>
               </w:rPr>
             </w:pPr>
             <w:r>
               <w:rPr>
-                <w:rFonts w:ascii="Calibri" w:hAnsi="Calibri"/>
+                <w:rFonts w:ascii="Liberation Serif" w:hAnsi="Liberation Serif"/>
               </w:rPr>
               <w:t>Suscribir solicitud de cálculo de excedente de libre disposición</w:t>
             </w:r>
@@ -3134,13 +3660,14 @@
               <w:spacing w:before="0" w:after="200"/>
               <w:jc w:val="center"/>
               <w:rPr>
+                <w:rFonts w:ascii="Liberation Serif" w:hAnsi="Liberation Serif"/>
                 <w:sz w:val="12"/>
                 <w:szCs w:val="12"/>
               </w:rPr>
             </w:pPr>
             <w:r>
               <w:rPr>
-                <w:rFonts w:ascii="Calibri" w:hAnsi="Calibri"/>
+                <w:rFonts w:ascii="Liberation Serif" w:hAnsi="Liberation Serif"/>
                 <w:sz w:val="12"/>
                 <w:szCs w:val="12"/>
               </w:rPr>
@@ -3161,13 +3688,14 @@
               <w:spacing w:before="0" w:after="200"/>
               <w:jc w:val="center"/>
               <w:rPr>
+                <w:rFonts w:ascii="Liberation Serif" w:hAnsi="Liberation Serif"/>
                 <w:sz w:val="12"/>
                 <w:szCs w:val="12"/>
               </w:rPr>
             </w:pPr>
             <w:r>
               <w:rPr>
-                <w:rFonts w:ascii="Calibri" w:hAnsi="Calibri"/>
+                <w:rFonts w:ascii="Liberation Serif" w:hAnsi="Liberation Serif"/>
                 <w:sz w:val="12"/>
                 <w:szCs w:val="12"/>
               </w:rPr>
@@ -3191,12 +3719,12 @@
               <w:spacing w:before="0" w:after="200"/>
               <w:jc w:val="left"/>
               <w:rPr>
-                <w:rFonts w:ascii="Calibri" w:hAnsi="Calibri"/>
+                <w:rFonts w:ascii="Liberation Serif" w:hAnsi="Liberation Serif"/>
               </w:rPr>
             </w:pPr>
             <w:r>
               <w:rPr>
-                <w:rFonts w:ascii="Calibri" w:hAnsi="Calibri"/>
+                <w:rFonts w:ascii="Liberation Serif" w:hAnsi="Liberation Serif"/>
               </w:rPr>
               <w:t>Suscribir opción por mantener el valor nominal del saldo destinado a pensión</w:t>
             </w:r>
@@ -3215,13 +3743,14 @@
               <w:spacing w:before="0" w:after="200"/>
               <w:jc w:val="center"/>
               <w:rPr>
+                <w:rFonts w:ascii="Liberation Serif" w:hAnsi="Liberation Serif"/>
                 <w:sz w:val="12"/>
                 <w:szCs w:val="12"/>
               </w:rPr>
             </w:pPr>
             <w:r>
               <w:rPr>
-                <w:rFonts w:ascii="Calibri" w:hAnsi="Calibri"/>
+                <w:rFonts w:ascii="Liberation Serif" w:hAnsi="Liberation Serif"/>
                 <w:sz w:val="12"/>
                 <w:szCs w:val="12"/>
               </w:rPr>
@@ -3242,13 +3771,14 @@
               <w:spacing w:before="0" w:after="200"/>
               <w:jc w:val="center"/>
               <w:rPr>
+                <w:rFonts w:ascii="Liberation Serif" w:hAnsi="Liberation Serif"/>
                 <w:sz w:val="12"/>
                 <w:szCs w:val="12"/>
               </w:rPr>
             </w:pPr>
             <w:r>
               <w:rPr>
-                <w:rFonts w:ascii="Calibri" w:hAnsi="Calibri"/>
+                <w:rFonts w:ascii="Liberation Serif" w:hAnsi="Liberation Serif"/>
                 <w:sz w:val="12"/>
                 <w:szCs w:val="12"/>
               </w:rPr>
@@ -3262,12 +3792,12 @@
       <w:pPr>
         <w:pStyle w:val="Normal"/>
         <w:rPr>
-          <w:rFonts w:ascii="Calibri" w:hAnsi="Calibri"/>
+          <w:rFonts w:ascii="Liberation Serif" w:hAnsi="Liberation Serif"/>
         </w:rPr>
       </w:pPr>
       <w:r>
         <w:rPr>
-          <w:rFonts w:ascii="Calibri" w:hAnsi="Calibri"/>
+          <w:rFonts w:ascii="Liberation Serif" w:hAnsi="Liberation Serif"/>
         </w:rPr>
       </w:r>
     </w:p>
@@ -3275,11 +3805,13 @@
       <w:pPr>
         <w:pStyle w:val="Normal"/>
         <w:jc w:val="both"/>
-        <w:rPr/>
+        <w:rPr>
+          <w:rFonts w:ascii="Liberation Serif" w:hAnsi="Liberation Serif"/>
+        </w:rPr>
       </w:pPr>
       <w:r>
         <w:rPr>
-          <w:rFonts w:ascii="Calibri" w:hAnsi="Calibri"/>
+          <w:rFonts w:ascii="Liberation Serif" w:hAnsi="Liberation Serif"/>
         </w:rPr>
         <w:t>Otorgo el presente mandato para los únicos fines antes señalados y se entiende revocado por otro de fecha posterior o por término de la gestión encomendada.</w:t>
       </w:r>
@@ -3288,11 +3820,13 @@
       <w:pPr>
         <w:pStyle w:val="Normal"/>
         <w:jc w:val="both"/>
-        <w:rPr/>
+        <w:rPr>
+          <w:rFonts w:ascii="Liberation Serif" w:hAnsi="Liberation Serif"/>
+        </w:rPr>
       </w:pPr>
       <w:r>
         <w:rPr>
-          <w:rFonts w:ascii="Calibri" w:hAnsi="Calibri"/>
+          <w:rFonts w:ascii="Liberation Serif" w:hAnsi="Liberation Serif"/>
         </w:rPr>
         <w:br/>
         <w:t>Finalmente, declaro conocer que el trámite de pensión es gratuito, sin perjuicio de que puedo contratar voluntariamente una asesoría previsional para dicho trámite.</w:t>
@@ -3302,12 +3836,12 @@
       <w:pPr>
         <w:pStyle w:val="Normal"/>
         <w:rPr>
-          <w:rFonts w:ascii="Calibri" w:hAnsi="Calibri"/>
+          <w:rFonts w:ascii="Liberation Serif" w:hAnsi="Liberation Serif"/>
         </w:rPr>
       </w:pPr>
       <w:r>
         <w:rPr>
-          <w:rFonts w:ascii="Calibri" w:hAnsi="Calibri"/>
+          <w:rFonts w:ascii="Liberation Serif" w:hAnsi="Liberation Serif"/>
         </w:rPr>
         <w:br/>
       </w:r>
@@ -3316,45 +3850,51 @@
       <w:pPr>
         <w:pStyle w:val="Normal"/>
         <w:rPr>
-          <w:rFonts w:ascii="Calibri" w:hAnsi="Calibri"/>
+          <w:rFonts w:ascii="Liberation Serif" w:hAnsi="Liberation Serif"/>
         </w:rPr>
       </w:pPr>
       <w:r>
-        <w:rPr/>
+        <w:rPr>
+          <w:rFonts w:ascii="Liberation Serif" w:hAnsi="Liberation Serif"/>
+        </w:rPr>
       </w:r>
     </w:p>
     <w:p>
       <w:pPr>
         <w:pStyle w:val="Normal"/>
         <w:rPr>
-          <w:rFonts w:ascii="Calibri" w:hAnsi="Calibri"/>
+          <w:rFonts w:ascii="Liberation Serif" w:hAnsi="Liberation Serif"/>
         </w:rPr>
       </w:pPr>
       <w:r>
-        <w:rPr/>
+        <w:rPr>
+          <w:rFonts w:ascii="Liberation Serif" w:hAnsi="Liberation Serif"/>
+        </w:rPr>
       </w:r>
     </w:p>
     <w:p>
       <w:pPr>
         <w:pStyle w:val="Normal"/>
         <w:rPr>
-          <w:rFonts w:ascii="Calibri" w:hAnsi="Calibri"/>
+          <w:rFonts w:ascii="Liberation Serif" w:hAnsi="Liberation Serif"/>
         </w:rPr>
       </w:pPr>
       <w:r>
-        <w:rPr/>
+        <w:rPr>
+          <w:rFonts w:ascii="Liberation Serif" w:hAnsi="Liberation Serif"/>
+        </w:rPr>
       </w:r>
     </w:p>
     <w:p>
       <w:pPr>
         <w:pStyle w:val="Normal"/>
         <w:rPr>
-          <w:rFonts w:ascii="Calibri" w:hAnsi="Calibri"/>
+          <w:rFonts w:ascii="Liberation Serif" w:hAnsi="Liberation Serif"/>
         </w:rPr>
       </w:pPr>
       <w:r>
         <w:rPr>
-          <w:rFonts w:ascii="Calibri" w:hAnsi="Calibri"/>
+          <w:rFonts w:ascii="Liberation Serif" w:hAnsi="Liberation Serif"/>
         </w:rPr>
         <w:br/>
       </w:r>
@@ -3376,12 +3916,12 @@
       <w:pPr>
         <w:pStyle w:val="Normal"/>
         <w:rPr>
-          <w:rFonts w:ascii="Calibri" w:hAnsi="Calibri"/>
+          <w:rFonts w:ascii="Liberation Serif" w:hAnsi="Liberation Serif"/>
         </w:rPr>
       </w:pPr>
       <w:r>
         <w:rPr>
-          <w:rFonts w:ascii="Calibri" w:hAnsi="Calibri"/>
+          <w:rFonts w:ascii="Liberation Serif" w:hAnsi="Liberation Serif"/>
         </w:rPr>
         <w:t>______________________________</w:t>
       </w:r>
@@ -3390,12 +3930,12 @@
       <w:pPr>
         <w:pStyle w:val="Normal"/>
         <w:rPr>
-          <w:rFonts w:ascii="Calibri" w:hAnsi="Calibri"/>
+          <w:rFonts w:ascii="Liberation Serif" w:hAnsi="Liberation Serif"/>
         </w:rPr>
       </w:pPr>
       <w:r>
         <w:rPr>
-          <w:rFonts w:ascii="Calibri" w:hAnsi="Calibri"/>
+          <w:rFonts w:ascii="Liberation Serif" w:hAnsi="Liberation Serif"/>
         </w:rPr>
         <w:t>{{mandante_nombre_completo}}</w:t>
       </w:r>
@@ -3404,12 +3944,12 @@
       <w:pPr>
         <w:pStyle w:val="Normal"/>
         <w:rPr>
-          <w:rFonts w:ascii="Calibri" w:hAnsi="Calibri"/>
+          <w:rFonts w:ascii="Liberation Serif" w:hAnsi="Liberation Serif"/>
         </w:rPr>
       </w:pPr>
       <w:r>
         <w:rPr>
-          <w:rFonts w:ascii="Calibri" w:hAnsi="Calibri"/>
+          <w:rFonts w:ascii="Liberation Serif" w:hAnsi="Liberation Serif"/>
         </w:rPr>
         <w:t>RUT: {{mandante_rut}}</w:t>
       </w:r>
@@ -3418,12 +3958,12 @@
       <w:pPr>
         <w:pStyle w:val="Normal"/>
         <w:rPr>
-          <w:rFonts w:ascii="Calibri" w:hAnsi="Calibri"/>
+          <w:rFonts w:ascii="Liberation Serif" w:hAnsi="Liberation Serif"/>
         </w:rPr>
       </w:pPr>
       <w:r>
         <w:rPr>
-          <w:rFonts w:ascii="Calibri" w:hAnsi="Calibri"/>
+          <w:rFonts w:ascii="Liberation Serif" w:hAnsi="Liberation Serif"/>
         </w:rPr>
         <w:t>______________________________</w:t>
       </w:r>
@@ -3432,12 +3972,12 @@
       <w:pPr>
         <w:pStyle w:val="Normal"/>
         <w:rPr>
-          <w:rFonts w:ascii="Calibri" w:hAnsi="Calibri"/>
+          <w:rFonts w:ascii="Liberation Serif" w:hAnsi="Liberation Serif"/>
         </w:rPr>
       </w:pPr>
       <w:r>
         <w:rPr>
-          <w:rFonts w:ascii="Calibri" w:hAnsi="Calibri"/>
+          <w:rFonts w:ascii="Liberation Serif" w:hAnsi="Liberation Serif"/>
         </w:rPr>
         <w:t>{{mandatario_nombre}}</w:t>
       </w:r>
@@ -3447,12 +3987,12 @@
         <w:pStyle w:val="Normal"/>
         <w:spacing w:before="0" w:after="200"/>
         <w:rPr>
-          <w:rFonts w:ascii="Calibri" w:hAnsi="Calibri"/>
+          <w:rFonts w:ascii="Liberation Serif" w:hAnsi="Liberation Serif"/>
         </w:rPr>
       </w:pPr>
       <w:r>
         <w:rPr>
-          <w:rFonts w:ascii="Calibri" w:hAnsi="Calibri"/>
+          <w:rFonts w:ascii="Liberation Serif" w:hAnsi="Liberation Serif"/>
         </w:rPr>
         <w:t>RUT: {{mandatario_rut}}</w:t>
       </w:r>

</xml_diff>